<commit_message>
Calibrate the simulation to published GeoMatch gains and drop the lottery-crossing claim.
The size gradient and within-household findings survive; large households no longer fall below the legal default once idiosyncratic match quality is restored.

Co-authored-by: Cursor <cursoragent@cursor.com>
</commit_message>
<xml_diff>
--- a/paper/Weide_FairnessAndAlgorithms_2026.docx
+++ b/paper/Weide_FairnessAndAlgorithms_2026.docx
@@ -2,7 +2,7 @@
 <file path=word/document.xml><?xml version="1.0" encoding="utf-8"?>
 <w:document xmlns:w="http://schemas.openxmlformats.org/wordprocessingml/2006/main" xmlns:m="http://schemas.openxmlformats.org/officeDocument/2006/math" xmlns:r="http://schemas.openxmlformats.org/officeDocument/2006/relationships" xmlns:o="urn:schemas-microsoft-com:office:office" xmlns:v="urn:schemas-microsoft-com:vml" xmlns:w10="urn:schemas-microsoft-com:office:word" xmlns:a="http://schemas.openxmlformats.org/drawingml/2006/main" xmlns:pic="http://schemas.openxmlformats.org/drawingml/2006/picture" xmlns:wp="http://schemas.openxmlformats.org/drawingml/2006/wordprocessingDrawing">
   <w:body>
-    <w:bookmarkStart w:id="20" w:name="X4a697ab4bb662e0280030a591d44dc933e99b38"/>
+    <w:bookmarkStart w:id="21" w:name="X4a697ab4bb662e0280030a591d44dc933e99b38"/>
     <w:p>
       <w:pPr>
         <w:pStyle w:val="Heading1"/>
@@ -69,15 +69,15 @@
         <w:pStyle w:val="FirstParagraph"/>
       </w:pPr>
       <w:r>
-        <w:t xml:space="preserve">Debates about algorithmic fairness are usually organised around a trade-off: more accuracy or more equity, but not both, and the interesting question is where along the frontier to sit. Corbett-Davies et al. (2017) give the canonical formulation — fairness constraints are constraints, and constraints cost something — and critics of algorithmic refugee assignment have adopted the same grammar, reading the efficiency of these tools as something purchased at the price of equity (Alajak et al. 2026).</w:t>
-      </w:r>
-    </w:p>
-    <w:p>
-      <w:pPr>
-        <w:pStyle w:val="BodyText"/>
-      </w:pPr>
-      <w:r>
-        <w:t xml:space="preserve">This paper argues that the grammar is wrong for this case, and that getting it wrong has concealed something more troubling than a hard trade-off. GeoMatch, developed by the Immigration Policy Lab at Stanford and ETH Zurich and piloted by the Swiss State Secretariat for Migration (SEM) since 2020, does not maximise employment. It maximises a household-level threshold: the probability that</w:t>
+        <w:t xml:space="preserve">Debates about algorithmic fairness are usually organised around a trade-off: more accuracy or more equity, but not both, and the question is where along the frontier to sit. Corbett-Davies et al. (2017) give the canonical formulation, and critics of algorithmic refugee assignment have adopted the same grammar, reading these tools’ efficiency as something purchased at the price of equity (Alajak et al. 2026).</w:t>
+      </w:r>
+    </w:p>
+    <w:p>
+      <w:pPr>
+        <w:pStyle w:val="BodyText"/>
+      </w:pPr>
+      <w:r>
+        <w:t xml:space="preserve">The grammar is wrong for this case, and getting it wrong has concealed something more troubling than a hard trade-off. GeoMatch, developed by the Immigration Policy Lab at Stanford and ETH Zurich and piloted by the Swiss State Secretariat for Migration (SEM) since 2020, does not maximise employment. It maximises a household-level threshold: the probability that</w:t>
       </w:r>
       <w:r>
         <w:t xml:space="preserve"> </w:t>
@@ -93,29 +93,23 @@
         <w:t xml:space="preserve"> </w:t>
       </w:r>
       <w:r>
-        <w:t xml:space="preserve">member of a refugee family finds work. Two consequences follow from the shape of that formula rather than from the data it is fed. It prefers assignments that concentrate employment prospects in one household member over assignments that spread them evenly, regardless of which is better for the household; and it directs the benefits of optimisation away from large households, whose scores grow insensitive to location as they add members. The rule therefore sacrifices both the aggregate quantity it is praised for maximising and the distribution its critics accuse it of ignoring.</w:t>
-      </w:r>
-    </w:p>
-    <w:p>
-      <w:pPr>
-        <w:pStyle w:val="BodyText"/>
-      </w:pPr>
-      <w:r>
-        <w:t xml:space="preserve">The claim is not speculative. Bansak et al.’s own supplementary materials report that replacing the at-least-one metric with the within-case mean raises the employment gain over the status quo from 41% to 47% in the U.S. backtest: the distribution-neutral alternative is more efficient. There is no frontier here to sit on, and the designers do not claim there is — they justify their choice by appeal to</w:t>
-      </w:r>
-      <w:r>
-        <w:t xml:space="preserve"> </w:t>
-      </w:r>
-      <w:r>
-        <w:t xml:space="preserve">“the underlying goal of the refugee resettlement program to generate self-sufficient refugee families.”</w:t>
-      </w:r>
-    </w:p>
-    <w:p>
-      <w:pPr>
-        <w:pStyle w:val="BodyText"/>
-      </w:pPr>
-      <w:r>
-        <w:t xml:space="preserve">Once this is visible, the question in my title has an answer. The beneficiary of the deployed rule is not the refugee whose employment probability the tool nominally maximises, but the fiscal position of the host state, for which one earner per household suffices — a legitimate policy goal, but not the one the tool is publicly defended in terms of, and one that has never been argued for.</w:t>
+        <w:t xml:space="preserve">member of a refugee family finds work. Two consequences follow from the shape of that formula rather than from the data it is fed. It prefers concentrating employment prospects in one household member to spreading them evenly, regardless of which is better for the household; and it directs the benefits of optimisation away from large households, whose scores grow insensitive to location as they add members. The rule sacrifices both the aggregate quantity it is praised for maximising and the distribution its critics accuse it of ignoring.</w:t>
+      </w:r>
+    </w:p>
+    <w:p>
+      <w:pPr>
+        <w:pStyle w:val="BodyText"/>
+      </w:pPr>
+      <w:r>
+        <w:t xml:space="preserve">The claim is not speculative. Bansak et al.’s own supplementary materials (fig. S8) report that replacing the at-least-one metric with the within-case mean raises the employment gain over the status quo from 41% to 47% in the U.S. backtest: the distribution-neutral alternative is more efficient. There is no frontier to sit on, and the designers do not claim there is; they justify the choice, as Section 2 shows, by the programme’s goal of generating self-sufficient refugee families. That answers the question in my title, if only by inference from their justification: the beneficiary is not the refugee whose employment probability the tool nominally maximises but the fiscal position of the host state, for which one earner suffices — a legitimate goal, but not the one the tool’s public case is built on, which is the employment gains it delivers to refugees.</w:t>
+      </w:r>
+    </w:p>
+    <w:p>
+      <w:pPr>
+        <w:pStyle w:val="BodyText"/>
+      </w:pPr>
+      <w:r>
+        <w:t xml:space="preserve">Two things this paper does not claim. It is not that the tool harms the people it assigns: at the specification calibrated to its own published gain, every group I can construct does better under GeoMatch than under the legal default, and Section 5 says so. And it is not that the mean is the right objective; it is that four candidates were available, their consequences differ by more than the amount at stake in most of the fairness literature’s usual trade-offs, and the choice among them was never argued. Section 4 calibrates the simulation to the pair of numbers just quoted — 41% under the deployed rule, 47% under its mean variant — so that the magnitudes reported there belong to the problem GeoMatch actually solves rather than to a convenient one.</w:t>
       </w:r>
     </w:p>
     <w:bookmarkEnd w:id="10"/>
@@ -133,7 +127,7 @@
         <w:pStyle w:val="FirstParagraph"/>
       </w:pPr>
       <w:r>
-        <w:t xml:space="preserve">GeoMatch has three stages (Bansak et al. 2018). In the</w:t>
+        <w:t xml:space="preserve">GeoMatch has three stages (Bansak et al. 2018). The</w:t>
       </w:r>
       <w:r>
         <w:t xml:space="preserve"> </w:t>
@@ -149,7 +143,7 @@
         <w:t xml:space="preserve"> </w:t>
       </w:r>
       <w:r>
-        <w:t xml:space="preserve">stage, gradient-boosted trees are fitted separately per location on historical registry data, yielding for each individual and location a predicted probability of the target outcome; in Switzerland the target is employment two, three and four years after arrival, estimated on the ZEMIS database. In the</w:t>
+        <w:t xml:space="preserve">stage fits gradient-boosted trees separately per location, predicting for each individual and location the probability of the target outcome — in Switzerland, employment two to four years after arrival in the ZEMIS registry. The</w:t>
       </w:r>
       <w:r>
         <w:t xml:space="preserve"> </w:t>
@@ -165,7 +159,7 @@
         <w:t xml:space="preserve"> </w:t>
       </w:r>
       <w:r>
-        <w:t xml:space="preserve">stage, individual predictions are aggregated to the level at which assignment actually occurs — the case, typically a family — via a mapping function</w:t>
+        <w:t xml:space="preserve">stage aggregates those predictions to the level at which assignment actually occurs, the case or family, via a function</w:t>
       </w:r>
       <w:r>
         <w:t xml:space="preserve"> </w:t>
@@ -176,7 +170,7 @@
         </m:r>
       </m:oMath>
       <w:r>
-        <w:t xml:space="preserve">. In the</w:t>
+        <w:t xml:space="preserve">; the</w:t>
       </w:r>
       <w:r>
         <w:t xml:space="preserve"> </w:t>
@@ -192,15 +186,15 @@
         <w:t xml:space="preserve"> </w:t>
       </w:r>
       <w:r>
-        <w:t xml:space="preserve">stage, cases are assigned to locations so as to maximise the average case-level score subject to capacity constraints.</w:t>
-      </w:r>
-    </w:p>
-    <w:p>
-      <w:pPr>
-        <w:pStyle w:val="BodyText"/>
-      </w:pPr>
-      <w:r>
-        <w:t xml:space="preserve">Almost all critical attention has gone to the first stage. Alajak et al. (2026) focus on the predictors, noting that nationality, gender, age, marital status and religion enter the Swiss feature vector directly, and that a model built on historically stratified labour-market outcomes will reproduce that stratification. Strasser Ceballos and Kern (2025) show how sensitive the pipeline is to the target variable: optimising German data for social rather than economic integration sends 88% of refugees elsewhere. Both critiques are well-founded, and both concern what goes</w:t>
+        <w:t xml:space="preserve">stage then maximises the average case-level score subject to capacity constraints.</w:t>
+      </w:r>
+    </w:p>
+    <w:p>
+      <w:pPr>
+        <w:pStyle w:val="BodyText"/>
+      </w:pPr>
+      <w:r>
+        <w:t xml:space="preserve">Critical attention has gone to the first stage, and formal fairness work to the last (Strasser Ceballos and Kern 2025). Alajak et al. (2026) focus on the predictors: nationality, gender, age, marital status and religion enter the Swiss feature vector directly, and a model built on historically stratified outcomes will reproduce that stratification. Strasser Ceballos and Kern (2025) show how sensitive the pipeline is to the target variable — optimising German data for social rather than economic integration sends 88% of refugees elsewhere. Both critiques concern what goes</w:t>
       </w:r>
       <w:r>
         <w:t xml:space="preserve"> </w:t>
@@ -224,7 +218,15 @@
         <w:pStyle w:val="BodyText"/>
       </w:pPr>
       <w:r>
-        <w:t xml:space="preserve">The mapping stage has been almost entirely overlooked, and it is where the decisive normative commitment is made. The modeling stage produces individual-level objects; the matching stage consumes case-level ones.</w:t>
+        <w:t xml:space="preserve">That values enter through the formulation of the objective rather than through the estimator is the general lesson of the problem-formulation literature (Passi and Barocas 2019), and Obermeyer et al. (2019) is its canonical demonstration: a health-risk model that tracked costs instead of illness produced a large racial disparity from a label chosen upstream of any modelling decision. The argument below is that literature applied to a case in which the object quietly substituted is not the label but the unit whose welfare is counted — and to a tool for which the substitution has been visible in a public archive for eight years.</w:t>
+      </w:r>
+    </w:p>
+    <w:p>
+      <w:pPr>
+        <w:pStyle w:val="BodyText"/>
+      </w:pPr>
+      <w:r>
+        <w:t xml:space="preserve">The middle stage is where the decisive normative commitment is made, and it is the one stage nobody argues about: the modeling stage produces individual-level objects, the matching stage consumes case-level ones, and</w:t>
       </w:r>
       <w:r>
         <w:t xml:space="preserve"> </w:t>
@@ -238,7 +240,23 @@
         <w:t xml:space="preserve"> </w:t>
       </w:r>
       <w:r>
-        <w:t xml:space="preserve">is the bridge, and its selection determines whose welfare the optimisation tracks. The authors’ replication archive (Bansak et al. 2018, Harvard Dataverse doi:10.7910/DVN/MS8XES, file</w:t>
+        <w:t xml:space="preserve">is the bridge whose selection determines whose welfare the optimisation tracks. It is not hidden: Strasser Ceballos and Kern (2025, Appendix C) tabulate it for both deployed tools of this family, and the comparison is instructive, because the other chose differently. Annie MOORE, running at a U.S. resettlement agency since 2018, aggregates by the</w:t>
+      </w:r>
+      <w:r>
+        <w:t xml:space="preserve"> </w:t>
+      </w:r>
+      <w:r>
+        <w:rPr>
+          <w:i/>
+          <w:iCs/>
+        </w:rPr>
+        <w:t xml:space="preserve">sum</w:t>
+      </w:r>
+      <w:r>
+        <w:t xml:space="preserve"> </w:t>
+      </w:r>
+      <w:r>
+        <w:t xml:space="preserve">of individual probabilities and so maximises the expected number of employed refugees (Ahani et al. 2021). Two systems on the same three stages optimise different things, and neither paper remarks on it. GeoMatch’s choice is explicit in a four-line function in the authors’ replication archive (Bansak et al. 2018, Harvard Dataverse doi:10.7910/DVN/MS8XES,</w:t>
       </w:r>
       <w:r>
         <w:t xml:space="preserve"> </w:t>
@@ -250,19 +268,7 @@
         <w:t xml:space="preserve">func_M_to_Mstar.R</w:t>
       </w:r>
       <w:r>
-        <w:t xml:space="preserve">) makes the choice explicit in a four-line function named</w:t>
-      </w:r>
-      <w:r>
-        <w:t xml:space="preserve"> </w:t>
-      </w:r>
-      <w:r>
-        <w:rPr>
-          <w:rStyle w:val="VerbatimChar"/>
-        </w:rPr>
-        <w:t xml:space="preserve">compute_femp_prob</w:t>
-      </w:r>
-      <w:r>
-        <w:t xml:space="preserve">:</w:t>
+        <w:t xml:space="preserve">):</w:t>
       </w:r>
     </w:p>
     <w:p>
@@ -477,7 +483,7 @@
         </m:r>
       </m:oMath>
       <w:r>
-        <w:t xml:space="preserve">, the probability that at least one member of the case is employed under within-case independence. It is the default reported for both the United States and Switzerland backtests, not an option tried once for the paper. The authors tested the mean, maximum and minimum as alternatives and give their reason for the default: it</w:t>
+        <w:t xml:space="preserve">, the probability that at least one member is employed under within-case independence. It is the default for both the U.S. and Swiss backtests, not an option tried once: the authors tested the mean, maximum and minimum, and chose this one because it</w:t>
       </w:r>
       <w:r>
         <w:t xml:space="preserve"> </w:t>
@@ -491,7 +497,7 @@
         <w:pStyle w:val="BodyText"/>
       </w:pPr>
       <w:r>
-        <w:t xml:space="preserve">That is a candid statement that the objective encodes a policy goal rather than a welfare measure: household self-sufficiency is satisfied once a family stops drawing social assistance, and not satisfied any further by a second earner. The choice is not even stable across the designers’ own subsequent work: Acharya et al. (2022), extending GeoMatch to incorporate refugees’ preferences and co-authored by two of the original team, use the mean instead without remarking on the switch. That inconsistency is not evidence that the choice is immaterial — Sections 3 and 4 show it is anything but. It is evidence that</w:t>
+        <w:t xml:space="preserve">That is a candid statement that the objective encodes a policy goal rather than a welfare measure: household self-sufficiency is satisfied once a family stops drawing social assistance, and not further by a second earner. Nor is the choice stable across the designers’ own later work — Acharya et al. (2022), extending GeoMatch to refugees’ preferences and co-authored by two of the original team, use the mean without remarking on the switch. Not because the choice is immaterial, as Sections 3 and 4 show, but because</w:t>
       </w:r>
       <w:r>
         <w:t xml:space="preserve"> </w:t>
@@ -513,7 +519,7 @@
         <w:pStyle w:val="BodyText"/>
       </w:pPr>
       <w:r>
-        <w:t xml:space="preserve">One limitation should be stated plainly: whether the SEM’s live pipeline still uses this exact function is not published, and neither are its evaluation results (Strasser Ceballos and Kern 2025). What is secure is that this function produced the founding study’s results and was justified by the programme’s stated goals rather than offered as incidental convenience. If a different</w:t>
+        <w:t xml:space="preserve">One limitation should be stated plainly: whether the SEM’s live pipeline still uses this function is not published, and neither are the pilot’s results (Strasser Ceballos and Kern 2025). What is secure is that it produced the founding study’s results and was justified by the programme’s goals; if a different</w:t>
       </w:r>
       <w:r>
         <w:t xml:space="preserve"> </w:t>
@@ -527,7 +533,7 @@
         <w:t xml:space="preserve"> </w:t>
       </w:r>
       <w:r>
-        <w:t xml:space="preserve">is used today, that change and its rationale are equally undocumented — an instance of the problem described here, not an exception to it.</w:t>
+        <w:t xml:space="preserve">is used today, that change is equally undocumented — an instance of the problem described here, not an exception.</w:t>
       </w:r>
     </w:p>
     <w:bookmarkEnd w:id="11"/>
@@ -545,7 +551,342 @@
         <w:pStyle w:val="FirstParagraph"/>
       </w:pPr>
       <w:r>
-        <w:t xml:space="preserve">Given two locations offering a household the same</w:t>
+        <w:t xml:space="preserve">Two properties of</w:t>
+      </w:r>
+      <w:r>
+        <w:t xml:space="preserve"> </w:t>
+      </w:r>
+      <m:oMath>
+        <m:r>
+          <m:t>φ</m:t>
+        </m:r>
+        <m:r>
+          <m:rPr>
+            <m:sty m:val="p"/>
+          </m:rPr>
+          <m:t>(</m:t>
+        </m:r>
+        <m:r>
+          <m:t>p</m:t>
+        </m:r>
+        <m:r>
+          <m:rPr>
+            <m:sty m:val="p"/>
+          </m:rPr>
+          <m:t>)</m:t>
+        </m:r>
+        <m:r>
+          <m:rPr>
+            <m:sty m:val="p"/>
+          </m:rPr>
+          <m:t>=</m:t>
+        </m:r>
+        <m:r>
+          <m:t>1</m:t>
+        </m:r>
+        <m:r>
+          <m:rPr>
+            <m:sty m:val="p"/>
+          </m:rPr>
+          <m:t>−</m:t>
+        </m:r>
+        <m:nary>
+          <m:naryPr>
+            <m:chr m:val="∏"/>
+            <m:limLoc m:val="undOvr"/>
+            <m:subHide m:val="off"/>
+            <m:supHide m:val="on"/>
+          </m:naryPr>
+          <m:sub>
+            <m:r>
+              <m:t>i</m:t>
+            </m:r>
+          </m:sub>
+          <m:sup>
+            <m:r>
+              <m:t>​</m:t>
+            </m:r>
+          </m:sup>
+          <m:e>
+            <m:r>
+              <m:rPr>
+                <m:sty m:val="p"/>
+              </m:rPr>
+              <m:t>(</m:t>
+            </m:r>
+          </m:e>
+        </m:nary>
+        <m:r>
+          <m:t>1</m:t>
+        </m:r>
+        <m:r>
+          <m:rPr>
+            <m:sty m:val="p"/>
+          </m:rPr>
+          <m:t>−</m:t>
+        </m:r>
+        <m:sSub>
+          <m:e>
+            <m:r>
+              <m:t>p</m:t>
+            </m:r>
+          </m:e>
+          <m:sub>
+            <m:r>
+              <m:t>i</m:t>
+            </m:r>
+          </m:sub>
+        </m:sSub>
+        <m:r>
+          <m:rPr>
+            <m:sty m:val="p"/>
+          </m:rPr>
+          <m:t>)</m:t>
+        </m:r>
+      </m:oMath>
+      <w:r>
+        <w:t xml:space="preserve"> </w:t>
+      </w:r>
+      <w:r>
+        <w:t xml:space="preserve">do the work below, each following in a line. First,</w:t>
+      </w:r>
+      <w:r>
+        <w:t xml:space="preserve"> </w:t>
+      </w:r>
+      <m:oMath>
+        <m:r>
+          <m:rPr>
+            <m:sty m:val="p"/>
+          </m:rPr>
+          <m:t>log</m:t>
+        </m:r>
+        <m:r>
+          <m:rPr>
+            <m:sty m:val="p"/>
+          </m:rPr>
+          <m:t>(</m:t>
+        </m:r>
+        <m:r>
+          <m:t>1</m:t>
+        </m:r>
+        <m:r>
+          <m:rPr>
+            <m:sty m:val="p"/>
+          </m:rPr>
+          <m:t>−</m:t>
+        </m:r>
+        <m:r>
+          <m:t>p</m:t>
+        </m:r>
+        <m:r>
+          <m:rPr>
+            <m:sty m:val="p"/>
+          </m:rPr>
+          <m:t>)</m:t>
+        </m:r>
+      </m:oMath>
+      <w:r>
+        <w:t xml:space="preserve"> </w:t>
+      </w:r>
+      <w:r>
+        <w:t xml:space="preserve">is concave, so</w:t>
+      </w:r>
+      <w:r>
+        <w:t xml:space="preserve"> </w:t>
+      </w:r>
+      <m:oMath>
+        <m:nary>
+          <m:naryPr>
+            <m:chr m:val="∑"/>
+            <m:limLoc m:val="undOvr"/>
+            <m:subHide m:val="off"/>
+            <m:supHide m:val="on"/>
+          </m:naryPr>
+          <m:sub>
+            <m:r>
+              <m:t>i</m:t>
+            </m:r>
+          </m:sub>
+          <m:sup>
+            <m:r>
+              <m:t>​</m:t>
+            </m:r>
+          </m:sup>
+          <m:e>
+            <m:r>
+              <m:rPr>
+                <m:sty m:val="p"/>
+              </m:rPr>
+              <m:t>log</m:t>
+            </m:r>
+          </m:e>
+        </m:nary>
+        <m:r>
+          <m:rPr>
+            <m:sty m:val="p"/>
+          </m:rPr>
+          <m:t>(</m:t>
+        </m:r>
+        <m:r>
+          <m:t>1</m:t>
+        </m:r>
+        <m:r>
+          <m:rPr>
+            <m:sty m:val="p"/>
+          </m:rPr>
+          <m:t>−</m:t>
+        </m:r>
+        <m:sSub>
+          <m:e>
+            <m:r>
+              <m:t>p</m:t>
+            </m:r>
+          </m:e>
+          <m:sub>
+            <m:r>
+              <m:t>i</m:t>
+            </m:r>
+          </m:sub>
+        </m:sSub>
+        <m:r>
+          <m:rPr>
+            <m:sty m:val="p"/>
+          </m:rPr>
+          <m:t>)</m:t>
+        </m:r>
+      </m:oMath>
+      <w:r>
+        <w:t xml:space="preserve"> </w:t>
+      </w:r>
+      <w:r>
+        <w:t xml:space="preserve">is largest when the</w:t>
+      </w:r>
+      <w:r>
+        <w:t xml:space="preserve"> </w:t>
+      </w:r>
+      <m:oMath>
+        <m:sSub>
+          <m:e>
+            <m:r>
+              <m:t>p</m:t>
+            </m:r>
+          </m:e>
+          <m:sub>
+            <m:r>
+              <m:t>i</m:t>
+            </m:r>
+          </m:sub>
+        </m:sSub>
+      </m:oMath>
+      <w:r>
+        <w:t xml:space="preserve"> </w:t>
+      </w:r>
+      <w:r>
+        <w:t xml:space="preserve">are equal; and since</w:t>
+      </w:r>
+      <w:r>
+        <w:t xml:space="preserve"> </w:t>
+      </w:r>
+      <m:oMath>
+        <m:r>
+          <m:t>φ</m:t>
+        </m:r>
+        <m:r>
+          <m:rPr>
+            <m:sty m:val="p"/>
+          </m:rPr>
+          <m:t>=</m:t>
+        </m:r>
+        <m:r>
+          <m:t>1</m:t>
+        </m:r>
+        <m:r>
+          <m:rPr>
+            <m:sty m:val="p"/>
+          </m:rPr>
+          <m:t>−</m:t>
+        </m:r>
+        <m:r>
+          <m:rPr>
+            <m:sty m:val="p"/>
+          </m:rPr>
+          <m:t>exp</m:t>
+        </m:r>
+        <m:d>
+          <m:dPr>
+            <m:begChr m:val="("/>
+            <m:sepChr m:val=""/>
+            <m:endChr m:val=")"/>
+            <m:grow/>
+          </m:dPr>
+          <m:e>
+            <m:nary>
+              <m:naryPr>
+                <m:chr m:val="∑"/>
+                <m:limLoc m:val="undOvr"/>
+                <m:subHide m:val="off"/>
+                <m:supHide m:val="on"/>
+              </m:naryPr>
+              <m:sub>
+                <m:r>
+                  <m:t>i</m:t>
+                </m:r>
+              </m:sub>
+              <m:sup>
+                <m:r>
+                  <m:t>​</m:t>
+                </m:r>
+              </m:sup>
+              <m:e>
+                <m:r>
+                  <m:rPr>
+                    <m:sty m:val="p"/>
+                  </m:rPr>
+                  <m:t>log</m:t>
+                </m:r>
+              </m:e>
+            </m:nary>
+            <m:r>
+              <m:rPr>
+                <m:sty m:val="p"/>
+              </m:rPr>
+              <m:t>(</m:t>
+            </m:r>
+            <m:r>
+              <m:t>1</m:t>
+            </m:r>
+            <m:r>
+              <m:rPr>
+                <m:sty m:val="p"/>
+              </m:rPr>
+              <m:t>−</m:t>
+            </m:r>
+            <m:sSub>
+              <m:e>
+                <m:r>
+                  <m:t>p</m:t>
+                </m:r>
+              </m:e>
+              <m:sub>
+                <m:r>
+                  <m:t>i</m:t>
+                </m:r>
+              </m:sub>
+            </m:sSub>
+            <m:r>
+              <m:rPr>
+                <m:sty m:val="p"/>
+              </m:rPr>
+              <m:t>)</m:t>
+            </m:r>
+          </m:e>
+        </m:d>
+      </m:oMath>
+      <w:r>
+        <w:t xml:space="preserve"> </w:t>
+      </w:r>
+      <w:r>
+        <w:t xml:space="preserve">is</w:t>
       </w:r>
       <w:r>
         <w:t xml:space="preserve"> </w:t>
@@ -555,13 +896,152 @@
           <w:i/>
           <w:iCs/>
         </w:rPr>
+        <w:t xml:space="preserve">decreasing</w:t>
+      </w:r>
+      <w:r>
+        <w:t xml:space="preserve"> </w:t>
+      </w:r>
+      <w:r>
+        <w:t xml:space="preserve">in that sum, among locations offering the same</w:t>
+      </w:r>
+      <w:r>
+        <w:t xml:space="preserve"> </w:t>
+      </w:r>
+      <w:r>
+        <w:rPr>
+          <w:i/>
+          <w:iCs/>
+        </w:rPr>
         <w:t xml:space="preserve">average</w:t>
       </w:r>
       <w:r>
         <w:t xml:space="preserve"> </w:t>
       </w:r>
       <w:r>
-        <w:t xml:space="preserve">employment prospect — one spreading it evenly across members, the other concentrating it in a single member — Bansak et al.’s formula, one minus the chance that everybody fails, always ranks the second higher. Once one member already has a good chance of work, that alone nearly guarantees the case a positive outcome, so improving anyone else’s prospects adds almost nothing to the score. This holds for households of any size and any probabilities, and it means an assignment maximising the score can be dominated in expected employment by one that does not:</w:t>
+        <w:t xml:space="preserve">prospect</w:t>
+      </w:r>
+      <w:r>
+        <w:t xml:space="preserve"> </w:t>
+      </w:r>
+      <m:oMath>
+        <m:r>
+          <m:t>φ</m:t>
+        </m:r>
+      </m:oMath>
+      <w:r>
+        <w:t xml:space="preserve"> </w:t>
+      </w:r>
+      <w:r>
+        <w:t xml:space="preserve">ranks the one that spreads it evenly lowest and the most concentrated one highest. Second,</w:t>
+      </w:r>
+      <w:r>
+        <w:t xml:space="preserve"> </w:t>
+      </w:r>
+      <m:oMath>
+        <m:r>
+          <m:rPr>
+            <m:sty m:val="p"/>
+          </m:rPr>
+          <m:t>∂</m:t>
+        </m:r>
+        <m:r>
+          <m:t>φ</m:t>
+        </m:r>
+        <m:r>
+          <m:rPr>
+            <m:sty m:val="p"/>
+          </m:rPr>
+          <m:t>/</m:t>
+        </m:r>
+        <m:r>
+          <m:rPr>
+            <m:sty m:val="p"/>
+          </m:rPr>
+          <m:t>∂</m:t>
+        </m:r>
+        <m:sSub>
+          <m:e>
+            <m:r>
+              <m:t>p</m:t>
+            </m:r>
+          </m:e>
+          <m:sub>
+            <m:r>
+              <m:t>i</m:t>
+            </m:r>
+          </m:sub>
+        </m:sSub>
+        <m:r>
+          <m:rPr>
+            <m:sty m:val="p"/>
+          </m:rPr>
+          <m:t>=</m:t>
+        </m:r>
+        <m:nary>
+          <m:naryPr>
+            <m:chr m:val="∏"/>
+            <m:limLoc m:val="undOvr"/>
+            <m:subHide m:val="off"/>
+            <m:supHide m:val="on"/>
+          </m:naryPr>
+          <m:sub>
+            <m:r>
+              <m:t>j</m:t>
+            </m:r>
+            <m:r>
+              <m:rPr>
+                <m:sty m:val="p"/>
+              </m:rPr>
+              <m:t>≠</m:t>
+            </m:r>
+            <m:r>
+              <m:t>i</m:t>
+            </m:r>
+          </m:sub>
+          <m:sup>
+            <m:r>
+              <m:t>​</m:t>
+            </m:r>
+          </m:sup>
+          <m:e>
+            <m:r>
+              <m:rPr>
+                <m:sty m:val="p"/>
+              </m:rPr>
+              <m:t>(</m:t>
+            </m:r>
+          </m:e>
+        </m:nary>
+        <m:r>
+          <m:t>1</m:t>
+        </m:r>
+        <m:r>
+          <m:rPr>
+            <m:sty m:val="p"/>
+          </m:rPr>
+          <m:t>−</m:t>
+        </m:r>
+        <m:sSub>
+          <m:e>
+            <m:r>
+              <m:t>p</m:t>
+            </m:r>
+          </m:e>
+          <m:sub>
+            <m:r>
+              <m:t>j</m:t>
+            </m:r>
+          </m:sub>
+        </m:sSub>
+        <m:r>
+          <m:rPr>
+            <m:sty m:val="p"/>
+          </m:rPr>
+          <m:t>)</m:t>
+        </m:r>
+      </m:oMath>
+      <w:r>
+        <w:t xml:space="preserve">: the weight the objective places on any member falls as the other members’ prospects rise. The rule therefore attends least to whoever is least likely to find work, for any size and any probabilities, and an assignment maximising it can be dominated in expected employment by one that does not:</w:t>
       </w:r>
     </w:p>
     <w:tbl>
@@ -793,85 +1273,43 @@
         <w:pStyle w:val="BodyText"/>
       </w:pPr>
       <w:r>
-        <w:t xml:space="preserve">GeoMatch sends this household to A — the canton that is worse both in expected employment and in equality — not through error, but through faithful maximisation of its stated objective.</w:t>
-      </w:r>
-    </w:p>
-    <w:p>
-      <w:pPr>
-        <w:pStyle w:val="BodyText"/>
-      </w:pPr>
-      <w:r>
-        <w:t xml:space="preserve">Who bears this? In Swiss refugee households the secondary earner is overwhelmingly a woman: seven years after arrival, 64% of men but only 32% of women aged 16–55 at entry are in employment (Staatssekretariat für Migration 2026). That gap is the raw material the formula exploits, since the larger the within-household spread a location can generate, the higher its score. Alajak et al. (2026) allege</w:t>
-      </w:r>
-      <w:r>
-        <w:t xml:space="preserve"> </w:t>
-      </w:r>
-      <w:r>
-        <w:t xml:space="preserve">“disproportionate discriminatory outcomes on the basis of ethnicity, gender, age, and marital status,”</w:t>
-      </w:r>
-      <w:r>
-        <w:t xml:space="preserve"> </w:t>
-      </w:r>
-      <w:r>
-        <w:t xml:space="preserve">but their document-based method cannot identify a mechanism. The argument above supplies one, located not in the training data but in a design choice downstream of it, and it reaches every group the allegation names: whoever is least likely to find work is whom the objective has least reason to consider, so a group that starts behind is served worse the further behind it starts.</w:t>
-      </w:r>
-    </w:p>
-    <w:p>
-      <w:pPr>
-        <w:pStyle w:val="BodyText"/>
-      </w:pPr>
-      <w:r>
-        <w:t xml:space="preserve">A second consequence of the same formula concerns household size. As a household grows, its score becomes less sensitive to any one member’s location-specific prospects, because the</w:t>
-      </w:r>
-      <w:r>
-        <w:t xml:space="preserve"> </w:t>
-      </w:r>
-      <w:r>
-        <w:t xml:space="preserve">“at least one”</w:t>
-      </w:r>
-      <w:r>
-        <w:t xml:space="preserve"> </w:t>
-      </w:r>
-      <w:r>
-        <w:t xml:space="preserve">condition is nearly satisfied by the others alone. A single-adult household’s score ranges over the full spread of employment probabilities across the twenty-six cantons; a four-adult household with middling probabilities scores above 0.93 almost everywhere, so almost nothing is at stake in where it is sent. This matters because the matching stage allocates scarce capacity by marginal gain: a slot in a well-matched canton goes to whichever case’s score rises most from receiving it, and households whose scores barely move are the natural candidates for displacement to a worse one. The objective therefore steers the benefits of optimisation toward small cases for a reason unrelated to need, integration prospects, or any defensible distributive principle. In the vocabulary of Black et al. (2022), this is a failure of vertical equity.</w:t>
-      </w:r>
-    </w:p>
-    <w:p>
-      <w:pPr>
-        <w:pStyle w:val="BodyText"/>
-      </w:pPr>
-      <w:r>
-        <w:t xml:space="preserve">The two distortions sit at different levels, and the distinction matters for what to call them. The gender effect is a</w:t>
-      </w:r>
-      <w:r>
-        <w:t xml:space="preserve"> </w:t>
-      </w:r>
-      <w:r>
-        <w:rPr>
-          <w:i/>
-          <w:iCs/>
-        </w:rPr>
-        <w:t xml:space="preserve">within</w:t>
-      </w:r>
-      <w:r>
-        <w:t xml:space="preserve">-household harm: the metric is satisfied by sacrificing one member’s prospects for another’s, and the member sacrificed is, given the current employment gap, disproportionately a woman — a facially neutral rule with a foreseeable adverse effect on a protected characteristic, the ordinary structure of indirect discrimination. The household-size effect is a</w:t>
-      </w:r>
-      <w:r>
-        <w:t xml:space="preserve"> </w:t>
-      </w:r>
-      <w:r>
-        <w:rPr>
-          <w:i/>
-          <w:iCs/>
-        </w:rPr>
-        <w:t xml:space="preserve">between</w:t>
-      </w:r>
-      <w:r>
-        <w:t xml:space="preserve">-household harm: nobody inside the case is sacrificed for anybody else, but the case as a whole is sent somewhere worse than an otherwise identical smaller household would be. That is why vertical equity, not discrimination, is the right frame for it: it needs no protected characteristic, only that likes be treated alike.</w:t>
+        <w:t xml:space="preserve">GeoMatch sends this household to A, worse both in expected employment and in equality, not through error but through faithful maximisation of its stated objective.</w:t>
+      </w:r>
+    </w:p>
+    <w:p>
+      <w:pPr>
+        <w:pStyle w:val="BodyText"/>
+      </w:pPr>
+      <w:r>
+        <w:t xml:space="preserve">The rule is, in this respect, a formal implementation of the unitary household model — the household treated as one agent with one welfare level, satisfied once its need is met — which development economics abandoned some time ago, and for this reason: aggregating to the household conceals who inside it gains, and the concealment is not distributionally neutral where bargaining power and labour-market access differ by gender (Sen 1990; Agarwal 1997). Targeting a benefit at the household rather than at the person is a recognised mechanism of gender inequality in that literature. The novelty here is not the mechanism but its site: it is running inside an optimiser, where the aggregation is not an approximation forced by data but a line of code with three documented alternatives.</w:t>
+      </w:r>
+    </w:p>
+    <w:p>
+      <w:pPr>
+        <w:pStyle w:val="BodyText"/>
+      </w:pPr>
+      <w:r>
+        <w:t xml:space="preserve">Who bears this? In Swiss refugee households the secondary earner is overwhelmingly a woman: seven years after arrival, 64% of men but only 32% of women aged 16–55 at entry are in employment (Staatssekretariat für Migration 2026). Two qualifications belong with that figure. It is a seven-year rate, whereas the Swiss target variable is employment two to four years after arrival, so it overstates the levels the tool works with but not the direction of the gap, which is present at every horizon the SEM reports. And it is a population average, not a household-level one; the claim below needs only that the woman is more often the lower-probability member, which this gap makes true on average rather than in every case. That gap is the raw material the formula exploits. Alajak et al. (2026) allege discriminatory outcomes by ethnicity, gender, age and marital status but cannot identify a mechanism; the argument above supplies one, located not in the training data but in a design choice downstream of it, and it reaches every group they name: whoever starts behind is served worse the further behind they start.</w:t>
+      </w:r>
+    </w:p>
+    <w:p>
+      <w:pPr>
+        <w:pStyle w:val="BodyText"/>
+      </w:pPr>
+      <w:r>
+        <w:t xml:space="preserve">The second property compounds across members, which produces a distinct effect on size. Each additional member multiplies the derivative by a factor below one, so a large household’s score barely moves with location: a four-adult household with middling probabilities scores above 0.93 in every canton, while a single adult’s score ranges over the full cantonal spread. The matching stage allocates capacity by marginal gain — a slot in a well-matched canton goes to whichever case’s score rises most from receiving it — so households whose scores barely move are the natural candidates for displacement. The objective thus steers the benefits of optimisation toward small cases for a reason unrelated to need or prospects: in the vocabulary of Black et al. (2022), a failure of vertical equity.</w:t>
+      </w:r>
+    </w:p>
+    <w:p>
+      <w:pPr>
+        <w:pStyle w:val="BodyText"/>
+      </w:pPr>
+      <w:r>
+        <w:t xml:space="preserve">The two harms need different names. Sacrificing one member’s prospects for another’s, where the member sacrificed is disproportionately a woman, has the structure of indirect discrimination: a facially neutral rule with a foreseeable adverse effect distributed along a protected characteristic. It does not follow that the legal test is met, and Section 4 will show that it is not on the comparison that matters: indirect discrimination requires a particular disadvantage relative to a comparator, and relative to the legal default women are not disadvantaged — they gain, only less than they would under a rule that counted them once. What survives is the structure without the violation, which is why the objection is pressed below as one about efficiency and the distribution of the gain rather than as a claim of unlawfulness. Displacing a household for its size is a different matter again, since nobody inside the case is sacrificed for anyone else, which is why vertical equity — needing no protected characteristic, only that likes be treated alike — is the right frame for it.</w:t>
       </w:r>
     </w:p>
     <w:bookmarkEnd w:id="12"/>
-    <w:bookmarkStart w:id="16" w:name="magnitude"/>
+    <w:bookmarkStart w:id="17" w:name="magnitude"/>
     <w:p>
       <w:pPr>
         <w:pStyle w:val="Heading2"/>
@@ -880,29 +1318,21 @@
         <w:t xml:space="preserve">4. Magnitude</w:t>
       </w:r>
     </w:p>
+    <w:bookmarkStart w:id="13" w:name="calibration"/>
+    <w:p>
+      <w:pPr>
+        <w:pStyle w:val="Heading3"/>
+      </w:pPr>
+      <w:r>
+        <w:t xml:space="preserve">4.1 Calibration</w:t>
+      </w:r>
+    </w:p>
     <w:p>
       <w:pPr>
         <w:pStyle w:val="FirstParagraph"/>
       </w:pPr>
       <w:r>
-        <w:t xml:space="preserve">To gauge how much this matters, I run the pipeline twice: once calibrated to the observed gender gap, to quantify the within-household mechanism; once extended to households of variable size, to quantify the between-household one.</w:t>
-      </w:r>
-    </w:p>
-    <w:bookmarkStart w:id="13" w:name="efficiency-and-the-gender-gap"/>
-    <w:p>
-      <w:pPr>
-        <w:pStyle w:val="Heading3"/>
-      </w:pPr>
-      <w:r>
-        <w:t xml:space="preserve">Efficiency and the Gender Gap</w:t>
-      </w:r>
-    </w:p>
-    <w:p>
-      <w:pPr>
-        <w:pStyle w:val="FirstParagraph"/>
-      </w:pPr>
-      <w:r>
-        <w:t xml:space="preserve">Individual probabilities are generated on the logit scale with a gender base rate calibrated to the SEM figures above (men 0.64, women 0.32), an individual random effect, a cantonal main effect, and a canton-by-gender interaction representing the synergies the tool exists to exploit. Capacities are the statutory population-proportional shares of all twenty-six cantons from Annex 3 of the Asylum Ordinance 1, and the matching stage replicates the published code: each canton is duplicated by its number of slots, cost is set to</w:t>
+        <w:t xml:space="preserve">Probabilities are generated on the logit scale from the SEM gender base rates (men 0.64, women 0.32) plus an individual effect, a cantonal effect, a canton-by-gender interaction, and a person-by-canton term. Capacities are the statutory population-proportional shares of all twenty-six cantons (Annex 3 AsylV 1), and the matching stage replicates the published code: each canton is duplicated by its slots and a one-to-one optimal assignment on cost</w:t>
       </w:r>
       <w:r>
         <w:t xml:space="preserve"> </w:t>
@@ -922,19 +1352,44 @@
         </m:r>
       </m:oMath>
       <w:r>
-        <w:t xml:space="preserve">, and a one-to-one optimal assignment is solved. I compare three mapping functions against the characteristics-blind key of Article 21 of that ordinance, averaging over 400 draws of the cantonal parameters with 1,000 households each. That key is not a historical baseline: the Swiss deployment is a randomised trial in which only some arrivals receive an algorithmic recommendation and the rest are still placed proportionally, so</w:t>
-      </w:r>
-      <w:r>
-        <w:t xml:space="preserve"> </w:t>
-      </w:r>
-      <w:r>
-        <w:t xml:space="preserve">“status quo”</w:t>
-      </w:r>
-      <w:r>
-        <w:t xml:space="preserve"> </w:t>
-      </w:r>
-      <w:r>
-        <w:t xml:space="preserve">below names the live control arm of the same programme.</w:t>
+        <w:t xml:space="preserve"> </w:t>
+      </w:r>
+      <w:r>
+        <w:t xml:space="preserve">is solved. The comparison is against the characteristics-blind key of Article 21, over draws of the cantonal parameters, so that no conclusion rests on one draw.</w:t>
+      </w:r>
+    </w:p>
+    <w:p>
+      <w:pPr>
+        <w:pStyle w:val="BodyText"/>
+      </w:pPr>
+      <w:r>
+        <w:t xml:space="preserve">The last term carries the analysis and so should not be chosen freely. It is the extent to which a canton that suits one person does not suit another, which is the entire resource an assignment algorithm has: with no such term, everyone of a given gender ranks the cantons identically, optimisation can only shuffle people between cantons they agree about, and the deployed rule gains 1.4% over the status quo where the best of the four candidates manages 2.3% — two orders of magnitude below what GeoMatch is documented to deliver. A simulation in that regime is not a model of the problem the tool solves, and the results it produces turn out to depend on the degeneracy (below, and Section 4.4).</w:t>
+      </w:r>
+    </w:p>
+    <w:p>
+      <w:pPr>
+        <w:pStyle w:val="BodyText"/>
+      </w:pPr>
+      <w:r>
+        <w:t xml:space="preserve">So the term is pinned to the published effect size rather than assumed. Setting its standard deviation to 1.0 on the logit scale, the deployed at-least-one rule gains 39.4% over the status quo and its mean variant 47.3% — against the 41% and 47% that Bansak et al. report for the U.S. backtest and its fig. S8 comparison. One parameter reproduces both, which is as much external validation as a public-data replication of this tool admits. The gender intercepts are re-solved for every specification so that the status-quo employment rates stay at the SEM base rates throughout; specifications therefore differ in synergy alone. Results are reported at this calibration, with the no-synergy limit and a doubled upper bracket carried alongside.</w:t>
+      </w:r>
+    </w:p>
+    <w:bookmarkEnd w:id="13"/>
+    <w:bookmarkStart w:id="14" w:name="efficiency-and-the-gender-gap"/>
+    <w:p>
+      <w:pPr>
+        <w:pStyle w:val="Heading3"/>
+      </w:pPr>
+      <w:r>
+        <w:t xml:space="preserve">4.2 Efficiency and the Gender Gap</w:t>
+      </w:r>
+    </w:p>
+    <w:p>
+      <w:pPr>
+        <w:pStyle w:val="FirstParagraph"/>
+      </w:pPr>
+      <w:r>
+        <w:t xml:space="preserve">Over 400 draws with 1,000 two-adult households each; at equal household size the sum and the mean coincide, leaving three distinct rules.</w:t>
       </w:r>
     </w:p>
     <w:tbl>
@@ -978,7 +1433,7 @@
               <w:pStyle w:val="Compact"/>
             </w:pPr>
             <w:r>
-              <w:t xml:space="preserve">expected employed adults per household</w:t>
+              <w:t xml:space="preserve">employed adults per household</w:t>
             </w:r>
           </w:p>
         </w:tc>
@@ -1035,7 +1490,7 @@
               <w:pStyle w:val="Compact"/>
             </w:pPr>
             <w:r>
-              <w:t xml:space="preserve">0.964</w:t>
+              <w:t xml:space="preserve">0.962</w:t>
             </w:r>
           </w:p>
         </w:tc>
@@ -1057,18 +1512,18 @@
               <w:pStyle w:val="Compact"/>
             </w:pPr>
             <w:r>
-              <w:t xml:space="preserve">0.335</w:t>
-            </w:r>
-          </w:p>
-        </w:tc>
-        <w:tc>
-          <w:tcPr/>
-          <w:p>
-            <w:pPr>
-              <w:pStyle w:val="Compact"/>
-            </w:pPr>
-            <w:r>
-              <w:t xml:space="preserve">0.309</w:t>
+              <w:t xml:space="preserve">0.325</w:t>
+            </w:r>
+          </w:p>
+        </w:tc>
+        <w:tc>
+          <w:tcPr/>
+          <w:p>
+            <w:pPr>
+              <w:pStyle w:val="Compact"/>
+            </w:pPr>
+            <w:r>
+              <w:t xml:space="preserve">0.373</w:t>
             </w:r>
           </w:p>
         </w:tc>
@@ -1092,29 +1547,29 @@
               <w:pStyle w:val="Compact"/>
             </w:pPr>
             <w:r>
-              <w:t xml:space="preserve">0.977</w:t>
-            </w:r>
-          </w:p>
-        </w:tc>
-        <w:tc>
-          <w:tcPr/>
-          <w:p>
-            <w:pPr>
-              <w:pStyle w:val="Compact"/>
-            </w:pPr>
-            <w:r>
-              <w:t xml:space="preserve">+1.3%</w:t>
-            </w:r>
-          </w:p>
-        </w:tc>
-        <w:tc>
-          <w:tcPr/>
-          <w:p>
-            <w:pPr>
-              <w:pStyle w:val="Compact"/>
-            </w:pPr>
-            <w:r>
-              <w:t xml:space="preserve">0.342</w:t>
+              <w:t xml:space="preserve">1.338</w:t>
+            </w:r>
+          </w:p>
+        </w:tc>
+        <w:tc>
+          <w:tcPr/>
+          <w:p>
+            <w:pPr>
+              <w:pStyle w:val="Compact"/>
+            </w:pPr>
+            <w:r>
+              <w:t xml:space="preserve">+39.1%</w:t>
+            </w:r>
+          </w:p>
+        </w:tc>
+        <w:tc>
+          <w:tcPr/>
+          <w:p>
+            <w:pPr>
+              <w:pStyle w:val="Compact"/>
+            </w:pPr>
+            <w:r>
+              <w:t xml:space="preserve">0.471</w:t>
             </w:r>
           </w:p>
         </w:tc>
@@ -1129,7 +1584,7 @@
                 <w:b/>
                 <w:bCs/>
               </w:rPr>
-              <w:t xml:space="preserve">0.336</w:t>
+              <w:t xml:space="preserve">0.450</w:t>
             </w:r>
           </w:p>
         </w:tc>
@@ -1153,7 +1608,7 @@
               <w:pStyle w:val="Compact"/>
             </w:pPr>
             <w:r>
-              <w:t xml:space="preserve">0.985</w:t>
+              <w:t xml:space="preserve">1.415</w:t>
             </w:r>
           </w:p>
         </w:tc>
@@ -1168,29 +1623,29 @@
                 <w:b/>
                 <w:bCs/>
               </w:rPr>
-              <w:t xml:space="preserve">+2.2%</w:t>
-            </w:r>
-          </w:p>
-        </w:tc>
-        <w:tc>
-          <w:tcPr/>
-          <w:p>
-            <w:pPr>
-              <w:pStyle w:val="Compact"/>
-            </w:pPr>
-            <w:r>
-              <w:t xml:space="preserve">0.346</w:t>
-            </w:r>
-          </w:p>
-        </w:tc>
-        <w:tc>
-          <w:tcPr/>
-          <w:p>
-            <w:pPr>
-              <w:pStyle w:val="Compact"/>
-            </w:pPr>
-            <w:r>
-              <w:t xml:space="preserve">0.302</w:t>
+              <w:t xml:space="preserve">+47.1%</w:t>
+            </w:r>
+          </w:p>
+        </w:tc>
+        <w:tc>
+          <w:tcPr/>
+          <w:p>
+            <w:pPr>
+              <w:pStyle w:val="Compact"/>
+            </w:pPr>
+            <w:r>
+              <w:t xml:space="preserve">0.600</w:t>
+            </w:r>
+          </w:p>
+        </w:tc>
+        <w:tc>
+          <w:tcPr/>
+          <w:p>
+            <w:pPr>
+              <w:pStyle w:val="Compact"/>
+            </w:pPr>
+            <w:r>
+              <w:t xml:space="preserve">0.266</w:t>
             </w:r>
           </w:p>
         </w:tc>
@@ -1214,40 +1669,48 @@
               <w:pStyle w:val="Compact"/>
             </w:pPr>
             <w:r>
-              <w:t xml:space="preserve">0.978</w:t>
-            </w:r>
-          </w:p>
-        </w:tc>
-        <w:tc>
-          <w:tcPr/>
-          <w:p>
-            <w:pPr>
-              <w:pStyle w:val="Compact"/>
-            </w:pPr>
-            <w:r>
-              <w:t xml:space="preserve">+1.4%</w:t>
-            </w:r>
-          </w:p>
-        </w:tc>
-        <w:tc>
-          <w:tcPr/>
-          <w:p>
-            <w:pPr>
-              <w:pStyle w:val="Compact"/>
-            </w:pPr>
-            <w:r>
-              <w:t xml:space="preserve">0.347</w:t>
-            </w:r>
-          </w:p>
-        </w:tc>
-        <w:tc>
-          <w:tcPr/>
-          <w:p>
-            <w:pPr>
-              <w:pStyle w:val="Compact"/>
-            </w:pPr>
-            <w:r>
-              <w:t xml:space="preserve">0.284</w:t>
+              <w:t xml:space="preserve">1.371</w:t>
+            </w:r>
+          </w:p>
+        </w:tc>
+        <w:tc>
+          <w:tcPr/>
+          <w:p>
+            <w:pPr>
+              <w:pStyle w:val="Compact"/>
+            </w:pPr>
+            <w:r>
+              <w:t xml:space="preserve">+42.5%</w:t>
+            </w:r>
+          </w:p>
+        </w:tc>
+        <w:tc>
+          <w:tcPr/>
+          <w:p>
+            <w:pPr>
+              <w:pStyle w:val="Compact"/>
+            </w:pPr>
+            <w:r>
+              <w:rPr>
+                <w:b/>
+                <w:bCs/>
+              </w:rPr>
+              <w:t xml:space="preserve">0.629</w:t>
+            </w:r>
+          </w:p>
+        </w:tc>
+        <w:tc>
+          <w:tcPr/>
+          <w:p>
+            <w:pPr>
+              <w:pStyle w:val="Compact"/>
+            </w:pPr>
+            <w:r>
+              <w:rPr>
+                <w:b/>
+                <w:bCs/>
+              </w:rPr>
+              <w:t xml:space="preserve">0.160</w:t>
             </w:r>
           </w:p>
         </w:tc>
@@ -1258,7 +1721,31 @@
         <w:pStyle w:val="BodyText"/>
       </w:pPr>
       <w:r>
-        <w:t xml:space="preserve">At-least-one is the worst of the three candidate rules on every column: lower expected employment and a smaller gain over the status quo than either alternative, a lower employment probability for women, and the only row of the four — including the status quo — that widens rather than narrows the within-household gap. Mean wins on efficiency, minimum on equity, at-least-one on neither, so no efficiency-equity frontier remains on which to locate it. The gap-widening is moreover a violation of what Freund et al. (2023) call the Random fairness rule, the</w:t>
+        <w:t xml:space="preserve">90% Monte Carlo intervals over the parameter draws, for the at-least-one and mean rows: gain +36.8 to +41.4% and +45.1 to +49.3%; P(employed), women 0.436–0.508 and 0.570–0.631. These describe dispersion across stylised cantonal parameters, not sampling error.</w:t>
+      </w:r>
+    </w:p>
+    <w:p>
+      <w:pPr>
+        <w:pStyle w:val="BodyText"/>
+      </w:pPr>
+      <w:r>
+        <w:t xml:space="preserve">At-least-one is the worst of the three on every column: a smaller gain than either alternative, a lower employment probability for women, and the only row of the four that widens rather than narrows the within-household gap. Mean wins on efficiency, minimum on equity, at-least-one on neither, so no efficiency-equity frontier remains on which to locate it. Note what the table does not show: women are not left absolutely worse off than under the status quo, at 0.471 against 0.325 — the tool helps them, and substantially. The objection is the narrower one: the rule forgoes employment, and spends the gain it does achieve on the member who already had the better prospects.</w:t>
+      </w:r>
+    </w:p>
+    <w:p>
+      <w:pPr>
+        <w:pStyle w:val="BodyText"/>
+      </w:pPr>
+      <w:r>
+        <w:t xml:space="preserve">The magnitudes are not small. Choosing at-least-one over mean gives up 8.0 percentage points of the gain over the status quo, 17.0% of what is achievable (90% interval 15.2–19.1%), in 100% of replications rather than merely on average. Women’s employment probability is 12.9 points lower under the deployed rule than under the mean (90% interval 11.6–14.2), and the within-household gap widens by 7.6 points relative to the legal default where the mean narrows it by 10.8. Ranking cantons by each individual’s own prospects rather than the household’s makes the same point at the level where it is felt: the deployed rule sends men to their 4.3rd-best canton of 26 and women to their 8.8th, and 13% of women to a canton in their own worst quartile against 2% of men. Under the mean the order reverses, to 6.7 for men and 4.5 for women. Unconstrained by capacity, at-least-one strictly prefers a canton with a lower within-household mean for 50% of households, a share rising from 47% to 56% as the canton-by-gender interaction strengthens.</w:t>
+      </w:r>
+    </w:p>
+    <w:p>
+      <w:pPr>
+        <w:pStyle w:val="BodyText"/>
+      </w:pPr>
+      <w:r>
+        <w:t xml:space="preserve">Three checks. First, the ordering of the rules on every column is the same in the no-synergy limit, where the same table reads +1.4%, +2.2% and +1.4% and the forgone share is 37.8%: what the calibration changes is magnitude, not sign, and it changes it in both directions — the</w:t>
       </w:r>
       <w:r>
         <w:t xml:space="preserve"> </w:t>
@@ -1268,31 +1755,23 @@
           <w:i/>
           <w:iCs/>
         </w:rPr>
-        <w:t xml:space="preserve">primum non nocere</w:t>
-      </w:r>
-      <w:r>
-        <w:t xml:space="preserve"> </w:t>
-      </w:r>
-      <w:r>
-        <w:t xml:space="preserve">requirement that no group be worse off than under the status quo, on the very dimension the objective was chosen to address.</w:t>
-      </w:r>
-    </w:p>
-    <w:p>
-      <w:pPr>
-        <w:pStyle w:val="BodyText"/>
-      </w:pPr>
-      <w:r>
-        <w:t xml:space="preserve">The full Monte Carlo adds magnitude and robustness. Choosing at-least-one over mean forgoes 39.8% of the achievable efficiency gain (90% interval 31.2–47.7%), and the gap-widening holds in 100% of replications rather than merely on average. Bansak et al.’s own backtest comparison runs in the same direction, though my synergy structure is deliberately thinner than a full model’s and the proportion should not be read as an estimate of theirs. A third result concerns the assignment rather than outcome levels: at-least-one and mean send 85.5% of households to different cantons, a reorganisation on the scale of the 88% Strasser Ceballos and Kern (2025) obtain by changing the target variable. Across interaction strengths, reversals range from 14.8% of households to 57.6% while the forgone-gain share stays near 40%.</w:t>
-      </w:r>
-    </w:p>
-    <w:bookmarkEnd w:id="13"/>
-    <w:bookmarkStart w:id="14" w:name="the-household-size-effect"/>
+        <w:t xml:space="preserve">share</w:t>
+      </w:r>
+      <w:r>
+        <w:t xml:space="preserve"> </w:t>
+      </w:r>
+      <w:r>
+        <w:t xml:space="preserve">of the achievable gain given up falls as synergies grow, while the absolute cost of the choice rises. Second, doubling the person-by-canton term strengthens the efficiency and gender findings (18.9 points of gain forgone, 26.0% of the achievable, women 23.0 points behind) and weakens the gap finding without reversing it: the widening falls from 7.6 to 2.6 points and holds in 96% of replications rather than 100%. Third, letting household members resemble each other, which is what the formula’s independence assumption denies, leaves the efficiency loss where it was (8.0 to 7.9 points) and makes the distributional findings slightly worse: the gap widening rises from 7.8 to 8.1 points and women’s shortfall from 12.9 to 13.2 as members’ shared variance rises to 0.6.</w:t>
+      </w:r>
+    </w:p>
+    <w:bookmarkEnd w:id="14"/>
+    <w:bookmarkStart w:id="15" w:name="the-household-size-effect"/>
     <w:p>
       <w:pPr>
         <w:pStyle w:val="Heading3"/>
       </w:pPr>
       <w:r>
-        <w:t xml:space="preserve">The Household-Size Effect</w:t>
+        <w:t xml:space="preserve">4.3 The Household-Size Effect</w:t>
       </w:r>
     </w:p>
     <w:p>
@@ -1300,32 +1779,386 @@
         <w:pStyle w:val="FirstParagraph"/>
       </w:pPr>
       <w:r>
-        <w:t xml:space="preserve">The household-size mechanism is not merely algebraic; it is large. I extend the simulation to a stylised mix of one- to four-adult households (shares 35/30/20/15) and rank, for each household, all 26 cantons by its own true mean employment probability — the outcome it experiences, rather than the compressed score it is matched on. The table reports, for each size under each rule, the average rank of the canton actually received (1 = best of 26) and the</w:t>
-      </w:r>
-      <w:r>
-        <w:t xml:space="preserve"> </w:t>
-      </w:r>
-      <w:r>
-        <w:t xml:space="preserve">“own-worst-quartile”</w:t>
-      </w:r>
-      <w:r>
-        <w:t xml:space="preserve"> </w:t>
-      </w:r>
-      <w:r>
-        <w:t xml:space="preserve">share, the percentage of households sent to one of the seven worst cantons</w:t>
-      </w:r>
-      <w:r>
-        <w:t xml:space="preserve"> </w:t>
-      </w:r>
-      <w:r>
-        <w:rPr>
-          <w:i/>
-          <w:iCs/>
-        </w:rPr>
-        <w:t xml:space="preserve">on their own ranking</w:t>
-      </w:r>
-      <w:r>
-        <w:t xml:space="preserve">.</w:t>
+        <w:t xml:space="preserve">The mechanism is not merely algebraic. I extend the simulation to a stylised mix of one- to four-adult households (shares 35/30/20/15) and rank, for each household, all 26 cantons by its own prospects — the outcome it experiences, rather than the compressed score it is matched on. Ranking needs a yardstick, and the yardstick must not be the objective of one of the rules being compared, so I report two. The first is the household’s own mean employment probability; because the expected number of employed members is that mean times a household size which is fixed within a household, the two rank cantons identically, so this yardstick does not privilege the mean rule over the sum rule. The second is the employment probability of the household’s least employable member, which no compared rule maximises. Tables report the average rank of the canton received, 1 being the best of 26.</w:t>
+      </w:r>
+    </w:p>
+    <w:p>
+      <w:pPr>
+        <w:pStyle w:val="BodyText"/>
+      </w:pPr>
+      <w:r>
+        <w:t xml:space="preserve">Per-person yardstick:</w:t>
+      </w:r>
+    </w:p>
+    <w:tbl>
+      <w:tblPr>
+        <w:tblStyle w:val="Table"/>
+        <w:tblW w:type="auto" w:w="0"/>
+        <w:tblLook w:firstRow="1" w:lastRow="0" w:firstColumn="0" w:lastColumn="0" w:noHBand="0" w:noVBand="0" w:val="0020"/>
+      </w:tblPr>
+      <w:tblGrid>
+        <w:gridCol w:w="1584"/>
+        <w:gridCol w:w="1584"/>
+        <w:gridCol w:w="1584"/>
+        <w:gridCol w:w="1584"/>
+        <w:gridCol w:w="1584"/>
+      </w:tblGrid>
+      <w:tr>
+        <w:trPr>
+          <w:tblHeader w:val="on"/>
+        </w:trPr>
+        <w:tc>
+          <w:tcPr/>
+          <w:p>
+            <w:pPr>
+              <w:pStyle w:val="Compact"/>
+            </w:pPr>
+            <w:r>
+              <w:t xml:space="preserve">household size</w:t>
+            </w:r>
+          </w:p>
+        </w:tc>
+        <w:tc>
+          <w:tcPr/>
+          <w:p>
+            <w:pPr>
+              <w:pStyle w:val="Compact"/>
+            </w:pPr>
+            <w:r>
+              <w:t xml:space="preserve">at-least-one</w:t>
+            </w:r>
+          </w:p>
+        </w:tc>
+        <w:tc>
+          <w:tcPr/>
+          <w:p>
+            <w:pPr>
+              <w:pStyle w:val="Compact"/>
+            </w:pPr>
+            <w:r>
+              <w:t xml:space="preserve">mean</w:t>
+            </w:r>
+          </w:p>
+        </w:tc>
+        <w:tc>
+          <w:tcPr/>
+          <w:p>
+            <w:pPr>
+              <w:pStyle w:val="Compact"/>
+            </w:pPr>
+            <w:r>
+              <w:t xml:space="preserve">sum</w:t>
+            </w:r>
+          </w:p>
+        </w:tc>
+        <w:tc>
+          <w:tcPr/>
+          <w:p>
+            <w:pPr>
+              <w:pStyle w:val="Compact"/>
+            </w:pPr>
+            <w:r>
+              <w:t xml:space="preserve">lottery</w:t>
+            </w:r>
+          </w:p>
+        </w:tc>
+      </w:tr>
+      <w:tr>
+        <w:tc>
+          <w:tcPr/>
+          <w:p>
+            <w:pPr>
+              <w:pStyle w:val="Compact"/>
+            </w:pPr>
+            <w:r>
+              <w:t xml:space="preserve">1</w:t>
+            </w:r>
+          </w:p>
+        </w:tc>
+        <w:tc>
+          <w:tcPr/>
+          <w:p>
+            <w:pPr>
+              <w:pStyle w:val="Compact"/>
+            </w:pPr>
+            <w:r>
+              <w:t xml:space="preserve">1.7</w:t>
+            </w:r>
+          </w:p>
+        </w:tc>
+        <w:tc>
+          <w:tcPr/>
+          <w:p>
+            <w:pPr>
+              <w:pStyle w:val="Compact"/>
+            </w:pPr>
+            <w:r>
+              <w:t xml:space="preserve">2.5</w:t>
+            </w:r>
+          </w:p>
+        </w:tc>
+        <w:tc>
+          <w:tcPr/>
+          <w:p>
+            <w:pPr>
+              <w:pStyle w:val="Compact"/>
+            </w:pPr>
+            <w:r>
+              <w:t xml:space="preserve">4.0</w:t>
+            </w:r>
+          </w:p>
+        </w:tc>
+        <w:tc>
+          <w:tcPr/>
+          <w:p>
+            <w:pPr>
+              <w:pStyle w:val="Compact"/>
+            </w:pPr>
+            <w:r>
+              <w:t xml:space="preserve">13.5</w:t>
+            </w:r>
+          </w:p>
+        </w:tc>
+      </w:tr>
+      <w:tr>
+        <w:tc>
+          <w:tcPr/>
+          <w:p>
+            <w:pPr>
+              <w:pStyle w:val="Compact"/>
+            </w:pPr>
+            <w:r>
+              <w:t xml:space="preserve">2</w:t>
+            </w:r>
+          </w:p>
+        </w:tc>
+        <w:tc>
+          <w:tcPr/>
+          <w:p>
+            <w:pPr>
+              <w:pStyle w:val="Compact"/>
+            </w:pPr>
+            <w:r>
+              <w:t xml:space="preserve">3.8</w:t>
+            </w:r>
+          </w:p>
+        </w:tc>
+        <w:tc>
+          <w:tcPr/>
+          <w:p>
+            <w:pPr>
+              <w:pStyle w:val="Compact"/>
+            </w:pPr>
+            <w:r>
+              <w:t xml:space="preserve">2.6</w:t>
+            </w:r>
+          </w:p>
+        </w:tc>
+        <w:tc>
+          <w:tcPr/>
+          <w:p>
+            <w:pPr>
+              <w:pStyle w:val="Compact"/>
+            </w:pPr>
+            <w:r>
+              <w:t xml:space="preserve">2.6</w:t>
+            </w:r>
+          </w:p>
+        </w:tc>
+        <w:tc>
+          <w:tcPr/>
+          <w:p>
+            <w:pPr>
+              <w:pStyle w:val="Compact"/>
+            </w:pPr>
+            <w:r>
+              <w:t xml:space="preserve">13.5</w:t>
+            </w:r>
+          </w:p>
+        </w:tc>
+      </w:tr>
+      <w:tr>
+        <w:tc>
+          <w:tcPr/>
+          <w:p>
+            <w:pPr>
+              <w:pStyle w:val="Compact"/>
+            </w:pPr>
+            <w:r>
+              <w:t xml:space="preserve">3</w:t>
+            </w:r>
+          </w:p>
+        </w:tc>
+        <w:tc>
+          <w:tcPr/>
+          <w:p>
+            <w:pPr>
+              <w:pStyle w:val="Compact"/>
+            </w:pPr>
+            <w:r>
+              <w:t xml:space="preserve">5.6</w:t>
+            </w:r>
+          </w:p>
+        </w:tc>
+        <w:tc>
+          <w:tcPr/>
+          <w:p>
+            <w:pPr>
+              <w:pStyle w:val="Compact"/>
+            </w:pPr>
+            <w:r>
+              <w:t xml:space="preserve">3.2</w:t>
+            </w:r>
+          </w:p>
+        </w:tc>
+        <w:tc>
+          <w:tcPr/>
+          <w:p>
+            <w:pPr>
+              <w:pStyle w:val="Compact"/>
+            </w:pPr>
+            <w:r>
+              <w:t xml:space="preserve">2.1</w:t>
+            </w:r>
+          </w:p>
+        </w:tc>
+        <w:tc>
+          <w:tcPr/>
+          <w:p>
+            <w:pPr>
+              <w:pStyle w:val="Compact"/>
+            </w:pPr>
+            <w:r>
+              <w:t xml:space="preserve">13.5</w:t>
+            </w:r>
+          </w:p>
+        </w:tc>
+      </w:tr>
+      <w:tr>
+        <w:tc>
+          <w:tcPr/>
+          <w:p>
+            <w:pPr>
+              <w:pStyle w:val="Compact"/>
+            </w:pPr>
+            <w:r>
+              <w:t xml:space="preserve">4</w:t>
+            </w:r>
+          </w:p>
+        </w:tc>
+        <w:tc>
+          <w:tcPr/>
+          <w:p>
+            <w:pPr>
+              <w:pStyle w:val="Compact"/>
+            </w:pPr>
+            <w:r>
+              <w:rPr>
+                <w:b/>
+                <w:bCs/>
+              </w:rPr>
+              <w:t xml:space="preserve">7.8</w:t>
+            </w:r>
+          </w:p>
+        </w:tc>
+        <w:tc>
+          <w:tcPr/>
+          <w:p>
+            <w:pPr>
+              <w:pStyle w:val="Compact"/>
+            </w:pPr>
+            <w:r>
+              <w:t xml:space="preserve">3.6</w:t>
+            </w:r>
+          </w:p>
+        </w:tc>
+        <w:tc>
+          <w:tcPr/>
+          <w:p>
+            <w:pPr>
+              <w:pStyle w:val="Compact"/>
+            </w:pPr>
+            <w:r>
+              <w:t xml:space="preserve">1.9</w:t>
+            </w:r>
+          </w:p>
+        </w:tc>
+        <w:tc>
+          <w:tcPr/>
+          <w:p>
+            <w:pPr>
+              <w:pStyle w:val="Compact"/>
+            </w:pPr>
+            <w:r>
+              <w:t xml:space="preserve">13.5</w:t>
+            </w:r>
+          </w:p>
+        </w:tc>
+      </w:tr>
+      <w:tr>
+        <w:tc>
+          <w:tcPr/>
+          <w:p>
+            <w:pPr>
+              <w:pStyle w:val="Compact"/>
+            </w:pPr>
+            <w:r>
+              <w:t xml:space="preserve">all sizes</w:t>
+            </w:r>
+          </w:p>
+        </w:tc>
+        <w:tc>
+          <w:tcPr/>
+          <w:p>
+            <w:pPr>
+              <w:pStyle w:val="Compact"/>
+            </w:pPr>
+            <w:r>
+              <w:t xml:space="preserve">4.0</w:t>
+            </w:r>
+          </w:p>
+        </w:tc>
+        <w:tc>
+          <w:tcPr/>
+          <w:p>
+            <w:pPr>
+              <w:pStyle w:val="Compact"/>
+            </w:pPr>
+            <w:r>
+              <w:t xml:space="preserve">2.8</w:t>
+            </w:r>
+          </w:p>
+        </w:tc>
+        <w:tc>
+          <w:tcPr/>
+          <w:p>
+            <w:pPr>
+              <w:pStyle w:val="Compact"/>
+            </w:pPr>
+            <w:r>
+              <w:t xml:space="preserve">2.9</w:t>
+            </w:r>
+          </w:p>
+        </w:tc>
+        <w:tc>
+          <w:tcPr/>
+          <w:p>
+            <w:pPr>
+              <w:pStyle w:val="Compact"/>
+            </w:pPr>
+            <w:r>
+              <w:t xml:space="preserve">13.5</w:t>
+            </w:r>
+          </w:p>
+        </w:tc>
+      </w:tr>
+    </w:tbl>
+    <w:p>
+      <w:pPr>
+        <w:pStyle w:val="BodyText"/>
+      </w:pPr>
+      <w:r>
+        <w:t xml:space="preserve">Worst-off-member yardstick, with the share of households sent to a canton in their own worst quartile:</w:t>
       </w:r>
     </w:p>
     <w:tbl>
@@ -1365,29 +2198,40 @@
               <w:pStyle w:val="Compact"/>
             </w:pPr>
             <w:r>
-              <w:t xml:space="preserve">rank: at-least-one</w:t>
-            </w:r>
-          </w:p>
-        </w:tc>
-        <w:tc>
-          <w:tcPr/>
-          <w:p>
-            <w:pPr>
-              <w:pStyle w:val="Compact"/>
-            </w:pPr>
-            <w:r>
-              <w:t xml:space="preserve">rank: mean</w:t>
-            </w:r>
-          </w:p>
-        </w:tc>
-        <w:tc>
-          <w:tcPr/>
-          <w:p>
-            <w:pPr>
-              <w:pStyle w:val="Compact"/>
-            </w:pPr>
-            <w:r>
-              <w:t xml:space="preserve">rank: lottery</w:t>
+              <w:t xml:space="preserve">at-least-one</w:t>
+            </w:r>
+          </w:p>
+        </w:tc>
+        <w:tc>
+          <w:tcPr/>
+          <w:p>
+            <w:pPr>
+              <w:pStyle w:val="Compact"/>
+            </w:pPr>
+            <w:r>
+              <w:t xml:space="preserve">mean</w:t>
+            </w:r>
+          </w:p>
+        </w:tc>
+        <w:tc>
+          <w:tcPr/>
+          <w:p>
+            <w:pPr>
+              <w:pStyle w:val="Compact"/>
+            </w:pPr>
+            <w:r>
+              <w:t xml:space="preserve">sum</w:t>
+            </w:r>
+          </w:p>
+        </w:tc>
+        <w:tc>
+          <w:tcPr/>
+          <w:p>
+            <w:pPr>
+              <w:pStyle w:val="Compact"/>
+            </w:pPr>
+            <w:r>
+              <w:t xml:space="preserve">lottery</w:t>
             </w:r>
           </w:p>
         </w:tc>
@@ -1399,17 +2243,6 @@
             </w:pPr>
             <w:r>
               <w:t xml:space="preserve">own-worst-quartile: at-least-one</w:t>
-            </w:r>
-          </w:p>
-        </w:tc>
-        <w:tc>
-          <w:tcPr/>
-          <w:p>
-            <w:pPr>
-              <w:pStyle w:val="Compact"/>
-            </w:pPr>
-            <w:r>
-              <w:t xml:space="preserve">own-worst-quartile: lottery</w:t>
             </w:r>
           </w:p>
         </w:tc>
@@ -1433,51 +2266,51 @@
               <w:pStyle w:val="Compact"/>
             </w:pPr>
             <w:r>
-              <w:t xml:space="preserve">6.8</w:t>
-            </w:r>
-          </w:p>
-        </w:tc>
-        <w:tc>
-          <w:tcPr/>
-          <w:p>
-            <w:pPr>
-              <w:pStyle w:val="Compact"/>
-            </w:pPr>
-            <w:r>
-              <w:t xml:space="preserve">7.9</w:t>
-            </w:r>
-          </w:p>
-        </w:tc>
-        <w:tc>
-          <w:tcPr/>
-          <w:p>
-            <w:pPr>
-              <w:pStyle w:val="Compact"/>
-            </w:pPr>
-            <w:r>
-              <w:t xml:space="preserve">13.45</w:t>
-            </w:r>
-          </w:p>
-        </w:tc>
-        <w:tc>
-          <w:tcPr/>
-          <w:p>
-            <w:pPr>
-              <w:pStyle w:val="Compact"/>
-            </w:pPr>
-            <w:r>
-              <w:t xml:space="preserve">3%</w:t>
-            </w:r>
-          </w:p>
-        </w:tc>
-        <w:tc>
-          <w:tcPr/>
-          <w:p>
-            <w:pPr>
-              <w:pStyle w:val="Compact"/>
-            </w:pPr>
-            <w:r>
-              <w:t xml:space="preserve">26.7%</w:t>
+              <w:t xml:space="preserve">1.7</w:t>
+            </w:r>
+          </w:p>
+        </w:tc>
+        <w:tc>
+          <w:tcPr/>
+          <w:p>
+            <w:pPr>
+              <w:pStyle w:val="Compact"/>
+            </w:pPr>
+            <w:r>
+              <w:t xml:space="preserve">2.5</w:t>
+            </w:r>
+          </w:p>
+        </w:tc>
+        <w:tc>
+          <w:tcPr/>
+          <w:p>
+            <w:pPr>
+              <w:pStyle w:val="Compact"/>
+            </w:pPr>
+            <w:r>
+              <w:t xml:space="preserve">4.0</w:t>
+            </w:r>
+          </w:p>
+        </w:tc>
+        <w:tc>
+          <w:tcPr/>
+          <w:p>
+            <w:pPr>
+              <w:pStyle w:val="Compact"/>
+            </w:pPr>
+            <w:r>
+              <w:t xml:space="preserve">13.5</w:t>
+            </w:r>
+          </w:p>
+        </w:tc>
+        <w:tc>
+          <w:tcPr/>
+          <w:p>
+            <w:pPr>
+              <w:pStyle w:val="Compact"/>
+            </w:pPr>
+            <w:r>
+              <w:t xml:space="preserve">0%</w:t>
             </w:r>
           </w:p>
         </w:tc>
@@ -1501,51 +2334,51 @@
               <w:pStyle w:val="Compact"/>
             </w:pPr>
             <w:r>
-              <w:t xml:space="preserve">7.8</w:t>
-            </w:r>
-          </w:p>
-        </w:tc>
-        <w:tc>
-          <w:tcPr/>
-          <w:p>
-            <w:pPr>
-              <w:pStyle w:val="Compact"/>
-            </w:pPr>
-            <w:r>
-              <w:t xml:space="preserve">10.3</w:t>
-            </w:r>
-          </w:p>
-        </w:tc>
-        <w:tc>
-          <w:tcPr/>
-          <w:p>
-            <w:pPr>
-              <w:pStyle w:val="Compact"/>
-            </w:pPr>
-            <w:r>
-              <w:t xml:space="preserve">13.46</w:t>
-            </w:r>
-          </w:p>
-        </w:tc>
-        <w:tc>
-          <w:tcPr/>
-          <w:p>
-            <w:pPr>
-              <w:pStyle w:val="Compact"/>
-            </w:pPr>
-            <w:r>
-              <w:t xml:space="preserve">4%</w:t>
-            </w:r>
-          </w:p>
-        </w:tc>
-        <w:tc>
-          <w:tcPr/>
-          <w:p>
-            <w:pPr>
-              <w:pStyle w:val="Compact"/>
-            </w:pPr>
-            <w:r>
-              <w:t xml:space="preserve">26.7%</w:t>
+              <w:t xml:space="preserve">7.1</w:t>
+            </w:r>
+          </w:p>
+        </w:tc>
+        <w:tc>
+          <w:tcPr/>
+          <w:p>
+            <w:pPr>
+              <w:pStyle w:val="Compact"/>
+            </w:pPr>
+            <w:r>
+              <w:t xml:space="preserve">3.5</w:t>
+            </w:r>
+          </w:p>
+        </w:tc>
+        <w:tc>
+          <w:tcPr/>
+          <w:p>
+            <w:pPr>
+              <w:pStyle w:val="Compact"/>
+            </w:pPr>
+            <w:r>
+              <w:t xml:space="preserve">3.5</w:t>
+            </w:r>
+          </w:p>
+        </w:tc>
+        <w:tc>
+          <w:tcPr/>
+          <w:p>
+            <w:pPr>
+              <w:pStyle w:val="Compact"/>
+            </w:pPr>
+            <w:r>
+              <w:t xml:space="preserve">13.5</w:t>
+            </w:r>
+          </w:p>
+        </w:tc>
+        <w:tc>
+          <w:tcPr/>
+          <w:p>
+            <w:pPr>
+              <w:pStyle w:val="Compact"/>
+            </w:pPr>
+            <w:r>
+              <w:t xml:space="preserve">9%</w:t>
             </w:r>
           </w:p>
         </w:tc>
@@ -1569,51 +2402,51 @@
               <w:pStyle w:val="Compact"/>
             </w:pPr>
             <w:r>
-              <w:t xml:space="preserve">12.9</w:t>
-            </w:r>
-          </w:p>
-        </w:tc>
-        <w:tc>
-          <w:tcPr/>
-          <w:p>
-            <w:pPr>
-              <w:pStyle w:val="Compact"/>
-            </w:pPr>
-            <w:r>
-              <w:t xml:space="preserve">10.9</w:t>
-            </w:r>
-          </w:p>
-        </w:tc>
-        <w:tc>
-          <w:tcPr/>
-          <w:p>
-            <w:pPr>
-              <w:pStyle w:val="Compact"/>
-            </w:pPr>
-            <w:r>
-              <w:t xml:space="preserve">13.44</w:t>
-            </w:r>
-          </w:p>
-        </w:tc>
-        <w:tc>
-          <w:tcPr/>
-          <w:p>
-            <w:pPr>
-              <w:pStyle w:val="Compact"/>
-            </w:pPr>
-            <w:r>
-              <w:t xml:space="preserve">18%</w:t>
-            </w:r>
-          </w:p>
-        </w:tc>
-        <w:tc>
-          <w:tcPr/>
-          <w:p>
-            <w:pPr>
-              <w:pStyle w:val="Compact"/>
-            </w:pPr>
-            <w:r>
-              <w:t xml:space="preserve">26.7%</w:t>
+              <w:t xml:space="preserve">9.9</w:t>
+            </w:r>
+          </w:p>
+        </w:tc>
+        <w:tc>
+          <w:tcPr/>
+          <w:p>
+            <w:pPr>
+              <w:pStyle w:val="Compact"/>
+            </w:pPr>
+            <w:r>
+              <w:t xml:space="preserve">5.1</w:t>
+            </w:r>
+          </w:p>
+        </w:tc>
+        <w:tc>
+          <w:tcPr/>
+          <w:p>
+            <w:pPr>
+              <w:pStyle w:val="Compact"/>
+            </w:pPr>
+            <w:r>
+              <w:t xml:space="preserve">4.0</w:t>
+            </w:r>
+          </w:p>
+        </w:tc>
+        <w:tc>
+          <w:tcPr/>
+          <w:p>
+            <w:pPr>
+              <w:pStyle w:val="Compact"/>
+            </w:pPr>
+            <w:r>
+              <w:t xml:space="preserve">13.5</w:t>
+            </w:r>
+          </w:p>
+        </w:tc>
+        <w:tc>
+          <w:tcPr/>
+          <w:p>
+            <w:pPr>
+              <w:pStyle w:val="Compact"/>
+            </w:pPr>
+            <w:r>
+              <w:t xml:space="preserve">16%</w:t>
             </w:r>
           </w:p>
         </w:tc>
@@ -1627,39 +2460,6 @@
             </w:pPr>
             <w:r>
               <w:t xml:space="preserve">4</w:t>
-            </w:r>
-          </w:p>
-        </w:tc>
-        <w:tc>
-          <w:tcPr/>
-          <w:p>
-            <w:pPr>
-              <w:pStyle w:val="Compact"/>
-            </w:pPr>
-            <w:r>
-              <w:t xml:space="preserve">17.6</w:t>
-            </w:r>
-          </w:p>
-        </w:tc>
-        <w:tc>
-          <w:tcPr/>
-          <w:p>
-            <w:pPr>
-              <w:pStyle w:val="Compact"/>
-            </w:pPr>
-            <w:r>
-              <w:t xml:space="preserve">11.4</w:t>
-            </w:r>
-          </w:p>
-        </w:tc>
-        <w:tc>
-          <w:tcPr/>
-          <w:p>
-            <w:pPr>
-              <w:pStyle w:val="Compact"/>
-            </w:pPr>
-            <w:r>
-              <w:t xml:space="preserve">13.45</w:t>
             </w:r>
           </w:p>
         </w:tc>
@@ -1674,31 +2474,40 @@
                 <w:b/>
                 <w:bCs/>
               </w:rPr>
-              <w:t xml:space="preserve">45%</w:t>
-            </w:r>
-          </w:p>
-        </w:tc>
-        <w:tc>
-          <w:tcPr/>
-          <w:p>
-            <w:pPr>
-              <w:pStyle w:val="Compact"/>
-            </w:pPr>
-            <w:r>
-              <w:t xml:space="preserve">26.6%</w:t>
-            </w:r>
-          </w:p>
-        </w:tc>
-      </w:tr>
-      <w:tr>
-        <w:tc>
-          <w:tcPr/>
-          <w:p>
-            <w:pPr>
-              <w:pStyle w:val="Compact"/>
-            </w:pPr>
-            <w:r>
-              <w:t xml:space="preserve">all sizes</w:t>
+              <w:t xml:space="preserve">11.7</w:t>
+            </w:r>
+          </w:p>
+        </w:tc>
+        <w:tc>
+          <w:tcPr/>
+          <w:p>
+            <w:pPr>
+              <w:pStyle w:val="Compact"/>
+            </w:pPr>
+            <w:r>
+              <w:t xml:space="preserve">6.4</w:t>
+            </w:r>
+          </w:p>
+        </w:tc>
+        <w:tc>
+          <w:tcPr/>
+          <w:p>
+            <w:pPr>
+              <w:pStyle w:val="Compact"/>
+            </w:pPr>
+            <w:r>
+              <w:t xml:space="preserve">4.6</w:t>
+            </w:r>
+          </w:p>
+        </w:tc>
+        <w:tc>
+          <w:tcPr/>
+          <w:p>
+            <w:pPr>
+              <w:pStyle w:val="Compact"/>
+            </w:pPr>
+            <w:r>
+              <w:t xml:space="preserve">13.5</w:t>
             </w:r>
           </w:p>
         </w:tc>
@@ -1713,55 +2522,75 @@
                 <w:b/>
                 <w:bCs/>
               </w:rPr>
-              <w:t xml:space="preserve">9.9</w:t>
-            </w:r>
-          </w:p>
-        </w:tc>
-        <w:tc>
-          <w:tcPr/>
-          <w:p>
-            <w:pPr>
-              <w:pStyle w:val="Compact"/>
-            </w:pPr>
-            <w:r>
-              <w:t xml:space="preserve">9.8</w:t>
-            </w:r>
-          </w:p>
-        </w:tc>
-        <w:tc>
-          <w:tcPr/>
-          <w:p>
-            <w:pPr>
-              <w:pStyle w:val="Compact"/>
-            </w:pPr>
-            <w:r>
-              <w:t xml:space="preserve">13.45</w:t>
-            </w:r>
-          </w:p>
-        </w:tc>
-        <w:tc>
-          <w:tcPr/>
-          <w:p>
-            <w:pPr>
-              <w:pStyle w:val="Compact"/>
-            </w:pPr>
-            <w:r>
-              <w:rPr>
-                <w:b/>
-                <w:bCs/>
-              </w:rPr>
-              <w:t xml:space="preserve">13%</w:t>
-            </w:r>
-          </w:p>
-        </w:tc>
-        <w:tc>
-          <w:tcPr/>
-          <w:p>
-            <w:pPr>
-              <w:pStyle w:val="Compact"/>
-            </w:pPr>
-            <w:r>
-              <w:t xml:space="preserve">26.7%</w:t>
+              <w:t xml:space="preserve">21%</w:t>
+            </w:r>
+          </w:p>
+        </w:tc>
+      </w:tr>
+      <w:tr>
+        <w:tc>
+          <w:tcPr/>
+          <w:p>
+            <w:pPr>
+              <w:pStyle w:val="Compact"/>
+            </w:pPr>
+            <w:r>
+              <w:t xml:space="preserve">all sizes</w:t>
+            </w:r>
+          </w:p>
+        </w:tc>
+        <w:tc>
+          <w:tcPr/>
+          <w:p>
+            <w:pPr>
+              <w:pStyle w:val="Compact"/>
+            </w:pPr>
+            <w:r>
+              <w:t xml:space="preserve">6.5</w:t>
+            </w:r>
+          </w:p>
+        </w:tc>
+        <w:tc>
+          <w:tcPr/>
+          <w:p>
+            <w:pPr>
+              <w:pStyle w:val="Compact"/>
+            </w:pPr>
+            <w:r>
+              <w:t xml:space="preserve">3.9</w:t>
+            </w:r>
+          </w:p>
+        </w:tc>
+        <w:tc>
+          <w:tcPr/>
+          <w:p>
+            <w:pPr>
+              <w:pStyle w:val="Compact"/>
+            </w:pPr>
+            <w:r>
+              <w:t xml:space="preserve">3.9</w:t>
+            </w:r>
+          </w:p>
+        </w:tc>
+        <w:tc>
+          <w:tcPr/>
+          <w:p>
+            <w:pPr>
+              <w:pStyle w:val="Compact"/>
+            </w:pPr>
+            <w:r>
+              <w:t xml:space="preserve">13.5</w:t>
+            </w:r>
+          </w:p>
+        </w:tc>
+        <w:tc>
+          <w:tcPr/>
+          <w:p>
+            <w:pPr>
+              <w:pStyle w:val="Compact"/>
+            </w:pPr>
+            <w:r>
+              <w:t xml:space="preserve">9%</w:t>
             </w:r>
           </w:p>
         </w:tc>
@@ -1772,39 +2601,49 @@
         <w:pStyle w:val="BodyText"/>
       </w:pPr>
       <w:r>
-        <w:t xml:space="preserve">The lottery column is the yardstick: a household-blind lottery averages rank 13.5, the midpoint of 26. Against it, single adults and couples do far better, at average ranks of 6.8 and 7.8, because for a small case the compressed score and the true score nearly coincide. Four-adult households do worse than the lottery that ignores them entirely: rank 17.6, and a 45% chance of landing in their own worst quartile against the lottery’s 26.7%. The mean rule shows no such reversal (rank 11.4), so the failure is specific to the deployed</w:t>
-      </w:r>
-      <w:r>
-        <w:t xml:space="preserve"> </w:t>
-      </w:r>
-      <m:oMath>
-        <m:r>
-          <m:t>φ</m:t>
-        </m:r>
-      </m:oMath>
-      <w:r>
-        <w:t xml:space="preserve"> </w:t>
-      </w:r>
-      <w:r>
-        <w:t xml:space="preserve">rather than an inherent cost of optimising.</w:t>
-      </w:r>
-    </w:p>
-    <w:p>
-      <w:pPr>
-        <w:pStyle w:val="BodyText"/>
-      </w:pPr>
-      <w:r>
-        <w:t xml:space="preserve">Two checks confirm this is not an artefact of the size mix or of measuring rank rather than magnitude. The pooled row shows what a population-wide average alone would suggest — an unambiguous improvement over the lottery — so only disaggregation reveals the transfer from large households to small ones, the size-level analogue of what aggregating individuals into households does to the gender effect. Regret, each household’s own best-canton probability minus what it receives, measures every size against its own achievable range and tells the same story in probability points: under at-least-one it rises from 0.09 for singles to 0.17 for four-adult households, crossing the lottery’s own regret — which falls from 0.17 to 0.14 — between three and four adults.</w:t>
-      </w:r>
-    </w:p>
-    <w:bookmarkEnd w:id="14"/>
-    <w:bookmarkStart w:id="15" w:name="a-note-on-the-simulated-data"/>
+        <w:t xml:space="preserve">Take the negative result first. The lottery averages rank 13.5, the midpoint of 26, and sends 27% of households to their own worst quartile at every size. No rule leaves any size below it: the deployed objective’s worst cell is a four-adult household at rank 11.7 on the yardstick least favourable to it, with a 21% chance of its weakest member landing in that member’s own worst quartile against the lottery’s 27%. Optimisation, including this optimisation, helps every size.</w:t>
+      </w:r>
+    </w:p>
+    <w:p>
+      <w:pPr>
+        <w:pStyle w:val="BodyText"/>
+      </w:pPr>
+      <w:r>
+        <w:t xml:space="preserve">What it does not do is help them equally, and the gradient is steep. At-least-one takes a single adult to rank 1.7 and a four-adult household to 7.8 on the first yardstick and 11.7 on the second: the benefit of being optimised for falls by a factor of five, then seven, as a household adds members. The mean rule, which weights each person once, runs from 2.5 to 3.6 and from 2.5 to 6.4 — graded too, since a large household is harder to place well, but at a fifth of the slope on the first yardstick and two fifths on the second. That difference is not about how hard large households are to place; it is the score compression of Section 3, a four-adult household with middling probabilities scoring above 0.93 in every canton and so registering almost no preference for the optimiser to act on. Single adults gain from the same mechanism: for them the compressed score and the true score nearly coincide, which is why at-least-one places them better than the mean rule does.</w:t>
+      </w:r>
+    </w:p>
+    <w:p>
+      <w:pPr>
+        <w:pStyle w:val="BodyText"/>
+      </w:pPr>
+      <w:r>
+        <w:t xml:space="preserve">In probability units rather than ranks, the same gradient reads as regret — the household’s best available canton minus the one it received, an upper bound since not everyone can have their best at once. Under at-least-one, regret rises from 1.6 points for a single adult to 13.2 for a four-adult household on the first yardstick and to 27.0 on the second; under the mean it rises from 3.7 to 5.6 and to 14.8. The deployed rule buys single adults about two points of probability and charges four-adult households eight to twelve for them.</w:t>
+      </w:r>
+    </w:p>
+    <w:p>
+      <w:pPr>
+        <w:pStyle w:val="BodyText"/>
+      </w:pPr>
+      <w:r>
+        <w:t xml:space="preserve">The sum rule confirms that no aggregation is neutral, though less tidily than I once put it. On the per-person yardstick it inverts the pattern, buying four-adult households rank 1.9 and pushing single adults to 4.0; on the worst-off yardstick it is close to flat across sizes, from 4.0 to 4.6. Each rule implies a different weighting of persons within a case, and the pooled row hides all of it: every rule beats the lottery on the population average, and at-least-one, mean and sum are within 1.2 ranks of each other there. Only the size-disaggregated rows show the objective choosing who benefits.</w:t>
+      </w:r>
+    </w:p>
+    <w:p>
+      <w:pPr>
+        <w:pStyle w:val="BodyText"/>
+      </w:pPr>
+      <w:r>
+        <w:t xml:space="preserve">One further result, and a correction. In the no-synergy limit — no idiosyncratic person-by-canton match quality, every household ranking the cantons alike — four-adult households fall to rank 17.5 under at-least-one, below the lottery’s 13.5, with 44% in their own worst quartile. That was the headline of an earlier version of this analysis. It does not survive calibration, for the reason given in Section 4.4: when all households want the same cantons, being deprioritised means receiving the cantons nobody wanted, which is a property of the degeneracy rather than of the objective. The grid in the replication code locates where the crossing goes. At three tenths of the calibrated synergy the four-adult household’s excess over the lottery has already fallen from 4.1 ranks to −0.2 on the first yardstick and to 0.7 on the second; at the calibration it is −5.8 and −1.9, and at twice the calibration −6.7 and −2.3. The gradient reported above is what survives at every point on that grid, which makes this a vertical-equity finding and not an absolute one.</w:t>
+      </w:r>
+    </w:p>
+    <w:bookmarkEnd w:id="15"/>
+    <w:bookmarkStart w:id="16" w:name="a-note-on-the-simulated-data"/>
     <w:p>
       <w:pPr>
         <w:pStyle w:val="Heading3"/>
       </w:pPr>
       <w:r>
-        <w:t xml:space="preserve">A Note on the Simulated Data</w:t>
+        <w:t xml:space="preserve">4.4 A Note on the Simulated Data</w:t>
       </w:r>
     </w:p>
     <w:p>
@@ -1812,12 +2651,73 @@
         <w:pStyle w:val="FirstParagraph"/>
       </w:pPr>
       <w:r>
-        <w:t xml:space="preserve">These figures are illustrative, not estimates of the pilot’s effects. Only two inputs are real: the gender employment gap and the cantonal capacity key. The cantonal main effect, the canton-by-gender interaction, the household-size mix and the functional form — an additive logit rather than the location-specific gradient-boosted trees GeoMatch fits — all stand in for a model I cannot estimate, since no individual-level ZEMIS data is public; the Monte Carlo over parameter draws and the sensitivity analysis exist so that no conclusion rests on one such choice. One structural limit matters: individual heterogeneity enters only as a shift constant across cantons, so everyone of a given gender ranks the cantons identically, and the simulation can establish that a class of households is treated differently but not that one woman is disadvantaged relative to another. None of this bears on Section 3, which is a property of the formula established without simulated data at all; the simulation shows only that its consequences are large at plausible parameter values rather than negligible.</w:t>
-      </w:r>
-    </w:p>
-    <w:bookmarkEnd w:id="15"/>
+        <w:t xml:space="preserve">Three inputs are real — the gender gap, the capacity key, and the published employment gain the person-by-canton term is fitted to — and the rest is stylised: cantonal effects, the interaction, the size mix, and an additive logit in place of location-specific gradient-boosted trees, none of which I can estimate, since no individual-level ZEMIS data is public. The figures are therefore illustrative of the mechanism at plausible parameter values, not estimates of what the SEM pilot did.</w:t>
+      </w:r>
+    </w:p>
+    <w:p>
+      <w:pPr>
+        <w:pStyle w:val="BodyText"/>
+      </w:pPr>
+      <w:r>
+        <w:t xml:space="preserve">One limit deserves recording rather than burying, because an earlier version of this analysis omitted the person-by-canton term altogether and drew a stronger conclusion from its absence. Without it every household ranks the cantons in nearly the same order, so a household the matching stage deprioritises does not merely lose its best option, it receives the options nobody wanted; large households then fell below the lottery, and I read that as a</w:t>
+      </w:r>
+      <w:r>
+        <w:t xml:space="preserve"> </w:t>
+      </w:r>
+      <w:r>
+        <w:rPr>
+          <w:i/>
+          <w:iCs/>
+        </w:rPr>
+        <w:t xml:space="preserve">primum non nocere</w:t>
+      </w:r>
+      <w:r>
+        <w:t xml:space="preserve"> </w:t>
+      </w:r>
+      <w:r>
+        <w:t xml:space="preserve">violation and as a conservative reading besides, on the thought that real synergies would give large households more to lose. The reasoning was wrong in sign. Restoring the term, the residual slots a deprioritised household receives are no longer systematically bad</w:t>
+      </w:r>
+      <w:r>
+        <w:t xml:space="preserve"> </w:t>
+      </w:r>
+      <w:r>
+        <w:rPr>
+          <w:i/>
+          <w:iCs/>
+        </w:rPr>
+        <w:t xml:space="preserve">for it</w:t>
+      </w:r>
+      <w:r>
+        <w:t xml:space="preserve">, and the crossing disappears (Section 4.3). What the omission inflated was the absolute claim; what survives it unchanged is the size gradient and everything in Section 4.2. That is the order of the argument now, and the grid over the term’s magnitude is reported so the reader can see which claim lives where.</w:t>
+      </w:r>
+    </w:p>
+    <w:p>
+      <w:pPr>
+        <w:pStyle w:val="BodyText"/>
+      </w:pPr>
+      <w:r>
+        <w:t xml:space="preserve">Three limits remain, all pushing in knowable directions. The idiosyncratic term is drawn independently across members of a household, whereas real household members share location-specific factors — language region, diaspora, an existing contact — so the true within-household correlation is positive; the check on correlated</w:t>
+      </w:r>
+      <w:r>
+        <w:t xml:space="preserve"> </w:t>
+      </w:r>
+      <w:r>
+        <w:rPr>
+          <w:i/>
+          <w:iCs/>
+        </w:rPr>
+        <w:t xml:space="preserve">individual</w:t>
+      </w:r>
+      <w:r>
+        <w:t xml:space="preserve"> </w:t>
+      </w:r>
+      <w:r>
+        <w:t xml:space="preserve">effects suggests this makes the objection stronger, not weaker, but it is not the same check. Gender is the only characteristic modelled, so the tool’s other predictors, which Alajak et al. (2026) put at the centre, do not appear. And the lottery baseline is the statutory key alone, while the real status quo also honours constraints the simulation ignores, so it flatters neither the algorithm nor the comparison in any direction I can sign. None of this bears on Section 3, which is a property of the formula established without simulated data at all.</w:t>
+      </w:r>
+    </w:p>
     <w:bookmarkEnd w:id="16"/>
-    <w:bookmarkStart w:id="17" w:name="against-the-programmes-own-benchmark"/>
+    <w:bookmarkEnd w:id="17"/>
+    <w:bookmarkStart w:id="18" w:name="against-the-programmes-own-benchmark"/>
     <w:p>
       <w:pPr>
         <w:pStyle w:val="Heading2"/>
@@ -1831,47 +2731,63 @@
         <w:pStyle w:val="FirstParagraph"/>
       </w:pPr>
       <w:r>
-        <w:t xml:space="preserve">Sections 3 and 4 measured the objective against its own stated goal and against the status quo, not against the field’s standard fairness criteria. Checked directly, none of the three fits, and the reasons are instructive rather than evasive. Individual fairness (Dwork et al. 2012) requires similar individuals to receive similar outcomes; under deterministic assignment with hard capacity, two identical individuals must receive different cantons once the last slot fills — a structural fact about scarce indivisible goods, not a GeoMatch defect, and recoverable only by randomising the assignment, which GeoMatch by design does not do. Statistical parity fails differently: cantons are not ranked treatments, since a canton good for one profile can be poor for another — the entire premise of exploiting synergies — so equalising assignment rates is not obviously desirable, and Dwork et al.’s own objection, that parity permits compensating unfairness across subgroups, applies in full. Equalised odds (Hardt et al. 2016) presupposes a binary decision that a twenty-six-way allocation does not have.</w:t>
-      </w:r>
-    </w:p>
-    <w:p>
-      <w:pPr>
-        <w:pStyle w:val="BodyText"/>
-      </w:pPr>
-      <w:r>
-        <w:t xml:space="preserve">What does fit is the comparative criterion Freund et al. (2023) formalise: is each group’s average outcome under optimisation at least as good as under the status quo? What recommends it here is not that it is easy to satisfy, but that accepting it requires no philosophical commitment. It needs no contested similarity metric, and its baseline is not one I have selected: Article 21 of the Asylum Ordinance 1 makes the characteristics-blind proportional key the legal default, and the Swiss pilot is a randomised trial evaluating the algorithm against that very key.</w:t>
-      </w:r>
-      <w:r>
-        <w:t xml:space="preserve"> </w:t>
-      </w:r>
-      <w:r>
-        <w:t xml:space="preserve">“Is any group left worse off than under the legal default?”</w:t>
-      </w:r>
-      <w:r>
-        <w:t xml:space="preserve"> </w:t>
-      </w:r>
-      <w:r>
-        <w:t xml:space="preserve">is therefore the question the institution poses through its own study design, not an external standard imported to embarrass it. It is also, precisely, the question Section 4 showed the deployed objective failing twice — on the within-household gap and on household size — against the comparator its own trial was built around.</w:t>
-      </w:r>
-    </w:p>
-    <w:p>
-      <w:pPr>
-        <w:pStyle w:val="BodyText"/>
-      </w:pPr>
-      <w:r>
-        <w:t xml:space="preserve">Neither failure is an unavoidable cost of fairness. Switching to mean removes both — it narrows the within-household gap rather than widening it, and it does not push large households below the lottery baseline — while raising expected employment, so the removal costs nothing. That is not a demonstration that mean satisfies the criterion in general: satisfying it requires that no group be worse off, and I have tested two group partitions, not all of them. The remaining bill is bounded, though, which is what makes Freund et al.’s figure useful here: a fairness constraint binding across all groups costs at most 2% of total employment on an assignment problem of this kind. Zero for the violations documented here, at most 2% for full group fairness — between those two numbers, no cost-based defence of the deployed rule survives. And the repair would belong exactly where Kleinberg et al. (2018) argue an equity preference belongs, in the decision rule rather than the estimator: GeoMatch’s mapping stage, which is also the one stage its designers never discuss.</w:t>
-      </w:r>
-    </w:p>
-    <w:p>
-      <w:pPr>
-        <w:pStyle w:val="BodyText"/>
-      </w:pPr>
-      <w:r>
-        <w:t xml:space="preserve">None of this makes the mean correct — distribution-neutrality is a choice too. If the goal is household self-sufficiency, the honest implementation is an explicit threshold on the number of earners; if individual employment, use the mean; if protecting the least employable member, use the minimum and accept the roughly quarter of the achievable gain Bansak et al.’s backtest shows it costs. Each is defensible; none is defensible silently. Rawls’s (1958) requirement that an inequality be justifiable to those it disadvantages does not demand that this inequality be abolished, but it does demand that someone state it and argue for it. The objection is not to the choice made but to its being made invisibly, inside a helper function, under a description that does not match it.</w:t>
-      </w:r>
-    </w:p>
-    <w:bookmarkEnd w:id="17"/>
-    <w:bookmarkStart w:id="18" w:name="conclusion"/>
+        <w:t xml:space="preserve">Sections 3 and 4 measured the objective against its own stated goal and against the status quo rather than the field’s standard criteria, none of which fits: individual fairness (Dwork et al. 2012) is unattainable for any deterministic assignment under hard capacity, since two identical individuals must receive different cantons once the last slot fills; equalised odds (Hardt et al. 2016) presupposes a binary decision; and statistical parity would forbid exactly the synergies the tool exists to exploit.</w:t>
+      </w:r>
+    </w:p>
+    <w:p>
+      <w:pPr>
+        <w:pStyle w:val="BodyText"/>
+      </w:pPr>
+      <w:r>
+        <w:t xml:space="preserve">What does fit is the criterion Freund et al. (2023) formalise as the Random fairness rule: is each group’s average outcome under optimisation at least as good as its expectation under random assignment? It needs no contested similarity metric, and its baseline is not one I have selected: Article 21 of the Asylum Ordinance 1 makes the characteristics-blind proportional key the legal default, and the Swiss pilot is a randomised trial evaluating the algorithm against that key.</w:t>
+      </w:r>
+      <w:r>
+        <w:t xml:space="preserve"> </w:t>
+      </w:r>
+      <w:r>
+        <w:t xml:space="preserve">“Is any group left worse off than the legal default?”</w:t>
+      </w:r>
+      <w:r>
+        <w:t xml:space="preserve"> </w:t>
+      </w:r>
+      <w:r>
+        <w:t xml:space="preserve">is the question the institution poses through its own study design, not an external standard imported to embarrass it.</w:t>
+      </w:r>
+    </w:p>
+    <w:p>
+      <w:pPr>
+        <w:pStyle w:val="BodyText"/>
+      </w:pPr>
+      <w:r>
+        <w:t xml:space="preserve">Section 4 ran that test on the two partitions available to me, and the deployed objective passes both. Women do better under at-least-one than under the legal default, and so does every household size: at the calibrated specification even four-adult households receive cantons they themselves rank well above the lottery’s midpoint. The violation appears only in the degenerate limit in which no household has idiosyncratic reasons to prefer one canton to another, and that limit also implies a gain for the deployed rule of 1.4% against the 41% it is documented to deliver, so it is not a description of the problem GeoMatch solves. The conclusion has to be stated the other way round from the one I expected: on the institution’s own benchmark the objective does no group in my two partitions an absolute harm.</w:t>
+      </w:r>
+    </w:p>
+    <w:p>
+      <w:pPr>
+        <w:pStyle w:val="BodyText"/>
+      </w:pPr>
+      <w:r>
+        <w:t xml:space="preserve">That is a real limit on how much the Random fairness rule can be asked to do. It is a floor, and a floor is silent about the distribution of whatever lies above it. Section 4’s size gradient — a fivefold difference in received rank between one- and four-adult households, where the mean rule’s is well under twofold — is entirely inside the region the criterion licenses, and so is the finding that the gain is spent on the member who needed it least. A criterion that asks only whether anyone was left worse off than under a lottery cannot distinguish an optimiser that shares its gains from one that concentrates them, which is why vertical equity (Black et al. 2022) has to be carried alongside it rather than reduced to it.</w:t>
+      </w:r>
+    </w:p>
+    <w:p>
+      <w:pPr>
+        <w:pStyle w:val="BodyText"/>
+      </w:pPr>
+      <w:r>
+        <w:t xml:space="preserve">Neither objection points to an unavoidable cost of fairness. Switching to the mean answers both — narrowing the within-household gap rather than widening it, and flattening the size gradient to a fifth of its slope — while raising the employment gain from 39% to 47%, so the repair costs nothing. That is not a demonstration that the mean satisfies the criterion in general: I have tested two group partitions, not all of them. The remaining bill is bounded, which is what makes Freund et al.’s figure useful: in their study, binding group-fairness requirements cost at most 2% of total employment relative to the unconstrained algorithm, on U.S. and Dutch data with groups defined by origin, age or education. That is a dynamic setting rather than the static assignment simulated here, so it indicates an order of magnitude rather than transferring as a bound. Zero for what is documented here, a few per cent for group fairness in general: between those numbers no cost-based defence survives. And the repair belongs where Kleinberg et al. (2018) argue an equity preference belongs, in the decision rule rather than the estimator — GeoMatch’s mapping stage.</w:t>
+      </w:r>
+    </w:p>
+    <w:p>
+      <w:pPr>
+        <w:pStyle w:val="BodyText"/>
+      </w:pPr>
+      <w:r>
+        <w:t xml:space="preserve">None of this makes the mean correct — distribution-neutrality is a choice too, and Section 4 shows the sum is not neutral either, only biased the other way where each person counts once, and roughly size-neutral where the weakest member counts. If the goal is household self-sufficiency, the honest implementation is an explicit threshold on the number of earners; if total employment, the sum, as Annie MOORE uses; if employment per person, the mean; if protecting the least employable member, the minimum, at the cost Bansak et al.’s backtest already reports. Each is defensible; none is defensible silently. Rawls’s (1958) requirement that an inequality be justifiable to those it disadvantages does not demand that this one be abolished, but it does demand that someone state it and argue for it.</w:t>
+      </w:r>
+    </w:p>
+    <w:bookmarkEnd w:id="18"/>
+    <w:bookmarkStart w:id="19" w:name="conclusion"/>
     <w:p>
       <w:pPr>
         <w:pStyle w:val="Heading2"/>
@@ -1885,15 +2801,15 @@
         <w:pStyle w:val="FirstParagraph"/>
       </w:pPr>
       <w:r>
-        <w:t xml:space="preserve">GeoMatch is a genuine advance over a lottery, and the case for algorithmic assignment in this domain is strong. The argument here is narrower and, I think, harder to dismiss for being narrow: the objective function deployed is not the one the tool is defended in terms of, it is dominated on the very metric it claims to maximise, it is biased against equality within households in a formally demonstrable way, it deprioritises large households for reasons internal to its algebra, and on both counts it leaves those it disadvantages worse off than the characteristics-blind key it is measured against. Its designers justify it by reference to household self-sufficiency, a fiscal objective belonging to the host state, and neither they nor their critics have treated that substitution as requiring an argument.</w:t>
-      </w:r>
-    </w:p>
-    <w:p>
-      <w:pPr>
-        <w:pStyle w:val="BodyText"/>
-      </w:pPr>
-      <w:r>
-        <w:t xml:space="preserve">The practical implication is small and specific: report the mapping function, justify it, and publish the distributional consequences of the alternatives, which the designers have already computed. The theoretical implication is larger. Bennett and Keyes (2020) argue that fairness metrics can crowd out the prior question of what a system is for; here that question was not crowded out by metrics but disappeared into an implementation detail nobody read as normative. Bansak et al. did check the aggregate cost of their own default and disclosed it candidly, in a comparison buried in supplementary materials that was never foregrounded in the tool’s public defence and never picked up by critics looking at the training data rather than the aggregation stage. What nobody checked is who absorbs that cost inside the household, or how it falls across household sizes. The most consequential normative decision in a system that has shaped the lives of asylum seekers across three countries since 2020 sits in a four-line helper function: disclosed, but never argued for, and never connected to the fairness debate it went on to trigger.</w:t>
+        <w:t xml:space="preserve">GeoMatch is a genuine advance over a lottery, and the case for algorithmic assignment here is strong: at the specification calibrated to its own published gain, every group I can define does better under it than under the legal default. The argument of this paper is narrower and survives that concession intact. The deployed objective is not the one the tool is defended in terms of; it is dominated on the very metric it claims to maximise; it is biased against equality within households in a formally demonstrable way; and it distributes the gain from optimisation in inverse proportion to household size, for reasons internal to its algebra rather than to anyone’s need. Its designers justify it by household self-sufficiency, a fiscal objective of the host state, and neither they nor their critics have treated that substitution as needing an argument.</w:t>
+      </w:r>
+    </w:p>
+    <w:p>
+      <w:pPr>
+        <w:pStyle w:val="BodyText"/>
+      </w:pPr>
+      <w:r>
+        <w:t xml:space="preserve">The practical implication is small and specific: report the mapping function, justify it, and publish the distributional consequences of the alternatives, which the designers have already computed. Bennett and Keyes (2020) argue that fairness metrics can crowd out the prior question of what a system is for; here that question was not crowded out by metrics but disappeared into an implementation detail nobody read as normative. Bansak et al. did check the aggregate cost of their default and disclosed it candidly, in supplementary materials never foregrounded in the tool’s public defence, and the mapping functions of both deployed tools have since been tabulated side by side (Strasser Ceballos and Kern 2025) without anyone asking why they differ. What nobody checked is who absorbs that cost inside the household, and how it falls across sizes. The most consequential normative decision in a system that has shaped the lives of asylum seekers across three countries since 2020 sits in a four-line helper function: disclosed, but never argued for.</w:t>
       </w:r>
     </w:p>
     <w:p>
@@ -1903,8 +2819,8 @@
         </w:pict>
       </w:r>
     </w:p>
-    <w:bookmarkEnd w:id="18"/>
-    <w:bookmarkStart w:id="19" w:name="references"/>
+    <w:bookmarkEnd w:id="19"/>
+    <w:bookmarkStart w:id="20" w:name="references"/>
     <w:p>
       <w:pPr>
         <w:pStyle w:val="Heading2"/>
@@ -1939,7 +2855,19 @@
         <w:pStyle w:val="BodyText"/>
       </w:pPr>
       <w:r>
-        <w:t xml:space="preserve">Alajak, K., Burnazoglu, M., Leurs, K., &amp; van Schie, G. (2026). GeoMatch/MisMatch: A critical investigation of a refugee resettlement and labour market integration algorithm in the Netherlands.</w:t>
+        <w:t xml:space="preserve">Agarwal, B. (1997).</w:t>
+      </w:r>
+      <w:r>
+        <w:t xml:space="preserve"> </w:t>
+      </w:r>
+      <w:r>
+        <w:t xml:space="preserve">“Bargaining”</w:t>
+      </w:r>
+      <w:r>
+        <w:t xml:space="preserve"> </w:t>
+      </w:r>
+      <w:r>
+        <w:t xml:space="preserve">and gender relations: Within and beyond the household.</w:t>
       </w:r>
       <w:r>
         <w:t xml:space="preserve"> </w:t>
@@ -1949,26 +2877,18 @@
           <w:i/>
           <w:iCs/>
         </w:rPr>
-        <w:t xml:space="preserve">Social Inclusion</w:t>
-      </w:r>
-      <w:r>
-        <w:t xml:space="preserve">, 14, Article 10923.</w:t>
-      </w:r>
-    </w:p>
-    <w:p>
-      <w:pPr>
-        <w:pStyle w:val="BodyText"/>
-      </w:pPr>
-      <w:r>
-        <w:t xml:space="preserve">Asylverordnung 1 über Verfahrensfragen (AsylV 1) of 11 August 1999, SR 142.311, Art. 21, Annex 3.</w:t>
-      </w:r>
-    </w:p>
-    <w:p>
-      <w:pPr>
-        <w:pStyle w:val="BodyText"/>
-      </w:pPr>
-      <w:r>
-        <w:t xml:space="preserve">Bansak, K., Ferwerda, J., Hainmueller, J., Dillon, A., Hangartner, D., Lawrence, D., &amp; Weinstein, J. (2018). Improving refugee integration through data-driven algorithmic assignment.</w:t>
+        <w:t xml:space="preserve">Feminist Economics</w:t>
+      </w:r>
+      <w:r>
+        <w:t xml:space="preserve">, 3(1), 1–51.</w:t>
+      </w:r>
+    </w:p>
+    <w:p>
+      <w:pPr>
+        <w:pStyle w:val="BodyText"/>
+      </w:pPr>
+      <w:r>
+        <w:t xml:space="preserve">Ahani, N., Andersson, T., Martinello, A., Teytelboym, A., &amp; Trapp, A. C. (2021). Placement optimization in refugee resettlement.</w:t>
       </w:r>
       <w:r>
         <w:t xml:space="preserve"> </w:t>
@@ -1978,18 +2898,18 @@
           <w:i/>
           <w:iCs/>
         </w:rPr>
-        <w:t xml:space="preserve">Science</w:t>
-      </w:r>
-      <w:r>
-        <w:t xml:space="preserve">, 359(6373), 325–329, Supplementary Materials, and replication data (Harvard Dataverse, doi:10.7910/DVN/MS8XES).</w:t>
-      </w:r>
-    </w:p>
-    <w:p>
-      <w:pPr>
-        <w:pStyle w:val="BodyText"/>
-      </w:pPr>
-      <w:r>
-        <w:t xml:space="preserve">Bennett, C. L., &amp; Keyes, O. (2020). What is the point of fairness?</w:t>
+        <w:t xml:space="preserve">Operations Research</w:t>
+      </w:r>
+      <w:r>
+        <w:t xml:space="preserve">, 69(5), 1468–1486.</w:t>
+      </w:r>
+    </w:p>
+    <w:p>
+      <w:pPr>
+        <w:pStyle w:val="BodyText"/>
+      </w:pPr>
+      <w:r>
+        <w:t xml:space="preserve">Alajak, K., Burnazoglu, M., Leurs, K., &amp; van Schie, G. (2026). GeoMatch/MisMatch: A critical investigation of a refugee resettlement and labour market integration algorithm in the Netherlands.</w:t>
       </w:r>
       <w:r>
         <w:t xml:space="preserve"> </w:t>
@@ -1999,18 +2919,26 @@
           <w:i/>
           <w:iCs/>
         </w:rPr>
-        <w:t xml:space="preserve">Interactions</w:t>
-      </w:r>
-      <w:r>
-        <w:t xml:space="preserve">, 27(3), 35–39.</w:t>
-      </w:r>
-    </w:p>
-    <w:p>
-      <w:pPr>
-        <w:pStyle w:val="BodyText"/>
-      </w:pPr>
-      <w:r>
-        <w:t xml:space="preserve">Black, E., Elzayn, H., Chouldechova, A., Goldin, J., &amp; Ho, D. (2022). Algorithmic fairness and vertical equity: Income fairness with IRS tax audit models.</w:t>
+        <w:t xml:space="preserve">Social Inclusion</w:t>
+      </w:r>
+      <w:r>
+        <w:t xml:space="preserve">, 14, Article 10923.</w:t>
+      </w:r>
+    </w:p>
+    <w:p>
+      <w:pPr>
+        <w:pStyle w:val="BodyText"/>
+      </w:pPr>
+      <w:r>
+        <w:t xml:space="preserve">Asylverordnung 1 über Verfahrensfragen (AsylV 1) of 11 August 1999, SR 142.311, Art. 21, Annex 3.</w:t>
+      </w:r>
+    </w:p>
+    <w:p>
+      <w:pPr>
+        <w:pStyle w:val="BodyText"/>
+      </w:pPr>
+      <w:r>
+        <w:t xml:space="preserve">Bansak, K., Ferwerda, J., Hainmueller, J., Dillon, A., Hangartner, D., Lawrence, D., &amp; Weinstein, J. (2018). Improving refugee integration through data-driven algorithmic assignment.</w:t>
       </w:r>
       <w:r>
         <w:t xml:space="preserve"> </w:t>
@@ -2020,18 +2948,18 @@
           <w:i/>
           <w:iCs/>
         </w:rPr>
-        <w:t xml:space="preserve">FAccT ’22</w:t>
-      </w:r>
-      <w:r>
-        <w:t xml:space="preserve">, 1479–1503.</w:t>
-      </w:r>
-    </w:p>
-    <w:p>
-      <w:pPr>
-        <w:pStyle w:val="BodyText"/>
-      </w:pPr>
-      <w:r>
-        <w:t xml:space="preserve">Corbett-Davies, S., Pierson, E., Feller, A., Goel, S., &amp; Huq, A. (2017). Algorithmic decision making and the cost of fairness.</w:t>
+        <w:t xml:space="preserve">Science</w:t>
+      </w:r>
+      <w:r>
+        <w:t xml:space="preserve">, 359(6373), 325–329, Supplementary Materials, and replication data (Harvard Dataverse, doi:10.7910/DVN/MS8XES).</w:t>
+      </w:r>
+    </w:p>
+    <w:p>
+      <w:pPr>
+        <w:pStyle w:val="BodyText"/>
+      </w:pPr>
+      <w:r>
+        <w:t xml:space="preserve">Bennett, C. L., &amp; Keyes, O. (2020). What is the point of fairness?</w:t>
       </w:r>
       <w:r>
         <w:t xml:space="preserve"> </w:t>
@@ -2041,18 +2969,18 @@
           <w:i/>
           <w:iCs/>
         </w:rPr>
-        <w:t xml:space="preserve">KDD ’17</w:t>
-      </w:r>
-      <w:r>
-        <w:t xml:space="preserve">, 797–806.</w:t>
-      </w:r>
-    </w:p>
-    <w:p>
-      <w:pPr>
-        <w:pStyle w:val="BodyText"/>
-      </w:pPr>
-      <w:r>
-        <w:t xml:space="preserve">Dwork, C., Hardt, M., Pitassi, T., Reingold, O., &amp; Zemel, R. (2012). Fairness through awareness.</w:t>
+        <w:t xml:space="preserve">Interactions</w:t>
+      </w:r>
+      <w:r>
+        <w:t xml:space="preserve">, 27(3), 35–39.</w:t>
+      </w:r>
+    </w:p>
+    <w:p>
+      <w:pPr>
+        <w:pStyle w:val="BodyText"/>
+      </w:pPr>
+      <w:r>
+        <w:t xml:space="preserve">Black, E., Elzayn, H., Chouldechova, A., Goldin, J., &amp; Ho, D. (2022). Algorithmic fairness and vertical equity: Income fairness with IRS tax audit models.</w:t>
       </w:r>
       <w:r>
         <w:t xml:space="preserve"> </w:t>
@@ -2062,26 +2990,18 @@
           <w:i/>
           <w:iCs/>
         </w:rPr>
-        <w:t xml:space="preserve">ITCS ’12</w:t>
-      </w:r>
-      <w:r>
-        <w:t xml:space="preserve">, 214–226.</w:t>
-      </w:r>
-    </w:p>
-    <w:p>
-      <w:pPr>
-        <w:pStyle w:val="BodyText"/>
-      </w:pPr>
-      <w:r>
-        <w:t xml:space="preserve">Freund, D., Lykouris, T., Paulson, E., Sturt, B., &amp; Weng, W. (2023). Group fairness in dynamic refugee assignment. arXiv:2301.10642.</w:t>
-      </w:r>
-    </w:p>
-    <w:p>
-      <w:pPr>
-        <w:pStyle w:val="BodyText"/>
-      </w:pPr>
-      <w:r>
-        <w:t xml:space="preserve">Hardt, M., Price, E., &amp; Srebro, N. (2016). Equality of opportunity in supervised learning.</w:t>
+        <w:t xml:space="preserve">FAccT ’22</w:t>
+      </w:r>
+      <w:r>
+        <w:t xml:space="preserve">, 1479–1503.</w:t>
+      </w:r>
+    </w:p>
+    <w:p>
+      <w:pPr>
+        <w:pStyle w:val="BodyText"/>
+      </w:pPr>
+      <w:r>
+        <w:t xml:space="preserve">Corbett-Davies, S., Pierson, E., Feller, A., Goel, S., &amp; Huq, A. (2017). Algorithmic decision making and the cost of fairness.</w:t>
       </w:r>
       <w:r>
         <w:t xml:space="preserve"> </w:t>
@@ -2091,18 +3011,18 @@
           <w:i/>
           <w:iCs/>
         </w:rPr>
-        <w:t xml:space="preserve">NIPS ’16</w:t>
-      </w:r>
-      <w:r>
-        <w:t xml:space="preserve">.</w:t>
-      </w:r>
-    </w:p>
-    <w:p>
-      <w:pPr>
-        <w:pStyle w:val="BodyText"/>
-      </w:pPr>
-      <w:r>
-        <w:t xml:space="preserve">Kleinberg, J., Ludwig, J., Mullainathan, S., &amp; Rambachan, A. (2018). Algorithmic fairness.</w:t>
+        <w:t xml:space="preserve">KDD ’17</w:t>
+      </w:r>
+      <w:r>
+        <w:t xml:space="preserve">, 797–806.</w:t>
+      </w:r>
+    </w:p>
+    <w:p>
+      <w:pPr>
+        <w:pStyle w:val="BodyText"/>
+      </w:pPr>
+      <w:r>
+        <w:t xml:space="preserve">Dwork, C., Hardt, M., Pitassi, T., Reingold, O., &amp; Zemel, R. (2012). Fairness through awareness.</w:t>
       </w:r>
       <w:r>
         <w:t xml:space="preserve"> </w:t>
@@ -2112,18 +3032,26 @@
           <w:i/>
           <w:iCs/>
         </w:rPr>
-        <w:t xml:space="preserve">AEA Papers and Proceedings</w:t>
-      </w:r>
-      <w:r>
-        <w:t xml:space="preserve">, 108, 22–27.</w:t>
-      </w:r>
-    </w:p>
-    <w:p>
-      <w:pPr>
-        <w:pStyle w:val="BodyText"/>
-      </w:pPr>
-      <w:r>
-        <w:t xml:space="preserve">Rawls, J. (1958). Justice as fairness.</w:t>
+        <w:t xml:space="preserve">ITCS ’12</w:t>
+      </w:r>
+      <w:r>
+        <w:t xml:space="preserve">, 214–226.</w:t>
+      </w:r>
+    </w:p>
+    <w:p>
+      <w:pPr>
+        <w:pStyle w:val="BodyText"/>
+      </w:pPr>
+      <w:r>
+        <w:t xml:space="preserve">Freund, D., Lykouris, T., Paulson, E., Sturt, B., &amp; Weng, W. (2023). Group fairness in dynamic refugee assignment. arXiv:2301.10642.</w:t>
+      </w:r>
+    </w:p>
+    <w:p>
+      <w:pPr>
+        <w:pStyle w:val="BodyText"/>
+      </w:pPr>
+      <w:r>
+        <w:t xml:space="preserve">Hardt, M., Price, E., &amp; Srebro, N. (2016). Equality of opportunity in supervised learning.</w:t>
       </w:r>
       <w:r>
         <w:t xml:space="preserve"> </w:t>
@@ -2133,26 +3061,18 @@
           <w:i/>
           <w:iCs/>
         </w:rPr>
-        <w:t xml:space="preserve">The Philosophical Review</w:t>
-      </w:r>
-      <w:r>
-        <w:t xml:space="preserve">, 67(2), 164–194.</w:t>
-      </w:r>
-    </w:p>
-    <w:p>
-      <w:pPr>
-        <w:pStyle w:val="BodyText"/>
-      </w:pPr>
-      <w:r>
-        <w:t xml:space="preserve">Staatssekretariat für Migration (2026). Erwerbssituation von vorläufig Aufgenommenen und Flüchtlingen: Einreisekohorte 2018.</w:t>
-      </w:r>
-    </w:p>
-    <w:p>
-      <w:pPr>
-        <w:pStyle w:val="BodyText"/>
-      </w:pPr>
-      <w:r>
-        <w:t xml:space="preserve">Strasser Ceballos, C., &amp; Kern, C. (2025). Location matching on shaky grounds: Re-evaluating algorithms for refugee allocation.</w:t>
+        <w:t xml:space="preserve">NIPS ’16</w:t>
+      </w:r>
+      <w:r>
+        <w:t xml:space="preserve">.</w:t>
+      </w:r>
+    </w:p>
+    <w:p>
+      <w:pPr>
+        <w:pStyle w:val="BodyText"/>
+      </w:pPr>
+      <w:r>
+        <w:t xml:space="preserve">Kleinberg, J., Ludwig, J., Mullainathan, S., &amp; Rambachan, A. (2018). Algorithmic fairness.</w:t>
       </w:r>
       <w:r>
         <w:t xml:space="preserve"> </w:t>
@@ -2162,14 +3082,130 @@
           <w:i/>
           <w:iCs/>
         </w:rPr>
+        <w:t xml:space="preserve">AEA Papers and Proceedings</w:t>
+      </w:r>
+      <w:r>
+        <w:t xml:space="preserve">, 108, 22–27.</w:t>
+      </w:r>
+    </w:p>
+    <w:p>
+      <w:pPr>
+        <w:pStyle w:val="BodyText"/>
+      </w:pPr>
+      <w:r>
+        <w:t xml:space="preserve">Obermeyer, Z., Powers, B., Vogeli, C., &amp; Mullainathan, S. (2019). Dissecting racial bias in an algorithm used to manage the health of populations.</w:t>
+      </w:r>
+      <w:r>
+        <w:t xml:space="preserve"> </w:t>
+      </w:r>
+      <w:r>
+        <w:rPr>
+          <w:i/>
+          <w:iCs/>
+        </w:rPr>
+        <w:t xml:space="preserve">Science</w:t>
+      </w:r>
+      <w:r>
+        <w:t xml:space="preserve">, 366(6464), 447–453.</w:t>
+      </w:r>
+    </w:p>
+    <w:p>
+      <w:pPr>
+        <w:pStyle w:val="BodyText"/>
+      </w:pPr>
+      <w:r>
+        <w:t xml:space="preserve">Passi, S., &amp; Barocas, S. (2019). Problem formulation and fairness.</w:t>
+      </w:r>
+      <w:r>
+        <w:t xml:space="preserve"> </w:t>
+      </w:r>
+      <w:r>
+        <w:rPr>
+          <w:i/>
+          <w:iCs/>
+        </w:rPr>
+        <w:t xml:space="preserve">FAT* ’19</w:t>
+      </w:r>
+      <w:r>
+        <w:t xml:space="preserve">, 39–48.</w:t>
+      </w:r>
+    </w:p>
+    <w:p>
+      <w:pPr>
+        <w:pStyle w:val="BodyText"/>
+      </w:pPr>
+      <w:r>
+        <w:t xml:space="preserve">Rawls, J. (1958). Justice as fairness.</w:t>
+      </w:r>
+      <w:r>
+        <w:t xml:space="preserve"> </w:t>
+      </w:r>
+      <w:r>
+        <w:rPr>
+          <w:i/>
+          <w:iCs/>
+        </w:rPr>
+        <w:t xml:space="preserve">The Philosophical Review</w:t>
+      </w:r>
+      <w:r>
+        <w:t xml:space="preserve">, 67(2), 164–194.</w:t>
+      </w:r>
+    </w:p>
+    <w:p>
+      <w:pPr>
+        <w:pStyle w:val="BodyText"/>
+      </w:pPr>
+      <w:r>
+        <w:t xml:space="preserve">Sen, A. (1990). Gender and cooperative conflicts. In I. Tinker (Ed.),</w:t>
+      </w:r>
+      <w:r>
+        <w:t xml:space="preserve"> </w:t>
+      </w:r>
+      <w:r>
+        <w:rPr>
+          <w:i/>
+          <w:iCs/>
+        </w:rPr>
+        <w:t xml:space="preserve">Persistent Inequalities: Women and World Development</w:t>
+      </w:r>
+      <w:r>
+        <w:t xml:space="preserve"> </w:t>
+      </w:r>
+      <w:r>
+        <w:t xml:space="preserve">(pp. 123–149). Oxford University Press.</w:t>
+      </w:r>
+    </w:p>
+    <w:p>
+      <w:pPr>
+        <w:pStyle w:val="BodyText"/>
+      </w:pPr>
+      <w:r>
+        <w:t xml:space="preserve">Staatssekretariat für Migration (2026). Erwerbssituation von vorläufig Aufgenommenen und Flüchtlingen: Einreisekohorte 2018.</w:t>
+      </w:r>
+    </w:p>
+    <w:p>
+      <w:pPr>
+        <w:pStyle w:val="BodyText"/>
+      </w:pPr>
+      <w:r>
+        <w:t xml:space="preserve">Strasser Ceballos, C., &amp; Kern, C. (2025). Location matching on shaky grounds: Re-evaluating algorithms for refugee allocation.</w:t>
+      </w:r>
+      <w:r>
+        <w:t xml:space="preserve"> </w:t>
+      </w:r>
+      <w:r>
+        <w:rPr>
+          <w:i/>
+          <w:iCs/>
+        </w:rPr>
         <w:t xml:space="preserve">FAccT ’25</w:t>
       </w:r>
       <w:r>
         <w:t xml:space="preserve">.</w:t>
       </w:r>
     </w:p>
-    <w:bookmarkEnd w:id="19"/>
     <w:bookmarkEnd w:id="20"/>
+    <w:bookmarkEnd w:id="21"/>
     <w:sectPr>
       <w:footnotePr>
         <w:numRestart w:val="eachSect"/>

</xml_diff>

<commit_message>
Shorten and streamline paper to fit length target
Co-authored-by: Cursor <cursoragent@cursor.com>
</commit_message>
<xml_diff>
--- a/paper/Weide_FairnessAndAlgorithms_2026.docx
+++ b/paper/Weide_FairnessAndAlgorithms_2026.docx
@@ -2,7 +2,7 @@
 <file path=word/document.xml><?xml version="1.0" encoding="utf-8"?>
 <w:document xmlns:w="http://schemas.openxmlformats.org/wordprocessingml/2006/main" xmlns:m="http://schemas.openxmlformats.org/officeDocument/2006/math" xmlns:r="http://schemas.openxmlformats.org/officeDocument/2006/relationships" xmlns:o="urn:schemas-microsoft-com:office:office" xmlns:v="urn:schemas-microsoft-com:vml" xmlns:w10="urn:schemas-microsoft-com:office:word" xmlns:a="http://schemas.openxmlformats.org/drawingml/2006/main" xmlns:pic="http://schemas.openxmlformats.org/drawingml/2006/picture" xmlns:wp="http://schemas.openxmlformats.org/drawingml/2006/wordprocessingDrawing">
   <w:body>
-    <w:bookmarkStart w:id="21" w:name="X4a697ab4bb662e0280030a591d44dc933e99b38"/>
+    <w:bookmarkStart w:id="20" w:name="X4a697ab4bb662e0280030a591d44dc933e99b38"/>
     <w:p>
       <w:pPr>
         <w:pStyle w:val="Heading1"/>
@@ -69,7 +69,7 @@
         <w:pStyle w:val="FirstParagraph"/>
       </w:pPr>
       <w:r>
-        <w:t xml:space="preserve">Debates about algorithmic fairness are usually organised around a trade-off: more accuracy or more equity, but not both, and the question is where along the frontier to sit. Corbett-Davies et al. (2017) give the canonical formulation, and critics of algorithmic refugee assignment have adopted the same grammar, reading these tools’ efficiency as something purchased at the price of equity (Alajak et al. 2026).</w:t>
+        <w:t xml:space="preserve">Debates about algorithmic fairness are usually organised around a trade-off: accuracy or equity, but not both, and the question is where along the frontier to sit. Corbett-Davies et al. (2017) give the canonical formulation, and critics of algorithmic refugee assignment have adopted the same grammar, reading these tools’ efficiency as purchased at the price of equity (Alajak et al. 2026).</w:t>
       </w:r>
     </w:p>
     <w:p>
@@ -77,7 +77,7 @@
         <w:pStyle w:val="BodyText"/>
       </w:pPr>
       <w:r>
-        <w:t xml:space="preserve">The grammar is wrong for this case, and getting it wrong has concealed something more troubling than a hard trade-off. GeoMatch, developed by the Immigration Policy Lab at Stanford and ETH Zurich and piloted by the Swiss State Secretariat for Migration (SEM) since 2020, does not maximise employment. It maximises a household-level threshold: the probability that</w:t>
+        <w:t xml:space="preserve">The grammar is wrong for this case, and getting it wrong has concealed something worse than a hard trade-off. GeoMatch, developed at Stanford and ETH Zurich’s Immigration Policy Lab and piloted by the Swiss State Secretariat for Migration (SEM) since 2020, does not maximise employment. It maximises a household-level threshold: the probability that</w:t>
       </w:r>
       <w:r>
         <w:t xml:space="preserve"> </w:t>
@@ -93,7 +93,7 @@
         <w:t xml:space="preserve"> </w:t>
       </w:r>
       <w:r>
-        <w:t xml:space="preserve">member of a refugee family finds work. Two consequences follow from the shape of that formula rather than from the data it is fed. It prefers concentrating employment prospects in one household member to spreading them evenly, regardless of which is better for the household; and it directs the benefits of optimisation away from large households, whose scores grow insensitive to location as they add members. The rule sacrifices both the aggregate quantity it is praised for maximising and the distribution its critics accuse it of ignoring.</w:t>
+        <w:t xml:space="preserve">member of a refugee family finds work. Two consequences follow from the shape of that formula, not from the data it is fed: it prefers concentrating employment prospects in one household member to spreading them evenly, and it directs the benefits of optimisation away from large households, whose scores grow insensitive to location as they add members. The rule sacrifices both the aggregate quantity it is praised for maximising and the distribution its critics accuse it of ignoring.</w:t>
       </w:r>
     </w:p>
     <w:p>
@@ -101,7 +101,7 @@
         <w:pStyle w:val="BodyText"/>
       </w:pPr>
       <w:r>
-        <w:t xml:space="preserve">The claim is not speculative. Bansak et al.’s own supplementary materials (fig. S8) report that replacing the at-least-one metric with the within-case mean raises the employment gain over the status quo from 41% to 47% in the U.S. backtest: the distribution-neutral alternative is more efficient. There is no frontier to sit on, and the designers do not claim there is; they justify the choice, as Section 2 shows, by the programme’s goal of generating self-sufficient refugee families. That answers the question in my title, if only by inference from their justification: the beneficiary is not the refugee whose employment probability the tool nominally maximises but the fiscal position of the host state, for which one earner suffices — a legitimate goal, but not the one the tool’s public case is built on, which is the employment gains it delivers to refugees.</w:t>
+        <w:t xml:space="preserve">The claim is not speculative. Bansak et al.’s own supplementary materials (fig. S8) report that replacing the at-least-one metric with the within-case mean raises the employment gain over the status quo from 41% to 47% in the U.S. backtest: the distribution-neutral alternative is more efficient. There is no frontier to sit on, and the designers do not claim there is; they justify the choice, as Section 2 shows, by the programme’s goal of household self-sufficiency. That answers the question in my title, if only by inference: the beneficiary is not the refugee whose employment probability the tool nominally maximises but the fiscal position of the host state, for which one earner suffices — a legitimate goal, but not the one the tool’s public case is built on.</w:t>
       </w:r>
     </w:p>
     <w:p>
@@ -109,7 +109,7 @@
         <w:pStyle w:val="BodyText"/>
       </w:pPr>
       <w:r>
-        <w:t xml:space="preserve">Two things this paper does not claim. It is not that the tool harms the people it assigns: at the specification calibrated to its own published gain, every group I can construct does better under GeoMatch than under the legal default, and Section 5 says so. And it is not that the mean is the right objective; it is that four candidates were available, their consequences differ by more than the amount at stake in most of the fairness literature’s usual trade-offs, and the choice among them was never argued. Section 4 calibrates the simulation to the pair of numbers just quoted — 41% under the deployed rule, 47% under its mean variant — so that the magnitudes reported there belong to the problem GeoMatch actually solves rather than to a convenient one.</w:t>
+        <w:t xml:space="preserve">This is not a claim that the tool harms those it assigns, which Section 5 shows it does not, nor that the mean is the right objective; only that four candidates were available, that their consequences differ widely, and that the choice among them was never argued.</w:t>
       </w:r>
     </w:p>
     <w:bookmarkEnd w:id="10"/>
@@ -194,7 +194,7 @@
         <w:pStyle w:val="BodyText"/>
       </w:pPr>
       <w:r>
-        <w:t xml:space="preserve">Critical attention has gone to the first stage, and formal fairness work to the last (Strasser Ceballos and Kern 2025). Alajak et al. (2026) focus on the predictors: nationality, gender, age, marital status and religion enter the Swiss feature vector directly, and a model built on historically stratified outcomes will reproduce that stratification. Strasser Ceballos and Kern (2025) show how sensitive the pipeline is to the target variable — optimising German data for social rather than economic integration sends 88% of refugees elsewhere. Both critiques concern what goes</w:t>
+        <w:t xml:space="preserve">Critical attention has gone to the first stage and formal fairness work to the last. Alajak et al. (2026) focus on the predictors: nationality, gender, age, marital status and religion enter the Swiss feature vector directly, and a model built on historically stratified outcomes reproduces that stratification. Strasser Ceballos and Kern (2025) show how sensitive the pipeline is to the target variable — optimising German data for social rather than economic integration sends 88% of refugees elsewhere. Both critiques concern what goes</w:t>
       </w:r>
       <w:r>
         <w:t xml:space="preserve"> </w:t>
@@ -218,15 +218,7 @@
         <w:pStyle w:val="BodyText"/>
       </w:pPr>
       <w:r>
-        <w:t xml:space="preserve">That values enter through the formulation of the objective rather than through the estimator is the general lesson of the problem-formulation literature (Passi and Barocas 2019), and Obermeyer et al. (2019) is its canonical demonstration: a health-risk model that tracked costs instead of illness produced a large racial disparity from a label chosen upstream of any modelling decision. The argument below is that literature applied to a case in which the object quietly substituted is not the label but the unit whose welfare is counted — and to a tool for which the substitution has been visible in a public archive for eight years.</w:t>
-      </w:r>
-    </w:p>
-    <w:p>
-      <w:pPr>
-        <w:pStyle w:val="BodyText"/>
-      </w:pPr>
-      <w:r>
-        <w:t xml:space="preserve">The middle stage is where the decisive normative commitment is made, and it is the one stage nobody argues about: the modeling stage produces individual-level objects, the matching stage consumes case-level ones, and</w:t>
+        <w:t xml:space="preserve">That values enter through the objective rather than the estimator is the lesson of the problem-formulation literature (Passi and Barocas 2019), demonstrated canonically by Obermeyer et al. (2019), where a health-risk model tracking costs instead of illness produced a racial disparity from a label chosen upstream of any modelling. What is substituted here is not the label but the unit whose welfare is counted, and the substitution happens in the middle stage: the modeling stage produces individual-level objects, the matching stage consumes case-level ones, and</w:t>
       </w:r>
       <w:r>
         <w:t xml:space="preserve"> </w:t>
@@ -240,7 +232,7 @@
         <w:t xml:space="preserve"> </w:t>
       </w:r>
       <w:r>
-        <w:t xml:space="preserve">is the bridge whose selection determines whose welfare the optimisation tracks. It is not hidden: Strasser Ceballos and Kern (2025, Appendix C) tabulate it for both deployed tools of this family, and the comparison is instructive, because the other chose differently. Annie MOORE, running at a U.S. resettlement agency since 2018, aggregates by the</w:t>
+        <w:t xml:space="preserve">is the bridge whose selection determines whose welfare the optimisation tracks. That is the one stage nobody argues about, and it is not hidden. Strasser Ceballos and Kern (2025, Appendix C) tabulate it for both deployed tools of this family, and the comparison is instructive, because the other chose differently: Annie MOORE, deployed at a U.S. resettlement agency, aggregates by the</w:t>
       </w:r>
       <w:r>
         <w:t xml:space="preserve"> </w:t>
@@ -511,15 +503,7 @@
         <w:t xml:space="preserve"> </w:t>
       </w:r>
       <w:r>
-        <w:t xml:space="preserve">has never been treated, even by its designers, as a commitment needing defence in either direction.</w:t>
-      </w:r>
-    </w:p>
-    <w:p>
-      <w:pPr>
-        <w:pStyle w:val="BodyText"/>
-      </w:pPr>
-      <w:r>
-        <w:t xml:space="preserve">One limitation should be stated plainly: whether the SEM’s live pipeline still uses this function is not published, and neither are the pilot’s results (Strasser Ceballos and Kern 2025). What is secure is that it produced the founding study’s results and was justified by the programme’s goals; if a different</w:t>
+        <w:t xml:space="preserve">has never been treated, even by its designers, as a commitment needing defence. Whether the SEM’s live pipeline still uses it is unpublished, as are the pilot’s results (Strasser Ceballos and Kern 2025); a different</w:t>
       </w:r>
       <w:r>
         <w:t xml:space="preserve"> </w:t>
@@ -533,7 +517,7 @@
         <w:t xml:space="preserve"> </w:t>
       </w:r>
       <w:r>
-        <w:t xml:space="preserve">is used today, that change is equally undocumented — an instance of the problem described here, not an exception.</w:t>
+        <w:t xml:space="preserve">today would be an equally undocumented change.</w:t>
       </w:r>
     </w:p>
     <w:bookmarkEnd w:id="11"/>
@@ -932,7 +916,7 @@
         <w:t xml:space="preserve"> </w:t>
       </w:r>
       <w:r>
-        <w:t xml:space="preserve">ranks the one that spreads it evenly lowest and the most concentrated one highest. Second,</w:t>
+        <w:t xml:space="preserve">ranks the evenly spread one lowest and the most concentrated one highest. Second,</w:t>
       </w:r>
       <w:r>
         <w:t xml:space="preserve"> </w:t>
@@ -1041,7 +1025,7 @@
         </m:r>
       </m:oMath>
       <w:r>
-        <w:t xml:space="preserve">: the weight the objective places on any member falls as the other members’ prospects rise. The rule therefore attends least to whoever is least likely to find work, for any size and any probabilities, and an assignment maximising it can be dominated in expected employment by one that does not:</w:t>
+        <w:t xml:space="preserve">: the weight the objective places on any member falls as the other members’ prospects rise, so the rule attends least to whoever is least likely to find work, for any size and any probabilities. An assignment maximising it can therefore be dominated in expected employment by one that does not:</w:t>
       </w:r>
     </w:p>
     <w:tbl>
@@ -1273,7 +1257,7 @@
         <w:pStyle w:val="BodyText"/>
       </w:pPr>
       <w:r>
-        <w:t xml:space="preserve">GeoMatch sends this household to A, worse both in expected employment and in equality, not through error but through faithful maximisation of its stated objective.</w:t>
+        <w:t xml:space="preserve">GeoMatch sends this household to A, worse both in expected employment and in equality, not through error but through faithful maximisation of its stated objective. This is the unitary household model implemented as an optimiser, and the reason development economics abandoned that model applies here: aggregating to the household conceals who inside it gains, and not neutrally, where bargaining power and labour-market access differ by gender (Sen 1990; Agarwal 1997). What is new is the site: here the aggregation is not an approximation forced by data but a line of code.</w:t>
       </w:r>
     </w:p>
     <w:p>
@@ -1281,7 +1265,7 @@
         <w:pStyle w:val="BodyText"/>
       </w:pPr>
       <w:r>
-        <w:t xml:space="preserve">The rule is, in this respect, a formal implementation of the unitary household model — the household treated as one agent with one welfare level, satisfied once its need is met — which development economics abandoned some time ago, and for this reason: aggregating to the household conceals who inside it gains, and the concealment is not distributionally neutral where bargaining power and labour-market access differ by gender (Sen 1990; Agarwal 1997). Targeting a benefit at the household rather than at the person is a recognised mechanism of gender inequality in that literature. The novelty here is not the mechanism but its site: it is running inside an optimiser, where the aggregation is not an approximation forced by data but a line of code with three documented alternatives.</w:t>
+        <w:t xml:space="preserve">Who bears this? In Swiss refugee households the secondary earner is overwhelmingly a woman: seven years after arrival, 64% of men but only 32% of women aged 16–55 at entry are in employment (Staatssekretariat für Migration 2026). That is a population rate at a longer horizon than the Swiss target variable, so it overstates the levels the tool works with but not the direction of the gap. Alajak et al. (2026) allege discriminatory outcomes by ethnicity, gender, age and marital status but cannot identify a mechanism. The argument above supplies one, located not in the training data but in a design choice downstream of it, and it reaches every group they name: whoever starts behind is served worse the further behind they start.</w:t>
       </w:r>
     </w:p>
     <w:p>
@@ -1289,7 +1273,7 @@
         <w:pStyle w:val="BodyText"/>
       </w:pPr>
       <w:r>
-        <w:t xml:space="preserve">Who bears this? In Swiss refugee households the secondary earner is overwhelmingly a woman: seven years after arrival, 64% of men but only 32% of women aged 16–55 at entry are in employment (Staatssekretariat für Migration 2026). Two qualifications belong with that figure. It is a seven-year rate, whereas the Swiss target variable is employment two to four years after arrival, so it overstates the levels the tool works with but not the direction of the gap, which is present at every horizon the SEM reports. And it is a population average, not a household-level one; the claim below needs only that the woman is more often the lower-probability member, which this gap makes true on average rather than in every case. That gap is the raw material the formula exploits. Alajak et al. (2026) allege discriminatory outcomes by ethnicity, gender, age and marital status but cannot identify a mechanism; the argument above supplies one, located not in the training data but in a design choice downstream of it, and it reaches every group they name: whoever starts behind is served worse the further behind they start.</w:t>
+        <w:t xml:space="preserve">The second property compounds across members, which produces a distinct effect on size. Each additional member multiplies the derivative by a factor below one, so a large household’s score barely moves with location: a four-adult household with middling probabilities scores above 0.93 in every canton, while a single adult’s score ranges over the full cantonal spread. Since the matching stage allocates capacity by marginal gain, households whose scores barely move are the natural candidates for displacement. The objective steers the benefits of optimisation toward small cases for a reason unrelated to need or prospects: in the vocabulary of Black et al. (2022), a failure of vertical equity.</w:t>
       </w:r>
     </w:p>
     <w:p>
@@ -1297,19 +1281,11 @@
         <w:pStyle w:val="BodyText"/>
       </w:pPr>
       <w:r>
-        <w:t xml:space="preserve">The second property compounds across members, which produces a distinct effect on size. Each additional member multiplies the derivative by a factor below one, so a large household’s score barely moves with location: a four-adult household with middling probabilities scores above 0.93 in every canton, while a single adult’s score ranges over the full cantonal spread. The matching stage allocates capacity by marginal gain — a slot in a well-matched canton goes to whichever case’s score rises most from receiving it — so households whose scores barely move are the natural candidates for displacement. The objective thus steers the benefits of optimisation toward small cases for a reason unrelated to need or prospects: in the vocabulary of Black et al. (2022), a failure of vertical equity.</w:t>
-      </w:r>
-    </w:p>
-    <w:p>
-      <w:pPr>
-        <w:pStyle w:val="BodyText"/>
-      </w:pPr>
-      <w:r>
-        <w:t xml:space="preserve">The two harms need different names. Sacrificing one member’s prospects for another’s, where the member sacrificed is disproportionately a woman, has the structure of indirect discrimination: a facially neutral rule with a foreseeable adverse effect distributed along a protected characteristic. It does not follow that the legal test is met, and Section 4 will show that it is not on the comparison that matters: indirect discrimination requires a particular disadvantage relative to a comparator, and relative to the legal default women are not disadvantaged — they gain, only less than they would under a rule that counted them once. What survives is the structure without the violation, which is why the objection is pressed below as one about efficiency and the distribution of the gain rather than as a claim of unlawfulness. Displacing a household for its size is a different matter again, since nobody inside the case is sacrificed for anyone else, which is why vertical equity — needing no protected characteristic, only that likes be treated alike — is the right frame for it.</w:t>
+        <w:t xml:space="preserve">The two harms need different names. Sacrificing one member’s prospects for another’s, where the member sacrificed is disproportionately a woman, has the structure of indirect discrimination, though not its legal test: that requires disadvantage relative to a comparator, and relative to the legal default women gain, only less than under a rule that counted them once. The objection is therefore pressed below as one about efficiency and the distribution of the gain. Displacing a household for its size is different, since nobody inside the case is sacrificed for anyone else — there vertical equity, needing only that likes be treated alike, is the frame.</w:t>
       </w:r>
     </w:p>
     <w:bookmarkEnd w:id="12"/>
-    <w:bookmarkStart w:id="17" w:name="magnitude"/>
+    <w:bookmarkStart w:id="16" w:name="magnitude"/>
     <w:p>
       <w:pPr>
         <w:pStyle w:val="Heading2"/>
@@ -1318,13 +1294,13 @@
         <w:t xml:space="preserve">4. Magnitude</w:t>
       </w:r>
     </w:p>
-    <w:bookmarkStart w:id="13" w:name="calibration"/>
+    <w:bookmarkStart w:id="13" w:name="design-and-calibration"/>
     <w:p>
       <w:pPr>
         <w:pStyle w:val="Heading3"/>
       </w:pPr>
       <w:r>
-        <w:t xml:space="preserve">4.1 Calibration</w:t>
+        <w:t xml:space="preserve">4.1 Design and Calibration</w:t>
       </w:r>
     </w:p>
     <w:p>
@@ -1355,7 +1331,7 @@
         <w:t xml:space="preserve"> </w:t>
       </w:r>
       <w:r>
-        <w:t xml:space="preserve">is solved. The comparison is against the characteristics-blind key of Article 21, over draws of the cantonal parameters, so that no conclusion rests on one draw.</w:t>
+        <w:t xml:space="preserve">is solved. The comparison is against the characteristics-blind key of Article 21, over draws of the cantonal parameters.</w:t>
       </w:r>
     </w:p>
     <w:p>
@@ -1363,7 +1339,7 @@
         <w:pStyle w:val="BodyText"/>
       </w:pPr>
       <w:r>
-        <w:t xml:space="preserve">The last term carries the analysis and so should not be chosen freely. It is the extent to which a canton that suits one person does not suit another, which is the entire resource an assignment algorithm has: with no such term, everyone of a given gender ranks the cantons identically, optimisation can only shuffle people between cantons they agree about, and the deployed rule gains 1.4% over the status quo where the best of the four candidates manages 2.3% — two orders of magnitude below what GeoMatch is documented to deliver. A simulation in that regime is not a model of the problem the tool solves, and the results it produces turn out to depend on the degeneracy (below, and Section 4.4).</w:t>
+        <w:t xml:space="preserve">The last term carries the analysis and so should not be chosen freely: it is the extent to which a canton that suits one person does not suit another, which is the entire resource an assignment algorithm has. Without it, everyone of a given gender ranks the cantons identically and the deployed rule gains 1.4% over the status quo where the best candidate manages 2.3% — two orders of magnitude below what GeoMatch is documented to deliver. So the term is pinned to the published effect size rather than assumed: at a standard deviation of 1.0 on the logit scale, at-least-one gains 39.4% and its mean variant 47.3%, against the 41% and 47% Bansak et al. report for the U.S. backtest and its fig. S8 comparison. One parameter reproduces both. Gender intercepts are re-solved for every specification so that status-quo employment stays at the SEM base rates; specifications therefore differ in synergy alone.</w:t>
       </w:r>
     </w:p>
     <w:p>
@@ -1371,7 +1347,7 @@
         <w:pStyle w:val="BodyText"/>
       </w:pPr>
       <w:r>
-        <w:t xml:space="preserve">So the term is pinned to the published effect size rather than assumed. Setting its standard deviation to 1.0 on the logit scale, the deployed at-least-one rule gains 39.4% over the status quo and its mean variant 47.3% — against the 41% and 47% that Bansak et al. report for the U.S. backtest and its fig. S8 comparison. One parameter reproduces both, which is as much external validation as a public-data replication of this tool admits. The gender intercepts are re-solved for every specification so that the status-quo employment rates stay at the SEM base rates throughout; specifications therefore differ in synergy alone. Results are reported at this calibration, with the no-synergy limit and a doubled upper bracket carried alongside.</w:t>
+        <w:t xml:space="preserve">Three inputs are real, then — the gender gap, the capacity key and the published gain the last term is fitted to — and the rest is stylised: cantonal effects, the interaction, the size mix, and an additive logit in place of location-specific gradient-boosted trees, since no individual-level ZEMIS data is public. Gender is also the only characteristic modelled, so the tool’s other predictors, which Alajak et al. (2026) put at the centre, do not appear. The figures illustrate the mechanism at plausible parameter values; they are not estimates of what the SEM pilot did, and none bears on Section 3, a property of the formula established without simulated data at all.</w:t>
       </w:r>
     </w:p>
     <w:bookmarkEnd w:id="13"/>
@@ -1721,7 +1697,7 @@
         <w:pStyle w:val="BodyText"/>
       </w:pPr>
       <w:r>
-        <w:t xml:space="preserve">90% Monte Carlo intervals over the parameter draws, for the at-least-one and mean rows: gain +36.8 to +41.4% and +45.1 to +49.3%; P(employed), women 0.436–0.508 and 0.570–0.631. These describe dispersion across stylised cantonal parameters, not sampling error.</w:t>
+        <w:t xml:space="preserve">At-least-one is the worst of the three on every column: a smaller gain than either alternative, a lower employment probability for women, and the only row that widens rather than narrows the within-household gap. Mean wins on efficiency, minimum on equity, at-least-one on neither, so no efficiency-equity frontier remains on which to locate it. Note what the table does not show: women are not left absolutely worse off than under the status quo, at 0.471 against 0.325 — the tool helps them, and substantially. The objection is narrower: the rule forgoes employment, and spends the gain it does achieve on the member who already had the better prospects.</w:t>
       </w:r>
     </w:p>
     <w:p>
@@ -1729,7 +1705,7 @@
         <w:pStyle w:val="BodyText"/>
       </w:pPr>
       <w:r>
-        <w:t xml:space="preserve">At-least-one is the worst of the three on every column: a smaller gain than either alternative, a lower employment probability for women, and the only row of the four that widens rather than narrows the within-household gap. Mean wins on efficiency, minimum on equity, at-least-one on neither, so no efficiency-equity frontier remains on which to locate it. Note what the table does not show: women are not left absolutely worse off than under the status quo, at 0.471 against 0.325 — the tool helps them, and substantially. The objection is the narrower one: the rule forgoes employment, and spends the gain it does achieve on the member who already had the better prospects.</w:t>
+        <w:t xml:space="preserve">The magnitudes are not small. Choosing at-least-one over mean gives up 8.0 percentage points of the gain over the status quo, 17.0% of what is achievable (90% interval 15.2–19.1% across parameter draws), in 100% of replications rather than merely on average. Women’s employment probability is 12.9 points lower than under the mean, and the within-household gap widens by 7.6 points relative to the legal default where the mean narrows it by 10.8. Ranked by each individual’s own prospects, the deployed rule sends men to their 4.3rd-best canton of 26 and women to their 8.8th, with 13% of women against 2% of men in a canton in their own worst quartile.</w:t>
       </w:r>
     </w:p>
     <w:p>
@@ -1737,31 +1713,7 @@
         <w:pStyle w:val="BodyText"/>
       </w:pPr>
       <w:r>
-        <w:t xml:space="preserve">The magnitudes are not small. Choosing at-least-one over mean gives up 8.0 percentage points of the gain over the status quo, 17.0% of what is achievable (90% interval 15.2–19.1%), in 100% of replications rather than merely on average. Women’s employment probability is 12.9 points lower under the deployed rule than under the mean (90% interval 11.6–14.2), and the within-household gap widens by 7.6 points relative to the legal default where the mean narrows it by 10.8. Ranking cantons by each individual’s own prospects rather than the household’s makes the same point at the level where it is felt: the deployed rule sends men to their 4.3rd-best canton of 26 and women to their 8.8th, and 13% of women to a canton in their own worst quartile against 2% of men. Under the mean the order reverses, to 6.7 for men and 4.5 for women. Unconstrained by capacity, at-least-one strictly prefers a canton with a lower within-household mean for 50% of households, a share rising from 47% to 56% as the canton-by-gender interaction strengthens.</w:t>
-      </w:r>
-    </w:p>
-    <w:p>
-      <w:pPr>
-        <w:pStyle w:val="BodyText"/>
-      </w:pPr>
-      <w:r>
-        <w:t xml:space="preserve">Three checks. First, the ordering of the rules on every column is the same in the no-synergy limit, where the same table reads +1.4%, +2.2% and +1.4% and the forgone share is 37.8%: what the calibration changes is magnitude, not sign, and it changes it in both directions — the</w:t>
-      </w:r>
-      <w:r>
-        <w:t xml:space="preserve"> </w:t>
-      </w:r>
-      <w:r>
-        <w:rPr>
-          <w:i/>
-          <w:iCs/>
-        </w:rPr>
-        <w:t xml:space="preserve">share</w:t>
-      </w:r>
-      <w:r>
-        <w:t xml:space="preserve"> </w:t>
-      </w:r>
-      <w:r>
-        <w:t xml:space="preserve">of the achievable gain given up falls as synergies grow, while the absolute cost of the choice rises. Second, doubling the person-by-canton term strengthens the efficiency and gender findings (18.9 points of gain forgone, 26.0% of the achievable, women 23.0 points behind) and weakens the gap finding without reversing it: the widening falls from 7.6 to 2.6 points and holds in 96% of replications rather than 100%. Third, letting household members resemble each other, which is what the formula’s independence assumption denies, leaves the efficiency loss where it was (8.0 to 7.9 points) and makes the distributional findings slightly worse: the gap widening rises from 7.8 to 8.1 points and women’s shortfall from 12.9 to 13.2 as members’ shared variance rises to 0.6.</w:t>
+        <w:t xml:space="preserve">Two checks. The ordering of the rules is unchanged in the no-synergy limit, where the table reads +1.4%, +2.2% and +1.4%, so calibration changes magnitude, not sign; and doubling the person-by-canton term strengthens the efficiency and gender findings (18.9 points of gain forgone, women 23.0 points behind) while weakening the gap finding to 2.6 points without reversing it.</w:t>
       </w:r>
     </w:p>
     <w:bookmarkEnd w:id="14"/>
@@ -1779,386 +1731,7 @@
         <w:pStyle w:val="FirstParagraph"/>
       </w:pPr>
       <w:r>
-        <w:t xml:space="preserve">The mechanism is not merely algebraic. I extend the simulation to a stylised mix of one- to four-adult households (shares 35/30/20/15) and rank, for each household, all 26 cantons by its own prospects — the outcome it experiences, rather than the compressed score it is matched on. Ranking needs a yardstick, and the yardstick must not be the objective of one of the rules being compared, so I report two. The first is the household’s own mean employment probability; because the expected number of employed members is that mean times a household size which is fixed within a household, the two rank cantons identically, so this yardstick does not privilege the mean rule over the sum rule. The second is the employment probability of the household’s least employable member, which no compared rule maximises. Tables report the average rank of the canton received, 1 being the best of 26.</w:t>
-      </w:r>
-    </w:p>
-    <w:p>
-      <w:pPr>
-        <w:pStyle w:val="BodyText"/>
-      </w:pPr>
-      <w:r>
-        <w:t xml:space="preserve">Per-person yardstick:</w:t>
-      </w:r>
-    </w:p>
-    <w:tbl>
-      <w:tblPr>
-        <w:tblStyle w:val="Table"/>
-        <w:tblW w:type="auto" w:w="0"/>
-        <w:tblLook w:firstRow="1" w:lastRow="0" w:firstColumn="0" w:lastColumn="0" w:noHBand="0" w:noVBand="0" w:val="0020"/>
-      </w:tblPr>
-      <w:tblGrid>
-        <w:gridCol w:w="1584"/>
-        <w:gridCol w:w="1584"/>
-        <w:gridCol w:w="1584"/>
-        <w:gridCol w:w="1584"/>
-        <w:gridCol w:w="1584"/>
-      </w:tblGrid>
-      <w:tr>
-        <w:trPr>
-          <w:tblHeader w:val="on"/>
-        </w:trPr>
-        <w:tc>
-          <w:tcPr/>
-          <w:p>
-            <w:pPr>
-              <w:pStyle w:val="Compact"/>
-            </w:pPr>
-            <w:r>
-              <w:t xml:space="preserve">household size</w:t>
-            </w:r>
-          </w:p>
-        </w:tc>
-        <w:tc>
-          <w:tcPr/>
-          <w:p>
-            <w:pPr>
-              <w:pStyle w:val="Compact"/>
-            </w:pPr>
-            <w:r>
-              <w:t xml:space="preserve">at-least-one</w:t>
-            </w:r>
-          </w:p>
-        </w:tc>
-        <w:tc>
-          <w:tcPr/>
-          <w:p>
-            <w:pPr>
-              <w:pStyle w:val="Compact"/>
-            </w:pPr>
-            <w:r>
-              <w:t xml:space="preserve">mean</w:t>
-            </w:r>
-          </w:p>
-        </w:tc>
-        <w:tc>
-          <w:tcPr/>
-          <w:p>
-            <w:pPr>
-              <w:pStyle w:val="Compact"/>
-            </w:pPr>
-            <w:r>
-              <w:t xml:space="preserve">sum</w:t>
-            </w:r>
-          </w:p>
-        </w:tc>
-        <w:tc>
-          <w:tcPr/>
-          <w:p>
-            <w:pPr>
-              <w:pStyle w:val="Compact"/>
-            </w:pPr>
-            <w:r>
-              <w:t xml:space="preserve">lottery</w:t>
-            </w:r>
-          </w:p>
-        </w:tc>
-      </w:tr>
-      <w:tr>
-        <w:tc>
-          <w:tcPr/>
-          <w:p>
-            <w:pPr>
-              <w:pStyle w:val="Compact"/>
-            </w:pPr>
-            <w:r>
-              <w:t xml:space="preserve">1</w:t>
-            </w:r>
-          </w:p>
-        </w:tc>
-        <w:tc>
-          <w:tcPr/>
-          <w:p>
-            <w:pPr>
-              <w:pStyle w:val="Compact"/>
-            </w:pPr>
-            <w:r>
-              <w:t xml:space="preserve">1.7</w:t>
-            </w:r>
-          </w:p>
-        </w:tc>
-        <w:tc>
-          <w:tcPr/>
-          <w:p>
-            <w:pPr>
-              <w:pStyle w:val="Compact"/>
-            </w:pPr>
-            <w:r>
-              <w:t xml:space="preserve">2.5</w:t>
-            </w:r>
-          </w:p>
-        </w:tc>
-        <w:tc>
-          <w:tcPr/>
-          <w:p>
-            <w:pPr>
-              <w:pStyle w:val="Compact"/>
-            </w:pPr>
-            <w:r>
-              <w:t xml:space="preserve">4.0</w:t>
-            </w:r>
-          </w:p>
-        </w:tc>
-        <w:tc>
-          <w:tcPr/>
-          <w:p>
-            <w:pPr>
-              <w:pStyle w:val="Compact"/>
-            </w:pPr>
-            <w:r>
-              <w:t xml:space="preserve">13.5</w:t>
-            </w:r>
-          </w:p>
-        </w:tc>
-      </w:tr>
-      <w:tr>
-        <w:tc>
-          <w:tcPr/>
-          <w:p>
-            <w:pPr>
-              <w:pStyle w:val="Compact"/>
-            </w:pPr>
-            <w:r>
-              <w:t xml:space="preserve">2</w:t>
-            </w:r>
-          </w:p>
-        </w:tc>
-        <w:tc>
-          <w:tcPr/>
-          <w:p>
-            <w:pPr>
-              <w:pStyle w:val="Compact"/>
-            </w:pPr>
-            <w:r>
-              <w:t xml:space="preserve">3.8</w:t>
-            </w:r>
-          </w:p>
-        </w:tc>
-        <w:tc>
-          <w:tcPr/>
-          <w:p>
-            <w:pPr>
-              <w:pStyle w:val="Compact"/>
-            </w:pPr>
-            <w:r>
-              <w:t xml:space="preserve">2.6</w:t>
-            </w:r>
-          </w:p>
-        </w:tc>
-        <w:tc>
-          <w:tcPr/>
-          <w:p>
-            <w:pPr>
-              <w:pStyle w:val="Compact"/>
-            </w:pPr>
-            <w:r>
-              <w:t xml:space="preserve">2.6</w:t>
-            </w:r>
-          </w:p>
-        </w:tc>
-        <w:tc>
-          <w:tcPr/>
-          <w:p>
-            <w:pPr>
-              <w:pStyle w:val="Compact"/>
-            </w:pPr>
-            <w:r>
-              <w:t xml:space="preserve">13.5</w:t>
-            </w:r>
-          </w:p>
-        </w:tc>
-      </w:tr>
-      <w:tr>
-        <w:tc>
-          <w:tcPr/>
-          <w:p>
-            <w:pPr>
-              <w:pStyle w:val="Compact"/>
-            </w:pPr>
-            <w:r>
-              <w:t xml:space="preserve">3</w:t>
-            </w:r>
-          </w:p>
-        </w:tc>
-        <w:tc>
-          <w:tcPr/>
-          <w:p>
-            <w:pPr>
-              <w:pStyle w:val="Compact"/>
-            </w:pPr>
-            <w:r>
-              <w:t xml:space="preserve">5.6</w:t>
-            </w:r>
-          </w:p>
-        </w:tc>
-        <w:tc>
-          <w:tcPr/>
-          <w:p>
-            <w:pPr>
-              <w:pStyle w:val="Compact"/>
-            </w:pPr>
-            <w:r>
-              <w:t xml:space="preserve">3.2</w:t>
-            </w:r>
-          </w:p>
-        </w:tc>
-        <w:tc>
-          <w:tcPr/>
-          <w:p>
-            <w:pPr>
-              <w:pStyle w:val="Compact"/>
-            </w:pPr>
-            <w:r>
-              <w:t xml:space="preserve">2.1</w:t>
-            </w:r>
-          </w:p>
-        </w:tc>
-        <w:tc>
-          <w:tcPr/>
-          <w:p>
-            <w:pPr>
-              <w:pStyle w:val="Compact"/>
-            </w:pPr>
-            <w:r>
-              <w:t xml:space="preserve">13.5</w:t>
-            </w:r>
-          </w:p>
-        </w:tc>
-      </w:tr>
-      <w:tr>
-        <w:tc>
-          <w:tcPr/>
-          <w:p>
-            <w:pPr>
-              <w:pStyle w:val="Compact"/>
-            </w:pPr>
-            <w:r>
-              <w:t xml:space="preserve">4</w:t>
-            </w:r>
-          </w:p>
-        </w:tc>
-        <w:tc>
-          <w:tcPr/>
-          <w:p>
-            <w:pPr>
-              <w:pStyle w:val="Compact"/>
-            </w:pPr>
-            <w:r>
-              <w:rPr>
-                <w:b/>
-                <w:bCs/>
-              </w:rPr>
-              <w:t xml:space="preserve">7.8</w:t>
-            </w:r>
-          </w:p>
-        </w:tc>
-        <w:tc>
-          <w:tcPr/>
-          <w:p>
-            <w:pPr>
-              <w:pStyle w:val="Compact"/>
-            </w:pPr>
-            <w:r>
-              <w:t xml:space="preserve">3.6</w:t>
-            </w:r>
-          </w:p>
-        </w:tc>
-        <w:tc>
-          <w:tcPr/>
-          <w:p>
-            <w:pPr>
-              <w:pStyle w:val="Compact"/>
-            </w:pPr>
-            <w:r>
-              <w:t xml:space="preserve">1.9</w:t>
-            </w:r>
-          </w:p>
-        </w:tc>
-        <w:tc>
-          <w:tcPr/>
-          <w:p>
-            <w:pPr>
-              <w:pStyle w:val="Compact"/>
-            </w:pPr>
-            <w:r>
-              <w:t xml:space="preserve">13.5</w:t>
-            </w:r>
-          </w:p>
-        </w:tc>
-      </w:tr>
-      <w:tr>
-        <w:tc>
-          <w:tcPr/>
-          <w:p>
-            <w:pPr>
-              <w:pStyle w:val="Compact"/>
-            </w:pPr>
-            <w:r>
-              <w:t xml:space="preserve">all sizes</w:t>
-            </w:r>
-          </w:p>
-        </w:tc>
-        <w:tc>
-          <w:tcPr/>
-          <w:p>
-            <w:pPr>
-              <w:pStyle w:val="Compact"/>
-            </w:pPr>
-            <w:r>
-              <w:t xml:space="preserve">4.0</w:t>
-            </w:r>
-          </w:p>
-        </w:tc>
-        <w:tc>
-          <w:tcPr/>
-          <w:p>
-            <w:pPr>
-              <w:pStyle w:val="Compact"/>
-            </w:pPr>
-            <w:r>
-              <w:t xml:space="preserve">2.8</w:t>
-            </w:r>
-          </w:p>
-        </w:tc>
-        <w:tc>
-          <w:tcPr/>
-          <w:p>
-            <w:pPr>
-              <w:pStyle w:val="Compact"/>
-            </w:pPr>
-            <w:r>
-              <w:t xml:space="preserve">2.9</w:t>
-            </w:r>
-          </w:p>
-        </w:tc>
-        <w:tc>
-          <w:tcPr/>
-          <w:p>
-            <w:pPr>
-              <w:pStyle w:val="Compact"/>
-            </w:pPr>
-            <w:r>
-              <w:t xml:space="preserve">13.5</w:t>
-            </w:r>
-          </w:p>
-        </w:tc>
-      </w:tr>
-    </w:tbl>
-    <w:p>
-      <w:pPr>
-        <w:pStyle w:val="BodyText"/>
-      </w:pPr>
-      <w:r>
-        <w:t xml:space="preserve">Worst-off-member yardstick, with the share of households sent to a canton in their own worst quartile:</w:t>
+        <w:t xml:space="preserve">The mechanism is not merely algebraic. I extend the simulation to a stylised mix of one- to four-adult households (shares 35/30/20/15) and rank, for each household, all 26 cantons by its own prospects rather than by the compressed score it is matched on. Since the yardstick must not be the objective of a rule being compared, I use two: the household’s mean employment probability, which ranks cantons identically to the expected number employed and so privileges neither the mean nor the sum, and the probability for its least employable member, which no rule maximises. The table gives the average rank of the canton received, 1 being best of 26 and a household-blind lottery 13.5; the first three rule columns use the per-person yardstick, the last three the worst-member one.</w:t>
       </w:r>
     </w:p>
     <w:tbl>
@@ -2169,12 +1742,13 @@
         <w:tblLook w:firstRow="1" w:lastRow="0" w:firstColumn="0" w:lastColumn="0" w:noHBand="0" w:noVBand="0" w:val="0020"/>
       </w:tblPr>
       <w:tblGrid>
-        <w:gridCol w:w="1320"/>
-        <w:gridCol w:w="1320"/>
-        <w:gridCol w:w="1320"/>
-        <w:gridCol w:w="1320"/>
-        <w:gridCol w:w="1320"/>
-        <w:gridCol w:w="1320"/>
+        <w:gridCol w:w="1131"/>
+        <w:gridCol w:w="1131"/>
+        <w:gridCol w:w="1131"/>
+        <w:gridCol w:w="1131"/>
+        <w:gridCol w:w="1131"/>
+        <w:gridCol w:w="1131"/>
+        <w:gridCol w:w="1131"/>
       </w:tblGrid>
       <w:tr>
         <w:trPr>
@@ -2231,18 +1805,29 @@
               <w:pStyle w:val="Compact"/>
             </w:pPr>
             <w:r>
-              <w:t xml:space="preserve">lottery</w:t>
-            </w:r>
-          </w:p>
-        </w:tc>
-        <w:tc>
-          <w:tcPr/>
-          <w:p>
-            <w:pPr>
-              <w:pStyle w:val="Compact"/>
-            </w:pPr>
-            <w:r>
-              <w:t xml:space="preserve">own-worst-quartile: at-least-one</w:t>
+              <w:t xml:space="preserve">at-least-one</w:t>
+            </w:r>
+          </w:p>
+        </w:tc>
+        <w:tc>
+          <w:tcPr/>
+          <w:p>
+            <w:pPr>
+              <w:pStyle w:val="Compact"/>
+            </w:pPr>
+            <w:r>
+              <w:t xml:space="preserve">mean</w:t>
+            </w:r>
+          </w:p>
+        </w:tc>
+        <w:tc>
+          <w:tcPr/>
+          <w:p>
+            <w:pPr>
+              <w:pStyle w:val="Compact"/>
+            </w:pPr>
+            <w:r>
+              <w:t xml:space="preserve">sum</w:t>
             </w:r>
           </w:p>
         </w:tc>
@@ -2299,18 +1884,29 @@
               <w:pStyle w:val="Compact"/>
             </w:pPr>
             <w:r>
-              <w:t xml:space="preserve">13.5</w:t>
-            </w:r>
-          </w:p>
-        </w:tc>
-        <w:tc>
-          <w:tcPr/>
-          <w:p>
-            <w:pPr>
-              <w:pStyle w:val="Compact"/>
-            </w:pPr>
-            <w:r>
-              <w:t xml:space="preserve">0%</w:t>
+              <w:t xml:space="preserve">1.7</w:t>
+            </w:r>
+          </w:p>
+        </w:tc>
+        <w:tc>
+          <w:tcPr/>
+          <w:p>
+            <w:pPr>
+              <w:pStyle w:val="Compact"/>
+            </w:pPr>
+            <w:r>
+              <w:t xml:space="preserve">2.5</w:t>
+            </w:r>
+          </w:p>
+        </w:tc>
+        <w:tc>
+          <w:tcPr/>
+          <w:p>
+            <w:pPr>
+              <w:pStyle w:val="Compact"/>
+            </w:pPr>
+            <w:r>
+              <w:t xml:space="preserve">4.0</w:t>
             </w:r>
           </w:p>
         </w:tc>
@@ -2334,6 +1930,39 @@
               <w:pStyle w:val="Compact"/>
             </w:pPr>
             <w:r>
+              <w:t xml:space="preserve">3.8</w:t>
+            </w:r>
+          </w:p>
+        </w:tc>
+        <w:tc>
+          <w:tcPr/>
+          <w:p>
+            <w:pPr>
+              <w:pStyle w:val="Compact"/>
+            </w:pPr>
+            <w:r>
+              <w:t xml:space="preserve">2.6</w:t>
+            </w:r>
+          </w:p>
+        </w:tc>
+        <w:tc>
+          <w:tcPr/>
+          <w:p>
+            <w:pPr>
+              <w:pStyle w:val="Compact"/>
+            </w:pPr>
+            <w:r>
+              <w:t xml:space="preserve">2.6</w:t>
+            </w:r>
+          </w:p>
+        </w:tc>
+        <w:tc>
+          <w:tcPr/>
+          <w:p>
+            <w:pPr>
+              <w:pStyle w:val="Compact"/>
+            </w:pPr>
+            <w:r>
               <w:t xml:space="preserve">7.1</w:t>
             </w:r>
           </w:p>
@@ -2357,28 +1986,6 @@
             </w:pPr>
             <w:r>
               <w:t xml:space="preserve">3.5</w:t>
-            </w:r>
-          </w:p>
-        </w:tc>
-        <w:tc>
-          <w:tcPr/>
-          <w:p>
-            <w:pPr>
-              <w:pStyle w:val="Compact"/>
-            </w:pPr>
-            <w:r>
-              <w:t xml:space="preserve">13.5</w:t>
-            </w:r>
-          </w:p>
-        </w:tc>
-        <w:tc>
-          <w:tcPr/>
-          <w:p>
-            <w:pPr>
-              <w:pStyle w:val="Compact"/>
-            </w:pPr>
-            <w:r>
-              <w:t xml:space="preserve">9%</w:t>
             </w:r>
           </w:p>
         </w:tc>
@@ -2402,6 +2009,39 @@
               <w:pStyle w:val="Compact"/>
             </w:pPr>
             <w:r>
+              <w:t xml:space="preserve">5.6</w:t>
+            </w:r>
+          </w:p>
+        </w:tc>
+        <w:tc>
+          <w:tcPr/>
+          <w:p>
+            <w:pPr>
+              <w:pStyle w:val="Compact"/>
+            </w:pPr>
+            <w:r>
+              <w:t xml:space="preserve">3.2</w:t>
+            </w:r>
+          </w:p>
+        </w:tc>
+        <w:tc>
+          <w:tcPr/>
+          <w:p>
+            <w:pPr>
+              <w:pStyle w:val="Compact"/>
+            </w:pPr>
+            <w:r>
+              <w:t xml:space="preserve">2.1</w:t>
+            </w:r>
+          </w:p>
+        </w:tc>
+        <w:tc>
+          <w:tcPr/>
+          <w:p>
+            <w:pPr>
+              <w:pStyle w:val="Compact"/>
+            </w:pPr>
+            <w:r>
               <w:t xml:space="preserve">9.9</w:t>
             </w:r>
           </w:p>
@@ -2425,28 +2065,6 @@
             </w:pPr>
             <w:r>
               <w:t xml:space="preserve">4.0</w:t>
-            </w:r>
-          </w:p>
-        </w:tc>
-        <w:tc>
-          <w:tcPr/>
-          <w:p>
-            <w:pPr>
-              <w:pStyle w:val="Compact"/>
-            </w:pPr>
-            <w:r>
-              <w:t xml:space="preserve">13.5</w:t>
-            </w:r>
-          </w:p>
-        </w:tc>
-        <w:tc>
-          <w:tcPr/>
-          <w:p>
-            <w:pPr>
-              <w:pStyle w:val="Compact"/>
-            </w:pPr>
-            <w:r>
-              <w:t xml:space="preserve">16%</w:t>
             </w:r>
           </w:p>
         </w:tc>
@@ -2460,6 +2078,43 @@
             </w:pPr>
             <w:r>
               <w:t xml:space="preserve">4</w:t>
+            </w:r>
+          </w:p>
+        </w:tc>
+        <w:tc>
+          <w:tcPr/>
+          <w:p>
+            <w:pPr>
+              <w:pStyle w:val="Compact"/>
+            </w:pPr>
+            <w:r>
+              <w:rPr>
+                <w:b/>
+                <w:bCs/>
+              </w:rPr>
+              <w:t xml:space="preserve">7.8</w:t>
+            </w:r>
+          </w:p>
+        </w:tc>
+        <w:tc>
+          <w:tcPr/>
+          <w:p>
+            <w:pPr>
+              <w:pStyle w:val="Compact"/>
+            </w:pPr>
+            <w:r>
+              <w:t xml:space="preserve">3.6</w:t>
+            </w:r>
+          </w:p>
+        </w:tc>
+        <w:tc>
+          <w:tcPr/>
+          <w:p>
+            <w:pPr>
+              <w:pStyle w:val="Compact"/>
+            </w:pPr>
+            <w:r>
+              <w:t xml:space="preserve">1.9</w:t>
             </w:r>
           </w:p>
         </w:tc>
@@ -2500,32 +2155,6 @@
             </w:r>
           </w:p>
         </w:tc>
-        <w:tc>
-          <w:tcPr/>
-          <w:p>
-            <w:pPr>
-              <w:pStyle w:val="Compact"/>
-            </w:pPr>
-            <w:r>
-              <w:t xml:space="preserve">13.5</w:t>
-            </w:r>
-          </w:p>
-        </w:tc>
-        <w:tc>
-          <w:tcPr/>
-          <w:p>
-            <w:pPr>
-              <w:pStyle w:val="Compact"/>
-            </w:pPr>
-            <w:r>
-              <w:rPr>
-                <w:b/>
-                <w:bCs/>
-              </w:rPr>
-              <w:t xml:space="preserve">21%</w:t>
-            </w:r>
-          </w:p>
-        </w:tc>
       </w:tr>
       <w:tr>
         <w:tc>
@@ -2546,6 +2175,39 @@
               <w:pStyle w:val="Compact"/>
             </w:pPr>
             <w:r>
+              <w:t xml:space="preserve">4.0</w:t>
+            </w:r>
+          </w:p>
+        </w:tc>
+        <w:tc>
+          <w:tcPr/>
+          <w:p>
+            <w:pPr>
+              <w:pStyle w:val="Compact"/>
+            </w:pPr>
+            <w:r>
+              <w:t xml:space="preserve">2.8</w:t>
+            </w:r>
+          </w:p>
+        </w:tc>
+        <w:tc>
+          <w:tcPr/>
+          <w:p>
+            <w:pPr>
+              <w:pStyle w:val="Compact"/>
+            </w:pPr>
+            <w:r>
+              <w:t xml:space="preserve">2.9</w:t>
+            </w:r>
+          </w:p>
+        </w:tc>
+        <w:tc>
+          <w:tcPr/>
+          <w:p>
+            <w:pPr>
+              <w:pStyle w:val="Compact"/>
+            </w:pPr>
+            <w:r>
               <w:t xml:space="preserve">6.5</w:t>
             </w:r>
           </w:p>
@@ -2569,28 +2231,6 @@
             </w:pPr>
             <w:r>
               <w:t xml:space="preserve">3.9</w:t>
-            </w:r>
-          </w:p>
-        </w:tc>
-        <w:tc>
-          <w:tcPr/>
-          <w:p>
-            <w:pPr>
-              <w:pStyle w:val="Compact"/>
-            </w:pPr>
-            <w:r>
-              <w:t xml:space="preserve">13.5</w:t>
-            </w:r>
-          </w:p>
-        </w:tc>
-        <w:tc>
-          <w:tcPr/>
-          <w:p>
-            <w:pPr>
-              <w:pStyle w:val="Compact"/>
-            </w:pPr>
-            <w:r>
-              <w:t xml:space="preserve">9%</w:t>
             </w:r>
           </w:p>
         </w:tc>
@@ -2601,7 +2241,7 @@
         <w:pStyle w:val="BodyText"/>
       </w:pPr>
       <w:r>
-        <w:t xml:space="preserve">Take the negative result first. The lottery averages rank 13.5, the midpoint of 26, and sends 27% of households to their own worst quartile at every size. No rule leaves any size below it: the deployed objective’s worst cell is a four-adult household at rank 11.7 on the yardstick least favourable to it, with a 21% chance of its weakest member landing in that member’s own worst quartile against the lottery’s 27%. Optimisation, including this optimisation, helps every size.</w:t>
+        <w:t xml:space="preserve">Take the negative result first. No rule leaves any size below the lottery: the deployed objective’s worst cell is a four-adult household at rank 11.7 on the yardstick least favourable to it, with a 21% chance of its weakest member landing in that member’s own worst quartile against the lottery’s 27%. Optimisation, including this one, helps every size. What it does not do is help them equally, and the gradient is steep. At-least-one takes a single adult to rank 1.7 and a four-adult household to 7.8 on the first yardstick and 11.7 on the second: the benefit of being optimised for falls by a factor of five, then seven, as a household adds members. The mean rule runs from 2.5 to 3.6 and from 2.5 to 6.4 — graded too, since a large household is harder to place well, but at a fifth of that slope and two fifths respectively. That difference is the score compression of Section 3 in action; single adults gain from the same mechanism, which is why at-least-one places them better than the mean does. In probability units the gap between the best canton available to a four-adult household and the one it receives is 13.2 points under at-least-one against 5.6 under the mean.</w:t>
       </w:r>
     </w:p>
     <w:p>
@@ -2609,7 +2249,7 @@
         <w:pStyle w:val="BodyText"/>
       </w:pPr>
       <w:r>
-        <w:t xml:space="preserve">What it does not do is help them equally, and the gradient is steep. At-least-one takes a single adult to rank 1.7 and a four-adult household to 7.8 on the first yardstick and 11.7 on the second: the benefit of being optimised for falls by a factor of five, then seven, as a household adds members. The mean rule, which weights each person once, runs from 2.5 to 3.6 and from 2.5 to 6.4 — graded too, since a large household is harder to place well, but at a fifth of the slope on the first yardstick and two fifths on the second. That difference is not about how hard large households are to place; it is the score compression of Section 3, a four-adult household with middling probabilities scoring above 0.93 in every canton and so registering almost no preference for the optimiser to act on. Single adults gain from the same mechanism: for them the compressed score and the true score nearly coincide, which is why at-least-one places them better than the mean rule does.</w:t>
+        <w:t xml:space="preserve">The sum rule confirms that no aggregation is neutral: on the per-person yardstick it inverts the pattern, buying four-adult households rank 1.9 and pushing single adults to 4.0, and on the worst-member yardstick it is nearly flat. Each rule implies a different weighting of persons within a case, and the pooled row hides all of it — every rule beats the lottery there, within 1.2 ranks of the others. Only the size-disaggregated rows show the objective choosing who benefits.</w:t>
       </w:r>
     </w:p>
     <w:p>
@@ -2617,7 +2257,26 @@
         <w:pStyle w:val="BodyText"/>
       </w:pPr>
       <w:r>
-        <w:t xml:space="preserve">In probability units rather than ranks, the same gradient reads as regret — the household’s best available canton minus the one it received, an upper bound since not everyone can have their best at once. Under at-least-one, regret rises from 1.6 points for a single adult to 13.2 for a four-adult household on the first yardstick and to 27.0 on the second; under the mean it rises from 3.7 to 5.6 and to 14.8. The deployed rule buys single adults about two points of probability and charges four-adult households eight to twelve for them.</w:t>
+        <w:t xml:space="preserve">One result here does depend on the calibration: in the no-synergy limit four-adult households fall to rank 17.5, below the lottery, because when every household ranks the cantons alike a deprioritised one receives the options nobody wanted. That crossing disappears at three tenths of the calibrated synergy, so it belongs to the degeneracy rather than to the objective; the gradient itself holds throughout.</w:t>
+      </w:r>
+    </w:p>
+    <w:bookmarkEnd w:id="15"/>
+    <w:bookmarkEnd w:id="16"/>
+    <w:bookmarkStart w:id="17" w:name="against-the-programmes-own-benchmark"/>
+    <w:p>
+      <w:pPr>
+        <w:pStyle w:val="Heading2"/>
+      </w:pPr>
+      <w:r>
+        <w:t xml:space="preserve">5. Against the Programme’s Own Benchmark</w:t>
+      </w:r>
+    </w:p>
+    <w:p>
+      <w:pPr>
+        <w:pStyle w:val="FirstParagraph"/>
+      </w:pPr>
+      <w:r>
+        <w:t xml:space="preserve">Sections 3 and 4 measured the objective against its own stated goal rather than the field’s standard criteria, none of which fits: individual fairness (Dwork et al. 2012) is unattainable under hard capacity, since two identical individuals must receive different cantons once the last slot fills; equalised odds (Hardt et al. 2016) presupposes a binary decision; statistical parity would forbid the synergies the tool exists to exploit.</w:t>
       </w:r>
     </w:p>
     <w:p>
@@ -2625,7 +2284,7 @@
         <w:pStyle w:val="BodyText"/>
       </w:pPr>
       <w:r>
-        <w:t xml:space="preserve">The sum rule confirms that no aggregation is neutral, though less tidily than I once put it. On the per-person yardstick it inverts the pattern, buying four-adult households rank 1.9 and pushing single adults to 4.0; on the worst-off yardstick it is close to flat across sizes, from 4.0 to 4.6. Each rule implies a different weighting of persons within a case, and the pooled row hides all of it: every rule beats the lottery on the population average, and at-least-one, mean and sum are within 1.2 ranks of each other there. Only the size-disaggregated rows show the objective choosing who benefits.</w:t>
+        <w:t xml:space="preserve">What does fit is the criterion Freund et al. (2023) formalise as the Random fairness rule: is each group’s average outcome under optimisation at least as good as its expectation under random assignment? Its baseline is not one I have selected: Article 21 of the Asylum Ordinance 1 makes the characteristics-blind proportional key the legal default, and the Swiss pilot is a randomised trial against that key, so the question is the institution’s own.</w:t>
       </w:r>
     </w:p>
     <w:p>
@@ -2633,17 +2292,33 @@
         <w:pStyle w:val="BodyText"/>
       </w:pPr>
       <w:r>
-        <w:t xml:space="preserve">One further result, and a correction. In the no-synergy limit — no idiosyncratic person-by-canton match quality, every household ranking the cantons alike — four-adult households fall to rank 17.5 under at-least-one, below the lottery’s 13.5, with 44% in their own worst quartile. That was the headline of an earlier version of this analysis. It does not survive calibration, for the reason given in Section 4.4: when all households want the same cantons, being deprioritised means receiving the cantons nobody wanted, which is a property of the degeneracy rather than of the objective. The grid in the replication code locates where the crossing goes. At three tenths of the calibrated synergy the four-adult household’s excess over the lottery has already fallen from 4.1 ranks to −0.2 on the first yardstick and to 0.7 on the second; at the calibration it is −5.8 and −1.9, and at twice the calibration −6.7 and −2.3. The gradient reported above is what survives at every point on that grid, which makes this a vertical-equity finding and not an absolute one.</w:t>
-      </w:r>
-    </w:p>
-    <w:bookmarkEnd w:id="15"/>
-    <w:bookmarkStart w:id="16" w:name="a-note-on-the-simulated-data"/>
-    <w:p>
-      <w:pPr>
-        <w:pStyle w:val="Heading3"/>
-      </w:pPr>
-      <w:r>
-        <w:t xml:space="preserve">4.4 A Note on the Simulated Data</w:t>
+        <w:t xml:space="preserve">Section 4 ran that test on the two partitions available to me, and the deployed objective passes both: women do better under at-least-one than under the legal default, and so does every household size. But that is a floor, and a floor is silent about the distribution above it. The size gradient — fivefold between one- and four-adult households, against well under twofold for the mean rule — lies entirely inside the region the criterion licenses, as does the finding that the gain is spent on the member who needed it least. A criterion asking only whether anyone was left worse off than a lottery cannot distinguish an optimiser that shares its gains from one that concentrates them, which is why vertical equity (Black et al. 2022) has to be carried alongside it rather than reduced to it.</w:t>
+      </w:r>
+    </w:p>
+    <w:p>
+      <w:pPr>
+        <w:pStyle w:val="BodyText"/>
+      </w:pPr>
+      <w:r>
+        <w:t xml:space="preserve">Neither objection points to an unavoidable cost of fairness. Switching to the mean answers both — narrowing the within-household gap rather than widening it, and flattening the size gradient to a fifth of its slope — while raising the employment gain from 39% to 47%, so the repair costs nothing. Whether the mean satisfies the criterion on partitions I have not tested is open, but the remaining bill is bounded: in Freund et al.’s study, binding group-fairness requirements cost at most 2% of total employment — in a dynamic setting rather than the static assignment simulated here, so an order of magnitude rather than a transferable bound, but between zero and a few per cent no cost-based defence survives. And the repair belongs where Kleinberg et al. (2018) argue an equity preference belongs, in the decision rule rather than the estimator.</w:t>
+      </w:r>
+    </w:p>
+    <w:p>
+      <w:pPr>
+        <w:pStyle w:val="BodyText"/>
+      </w:pPr>
+      <w:r>
+        <w:t xml:space="preserve">None of this makes the mean correct; distribution-neutrality is a choice too, and the sum is not neutral either, only biased the other way. If the goal is household self-sufficiency, the honest implementation is an explicit threshold on the number of earners; if total employment, the sum, as Annie MOORE uses; if employment per person, the mean; if protecting the least employable member, the minimum. Each is defensible; none is defensible silently. Rawls’s (1958) requirement that an inequality be justifiable to those it disadvantages does not demand that this one be abolished, but that someone state it and argue for it.</w:t>
+      </w:r>
+    </w:p>
+    <w:bookmarkEnd w:id="17"/>
+    <w:bookmarkStart w:id="18" w:name="conclusion"/>
+    <w:p>
+      <w:pPr>
+        <w:pStyle w:val="Heading2"/>
+      </w:pPr>
+      <w:r>
+        <w:t xml:space="preserve">6. Conclusion</w:t>
       </w:r>
     </w:p>
     <w:p>
@@ -2651,165 +2326,7 @@
         <w:pStyle w:val="FirstParagraph"/>
       </w:pPr>
       <w:r>
-        <w:t xml:space="preserve">Three inputs are real — the gender gap, the capacity key, and the published employment gain the person-by-canton term is fitted to — and the rest is stylised: cantonal effects, the interaction, the size mix, and an additive logit in place of location-specific gradient-boosted trees, none of which I can estimate, since no individual-level ZEMIS data is public. The figures are therefore illustrative of the mechanism at plausible parameter values, not estimates of what the SEM pilot did.</w:t>
-      </w:r>
-    </w:p>
-    <w:p>
-      <w:pPr>
-        <w:pStyle w:val="BodyText"/>
-      </w:pPr>
-      <w:r>
-        <w:t xml:space="preserve">One limit deserves recording rather than burying, because an earlier version of this analysis omitted the person-by-canton term altogether and drew a stronger conclusion from its absence. Without it every household ranks the cantons in nearly the same order, so a household the matching stage deprioritises does not merely lose its best option, it receives the options nobody wanted; large households then fell below the lottery, and I read that as a</w:t>
-      </w:r>
-      <w:r>
-        <w:t xml:space="preserve"> </w:t>
-      </w:r>
-      <w:r>
-        <w:rPr>
-          <w:i/>
-          <w:iCs/>
-        </w:rPr>
-        <w:t xml:space="preserve">primum non nocere</w:t>
-      </w:r>
-      <w:r>
-        <w:t xml:space="preserve"> </w:t>
-      </w:r>
-      <w:r>
-        <w:t xml:space="preserve">violation and as a conservative reading besides, on the thought that real synergies would give large households more to lose. The reasoning was wrong in sign. Restoring the term, the residual slots a deprioritised household receives are no longer systematically bad</w:t>
-      </w:r>
-      <w:r>
-        <w:t xml:space="preserve"> </w:t>
-      </w:r>
-      <w:r>
-        <w:rPr>
-          <w:i/>
-          <w:iCs/>
-        </w:rPr>
-        <w:t xml:space="preserve">for it</w:t>
-      </w:r>
-      <w:r>
-        <w:t xml:space="preserve">, and the crossing disappears (Section 4.3). What the omission inflated was the absolute claim; what survives it unchanged is the size gradient and everything in Section 4.2. That is the order of the argument now, and the grid over the term’s magnitude is reported so the reader can see which claim lives where.</w:t>
-      </w:r>
-    </w:p>
-    <w:p>
-      <w:pPr>
-        <w:pStyle w:val="BodyText"/>
-      </w:pPr>
-      <w:r>
-        <w:t xml:space="preserve">Three limits remain, all pushing in knowable directions. The idiosyncratic term is drawn independently across members of a household, whereas real household members share location-specific factors — language region, diaspora, an existing contact — so the true within-household correlation is positive; the check on correlated</w:t>
-      </w:r>
-      <w:r>
-        <w:t xml:space="preserve"> </w:t>
-      </w:r>
-      <w:r>
-        <w:rPr>
-          <w:i/>
-          <w:iCs/>
-        </w:rPr>
-        <w:t xml:space="preserve">individual</w:t>
-      </w:r>
-      <w:r>
-        <w:t xml:space="preserve"> </w:t>
-      </w:r>
-      <w:r>
-        <w:t xml:space="preserve">effects suggests this makes the objection stronger, not weaker, but it is not the same check. Gender is the only characteristic modelled, so the tool’s other predictors, which Alajak et al. (2026) put at the centre, do not appear. And the lottery baseline is the statutory key alone, while the real status quo also honours constraints the simulation ignores, so it flatters neither the algorithm nor the comparison in any direction I can sign. None of this bears on Section 3, which is a property of the formula established without simulated data at all.</w:t>
-      </w:r>
-    </w:p>
-    <w:bookmarkEnd w:id="16"/>
-    <w:bookmarkEnd w:id="17"/>
-    <w:bookmarkStart w:id="18" w:name="against-the-programmes-own-benchmark"/>
-    <w:p>
-      <w:pPr>
-        <w:pStyle w:val="Heading2"/>
-      </w:pPr>
-      <w:r>
-        <w:t xml:space="preserve">5. Against the Programme’s Own Benchmark</w:t>
-      </w:r>
-    </w:p>
-    <w:p>
-      <w:pPr>
-        <w:pStyle w:val="FirstParagraph"/>
-      </w:pPr>
-      <w:r>
-        <w:t xml:space="preserve">Sections 3 and 4 measured the objective against its own stated goal and against the status quo rather than the field’s standard criteria, none of which fits: individual fairness (Dwork et al. 2012) is unattainable for any deterministic assignment under hard capacity, since two identical individuals must receive different cantons once the last slot fills; equalised odds (Hardt et al. 2016) presupposes a binary decision; and statistical parity would forbid exactly the synergies the tool exists to exploit.</w:t>
-      </w:r>
-    </w:p>
-    <w:p>
-      <w:pPr>
-        <w:pStyle w:val="BodyText"/>
-      </w:pPr>
-      <w:r>
-        <w:t xml:space="preserve">What does fit is the criterion Freund et al. (2023) formalise as the Random fairness rule: is each group’s average outcome under optimisation at least as good as its expectation under random assignment? It needs no contested similarity metric, and its baseline is not one I have selected: Article 21 of the Asylum Ordinance 1 makes the characteristics-blind proportional key the legal default, and the Swiss pilot is a randomised trial evaluating the algorithm against that key.</w:t>
-      </w:r>
-      <w:r>
-        <w:t xml:space="preserve"> </w:t>
-      </w:r>
-      <w:r>
-        <w:t xml:space="preserve">“Is any group left worse off than the legal default?”</w:t>
-      </w:r>
-      <w:r>
-        <w:t xml:space="preserve"> </w:t>
-      </w:r>
-      <w:r>
-        <w:t xml:space="preserve">is the question the institution poses through its own study design, not an external standard imported to embarrass it.</w:t>
-      </w:r>
-    </w:p>
-    <w:p>
-      <w:pPr>
-        <w:pStyle w:val="BodyText"/>
-      </w:pPr>
-      <w:r>
-        <w:t xml:space="preserve">Section 4 ran that test on the two partitions available to me, and the deployed objective passes both. Women do better under at-least-one than under the legal default, and so does every household size: at the calibrated specification even four-adult households receive cantons they themselves rank well above the lottery’s midpoint. The violation appears only in the degenerate limit in which no household has idiosyncratic reasons to prefer one canton to another, and that limit also implies a gain for the deployed rule of 1.4% against the 41% it is documented to deliver, so it is not a description of the problem GeoMatch solves. The conclusion has to be stated the other way round from the one I expected: on the institution’s own benchmark the objective does no group in my two partitions an absolute harm.</w:t>
-      </w:r>
-    </w:p>
-    <w:p>
-      <w:pPr>
-        <w:pStyle w:val="BodyText"/>
-      </w:pPr>
-      <w:r>
-        <w:t xml:space="preserve">That is a real limit on how much the Random fairness rule can be asked to do. It is a floor, and a floor is silent about the distribution of whatever lies above it. Section 4’s size gradient — a fivefold difference in received rank between one- and four-adult households, where the mean rule’s is well under twofold — is entirely inside the region the criterion licenses, and so is the finding that the gain is spent on the member who needed it least. A criterion that asks only whether anyone was left worse off than under a lottery cannot distinguish an optimiser that shares its gains from one that concentrates them, which is why vertical equity (Black et al. 2022) has to be carried alongside it rather than reduced to it.</w:t>
-      </w:r>
-    </w:p>
-    <w:p>
-      <w:pPr>
-        <w:pStyle w:val="BodyText"/>
-      </w:pPr>
-      <w:r>
-        <w:t xml:space="preserve">Neither objection points to an unavoidable cost of fairness. Switching to the mean answers both — narrowing the within-household gap rather than widening it, and flattening the size gradient to a fifth of its slope — while raising the employment gain from 39% to 47%, so the repair costs nothing. That is not a demonstration that the mean satisfies the criterion in general: I have tested two group partitions, not all of them. The remaining bill is bounded, which is what makes Freund et al.’s figure useful: in their study, binding group-fairness requirements cost at most 2% of total employment relative to the unconstrained algorithm, on U.S. and Dutch data with groups defined by origin, age or education. That is a dynamic setting rather than the static assignment simulated here, so it indicates an order of magnitude rather than transferring as a bound. Zero for what is documented here, a few per cent for group fairness in general: between those numbers no cost-based defence survives. And the repair belongs where Kleinberg et al. (2018) argue an equity preference belongs, in the decision rule rather than the estimator — GeoMatch’s mapping stage.</w:t>
-      </w:r>
-    </w:p>
-    <w:p>
-      <w:pPr>
-        <w:pStyle w:val="BodyText"/>
-      </w:pPr>
-      <w:r>
-        <w:t xml:space="preserve">None of this makes the mean correct — distribution-neutrality is a choice too, and Section 4 shows the sum is not neutral either, only biased the other way where each person counts once, and roughly size-neutral where the weakest member counts. If the goal is household self-sufficiency, the honest implementation is an explicit threshold on the number of earners; if total employment, the sum, as Annie MOORE uses; if employment per person, the mean; if protecting the least employable member, the minimum, at the cost Bansak et al.’s backtest already reports. Each is defensible; none is defensible silently. Rawls’s (1958) requirement that an inequality be justifiable to those it disadvantages does not demand that this one be abolished, but it does demand that someone state it and argue for it.</w:t>
-      </w:r>
-    </w:p>
-    <w:bookmarkEnd w:id="18"/>
-    <w:bookmarkStart w:id="19" w:name="conclusion"/>
-    <w:p>
-      <w:pPr>
-        <w:pStyle w:val="Heading2"/>
-      </w:pPr>
-      <w:r>
-        <w:t xml:space="preserve">6. Conclusion</w:t>
-      </w:r>
-    </w:p>
-    <w:p>
-      <w:pPr>
-        <w:pStyle w:val="FirstParagraph"/>
-      </w:pPr>
-      <w:r>
-        <w:t xml:space="preserve">GeoMatch is a genuine advance over a lottery, and the case for algorithmic assignment here is strong: at the specification calibrated to its own published gain, every group I can define does better under it than under the legal default. The argument of this paper is narrower and survives that concession intact. The deployed objective is not the one the tool is defended in terms of; it is dominated on the very metric it claims to maximise; it is biased against equality within households in a formally demonstrable way; and it distributes the gain from optimisation in inverse proportion to household size, for reasons internal to its algebra rather than to anyone’s need. Its designers justify it by household self-sufficiency, a fiscal objective of the host state, and neither they nor their critics have treated that substitution as needing an argument.</w:t>
-      </w:r>
-    </w:p>
-    <w:p>
-      <w:pPr>
-        <w:pStyle w:val="BodyText"/>
-      </w:pPr>
-      <w:r>
-        <w:t xml:space="preserve">The practical implication is small and specific: report the mapping function, justify it, and publish the distributional consequences of the alternatives, which the designers have already computed. Bennett and Keyes (2020) argue that fairness metrics can crowd out the prior question of what a system is for; here that question was not crowded out by metrics but disappeared into an implementation detail nobody read as normative. Bansak et al. did check the aggregate cost of their default and disclosed it candidly, in supplementary materials never foregrounded in the tool’s public defence, and the mapping functions of both deployed tools have since been tabulated side by side (Strasser Ceballos and Kern 2025) without anyone asking why they differ. What nobody checked is who absorbs that cost inside the household, and how it falls across sizes. The most consequential normative decision in a system that has shaped the lives of asylum seekers across three countries since 2020 sits in a four-line helper function: disclosed, but never argued for.</w:t>
+        <w:t xml:space="preserve">GeoMatch is a genuine advance over a lottery: every group I can define does better under it than under the legal default. The argument of this paper is narrower and survives that concession. The deployed objective is dominated on the very metric it claims to maximise; it is biased against equality within households in a formally demonstrable way; and it distributes the gain from optimisation in inverse proportion to household size, for reasons internal to its algebra rather than to anyone’s need. The practical implication is small and specific: report the mapping function, justify it, and publish the distributional consequences of the alternatives, which the designers have already computed. Bennett and Keyes (2020) argue that fairness metrics can crowd out the prior question of what a system is for; here that question was not crowded out by metrics but disappeared into an implementation detail nobody read as normative. Its designers did check the aggregate cost of their default and disclose it candidly; what nobody checked is who absorbs that cost inside the household, and how it falls across sizes. The most consequential normative decision in a system that has shaped the lives of asylum seekers across three countries since 2020 sits in a four-line helper function: disclosed, but never argued for.</w:t>
       </w:r>
     </w:p>
     <w:p>
@@ -2819,8 +2336,8 @@
         </w:pict>
       </w:r>
     </w:p>
-    <w:bookmarkEnd w:id="19"/>
-    <w:bookmarkStart w:id="20" w:name="references"/>
+    <w:bookmarkEnd w:id="18"/>
+    <w:bookmarkStart w:id="19" w:name="references"/>
     <w:p>
       <w:pPr>
         <w:pStyle w:val="Heading2"/>
@@ -3204,8 +2721,8 @@
         <w:t xml:space="preserve">.</w:t>
       </w:r>
     </w:p>
+    <w:bookmarkEnd w:id="19"/>
     <w:bookmarkEnd w:id="20"/>
-    <w:bookmarkEnd w:id="21"/>
     <w:sectPr>
       <w:footnotePr>
         <w:numRestart w:val="eachSect"/>

</xml_diff>